<commit_message>
Expand ICLR 2027 reviews with detailed technical notes
Co-authored-by: Han Wang <202300300096@mail.sdu.edu.cn>
</commit_message>
<xml_diff>
--- a/reviews/ICLR2027_42504_50972_reviews.docx
+++ b/reviews/ICLR2027_42504_50972_reviews.docx
@@ -4,30 +4,40 @@
   <w:body>
     <w:p>
       <w:pPr>
-        <w:pStyle w:val="Heading1"/>
+        <w:pStyle w:val="Title"/>
       </w:pPr>
       <w:r>
-        <w:t>ICLR 2027 OpenReview-Style Reviews (Bilingual)</w:t>
+        <w:t>ICLR 2027 Review Notes — Submissions 42504 &amp; 50972 (Extended + OpenReview Paste-In)</w:t>
       </w:r>
     </w:p>
     <w:p>
       <w:r>
-        <w:t xml:space="preserve">Use each block below for copy-paste into OpenReview. Scores use the </w:t>
-      </w:r>
-      <w:r>
-        <w:rPr>
-          <w:b/>
-        </w:rPr>
-        <w:t>1–3</w:t>
-      </w:r>
-      <w:r>
-        <w:t xml:space="preserve"> scale (Presentation / Informativeness / Soundness).</w:t>
+        <w:t>This document has two layers for each paper:</w:t>
       </w:r>
     </w:p>
-    <w:p/>
+    <w:p>
+      <w:r>
+        <w:t>1. **Extended review** — background, method walkthrough, theorem intuition, empirical read, and positioning (for your own reading and discussion).</w:t>
+      </w:r>
+    </w:p>
+    <w:p>
+      <w:r>
+        <w:t>2. **OpenReview blocks** — shorter fields marked for copy-paste into OpenReview (Summary, Strengths, Weaknesses, Questions, 1–3 scores).</w:t>
+      </w:r>
+    </w:p>
+    <w:p>
+      <w:r>
+        <w:t>Scores use the **1–3** scale (Presentation / Informativeness / Soundness).</w:t>
+      </w:r>
+    </w:p>
+    <w:p>
+      <w:r>
+        <w:t>————————————————————</w:t>
+      </w:r>
+    </w:p>
     <w:p>
       <w:pPr>
-        <w:pStyle w:val="Heading1"/>
+        <w:pStyle w:val="Title"/>
       </w:pPr>
       <w:r>
         <w:t>Submission 42504 — *An Analysis of Mirror-Descent Soft Actor-Critic*</w:t>
@@ -35,15 +45,401 @@
     </w:p>
     <w:p>
       <w:pPr>
-        <w:pStyle w:val="Heading2"/>
+        <w:pStyle w:val="Heading1"/>
       </w:pPr>
       <w:r>
-        <w:t>English</w:t>
+        <w:t>Extended review (English)</w:t>
       </w:r>
     </w:p>
     <w:p>
       <w:pPr>
-        <w:pStyle w:val="Heading3"/>
+        <w:pStyle w:val="Heading2"/>
+      </w:pPr>
+      <w:r>
+        <w:t>1. What problem is this paper trying to solve?</w:t>
+      </w:r>
+    </w:p>
+    <w:p>
+      <w:r>
+        <w:t>Soft Actor-Critic (SAC) is the de facto off-policy algorithm for continuous control with entropy regularization. In code, each outer loop typically:</w:t>
+      </w:r>
+    </w:p>
+    <w:p>
+      <w:pPr>
+        <w:pStyle w:val="ListBullet"/>
+      </w:pPr>
+      <w:r>
+        <w:t>updates critics with soft Bellman / TD targets;</w:t>
+      </w:r>
+    </w:p>
+    <w:p>
+      <w:pPr>
+        <w:pStyle w:val="ListBullet"/>
+      </w:pPr>
+      <w:r>
+        <w:t>defines a **target policy** from the current Q-estimate (softmax / Gibbs form);</w:t>
+      </w:r>
+    </w:p>
+    <w:p>
+      <w:pPr>
+        <w:pStyle w:val="ListBullet"/>
+      </w:pPr>
+      <w:r>
+        <w:t>performs **one or a few** gradient steps on the actor to minimize reverse KL to that target—not a full convex projection.</w:t>
+      </w:r>
+    </w:p>
+    <w:p>
+      <w:r>
+        <w:t>Theory, by contrast, often assumes either (i) updates in **full policy space** with known critic (policy mirror descent, exponential convergence lines of work), or (ii) **direct policy gradient** with regularity that squashed Gaussians violate near action boundaries. This paper asks: *If we formalize SAC at the population level with a squashed Gaussian actor and a critic oracle, what finite-time guarantees can we prove when the target is either the classical Gibbs policy or a policy-mirror-descent (MD) target—and how do those targets differ for **tracking**?*</w:t>
+      </w:r>
+    </w:p>
+    <w:p>
+      <w:r>
+        <w:t>The contribution is **not** a new deep RL algorithm. It is a **mathematical model** of SAC-like training plus **comparative bounds** on target drift and actor tracking, culminating in a **best-iterate** \(O(N^{-1/5})\) rate (up to approximation error) when \(\lambda\) is tuned with \(N\).</w:t>
+      </w:r>
+    </w:p>
+    <w:p>
+      <w:pPr>
+        <w:pStyle w:val="Heading2"/>
+      </w:pPr>
+      <w:r>
+        <w:t>2. Setting and notation (compressed but precise)</w:t>
+      </w:r>
+    </w:p>
+    <w:p>
+      <w:pPr>
+        <w:pStyle w:val="ListBullet"/>
+      </w:pPr>
+      <w:r>
+        <w:t>**MDP:** infinite horizon, cost \(c\), discount \(\gamma\), actions \(A = (-1,1)^M\), entropy temperature \(\tau &gt; 0\).</w:t>
+      </w:r>
+    </w:p>
+    <w:p>
+      <w:pPr>
+        <w:pStyle w:val="ListBullet"/>
+      </w:pPr>
+      <w:r>
+        <w:t>**Regularized value** \(V_\tau^\pi(s)\): expected discounted cost minus \(\tau\) times per-state entropy of \(\pi(\cdot|s)\).</w:t>
+      </w:r>
+    </w:p>
+    <w:p>
+      <w:pPr>
+        <w:pStyle w:val="ListBullet"/>
+      </w:pPr>
+      <w:r>
+        <w:t>**Actor:** fixed diagonal covariance Gaussian in pre-tanh space, **linear mean** \(m_w(s) = x(s)^\top w\) (feature map \(x\)), then tanh push-forward to bounded actions. This matches the “Gaussian + squash” SAC parameterization at population level.</w:t>
+      </w:r>
+    </w:p>
+    <w:p>
+      <w:pPr>
+        <w:pStyle w:val="ListBullet"/>
+      </w:pPr>
+      <w:r>
+        <w:t>**Critic oracle:** at iteration \(n\), the learner receives \(\hat Q_n\) with uniform error \(\|\hat Q_n - Q_\tau^{\pi_{w_n}}\|_\infty \le \varepsilon_{\mathrm{crit}}\) (population, not mini-batch TD).</w:t>
+      </w:r>
+    </w:p>
+    <w:p>
+      <w:pPr>
+        <w:pStyle w:val="ListBullet"/>
+      </w:pPr>
+      <w:r>
+        <w:t>**Replay / occupancy:** state distribution \(\rho_n\) evolves (Definition 5 in paper); **concentrability** (Assumption 1) bounds mismatch between successive occupancies—standard in batch/off-policy theory.</w:t>
+      </w:r>
+    </w:p>
+    <w:p>
+      <w:pPr>
+        <w:pStyle w:val="ListBullet"/>
+      </w:pPr>
+      <w:r>
+        <w:t>**Actor step:** one projected gradient step with step size \(h\) on reverse KL objective \(J_n(w, \pi_n^{\mathrm{target}})\) toward the current target, with projection to ball \(B(R)\).</w:t>
+      </w:r>
+    </w:p>
+    <w:p>
+      <w:pPr>
+        <w:pStyle w:val="Heading2"/>
+      </w:pPr>
+      <w:r>
+        <w:t>3. The two targets (this is the conceptual core)</w:t>
+      </w:r>
+    </w:p>
+    <w:p>
+      <w:r>
+        <w:t xml:space="preserve">**Gibbs target (Eq. 4, “classical SAC soft policy”):**  </w:t>
+      </w:r>
+    </w:p>
+    <w:p>
+      <w:r>
+        <w:t>\(\pi_{n+1}^G(\cdot|s) \propto \exp(-\hat Q_n(s,\cdot)/\tau)\) (with appropriate base measure on \(A\)). This is the closed-form solution of the **one-step** entropy-regularized improvement problem when the critic is exact. In continuous actions the normalization constant is intractable in general, but the **gradient** of the actor objective still avoids needing \(Z_n(s)\) when defined carefully (paper’s SAC motivation).</w:t>
+      </w:r>
+    </w:p>
+    <w:p>
+      <w:r>
+        <w:t xml:space="preserve">**Mirror-descent target (Eq. 5):**  </w:t>
+      </w:r>
+    </w:p>
+    <w:p>
+      <w:r>
+        <w:t>A **proximal** update: \(\pi_{n+1}\) is the minimizer of a KL-regularized linear functional of \(\hat Q_n\) **anchored at the previous target** \(\pi_n\) (not at the current actor \(\pi_{w_n}\)). Step size / penalty \(\lambda\) controls how far the target moves per outer iteration. Intuitively:</w:t>
+      </w:r>
+    </w:p>
+    <w:p>
+      <w:pPr>
+        <w:pStyle w:val="ListBullet"/>
+      </w:pPr>
+      <w:r>
+        <w:t>Gibbs: each target is “fresh softmax of \(-\hat Q/\tau\)” — can jump when \(\hat Q\) or \(\rho_n\) changes.</w:t>
+      </w:r>
+    </w:p>
+    <w:p>
+      <w:pPr>
+        <w:pStyle w:val="ListBullet"/>
+      </w:pPr>
+      <w:r>
+        <w:t>MD: target chain \(\{\pi_n\}\) is **inertial**; large \(\lambda\) → aggressive improvement; small \(\lambda\) → slowly moving target.</w:t>
+      </w:r>
+    </w:p>
+    <w:p>
+      <w:r>
+        <w:t>**Why targets “change” at all:** the critic \(\hat Q_n\) changes as \(w_n\) and \(\rho_n\) change; the paper separates **target drift** (how fast \(\pi_n^{\mathrm{target}}\) moves) from **actor tracking error** (how well one KL gradient step follows that target).</w:t>
+      </w:r>
+    </w:p>
+    <w:p>
+      <w:pPr>
+        <w:pStyle w:val="Heading2"/>
+      </w:pPr>
+      <w:r>
+        <w:t>4. Curvature condition (Theorem 2) — what it means</w:t>
+      </w:r>
+    </w:p>
+    <w:p>
+      <w:r>
+        <w:t>The reverse-KL actor objective is generally **non-convex** in \(w\) because of tanh and because \(\hat Q\) enters through the target log-density. The paper introduces a **Legendre-type operator** \(T\) applied to \(\hat Q(s,\cdot)\) in action space and a scalar **curvature** \(R_{\hat Q}\) (sup of operator norms across states).</w:t>
+      </w:r>
+    </w:p>
+    <w:p>
+      <w:r>
+        <w:t>**Key condition:** \(R_{\hat Q}/2 &lt; \tau\).</w:t>
+      </w:r>
+    </w:p>
+    <w:p>
+      <w:r>
+        <w:t>When this holds on a ball of radius \(R\), the actor objective \(w \mapsto J_n(w, \pi_{n+1})\) is **strongly convex and smooth** with explicit constants \(\kappa\) and \(L\). Then a **single** gradient step analysis is tractable (like convex tracking).</w:t>
+      </w:r>
+    </w:p>
+    <w:p>
+      <w:r>
+        <w:t>**Interpretation:** entropy \(\tau\) must dominate “how bent” the critic looks along the squashed action map. Violating this matches Appendix/Figure 1 **orange** curves: training can fail or stall even with equal \(\varepsilon_{\mathrm{crit}}\).</w:t>
+      </w:r>
+    </w:p>
+    <w:p>
+      <w:r>
+        <w:t>**Gap for practitioners:** only **Fourier-linear critic** examples give checkable bounds on \(R_{\hat Q}\); for deep nets there is no recipe to verify or monitor this during training.</w:t>
+      </w:r>
+    </w:p>
+    <w:p>
+      <w:pPr>
+        <w:pStyle w:val="Heading2"/>
+      </w:pPr>
+      <w:r>
+        <w:t>5. Main results (prose)</w:t>
+      </w:r>
+    </w:p>
+    <w:p>
+      <w:r>
+        <w:t>| Result | Role |</w:t>
+      </w:r>
+    </w:p>
+    <w:p>
+      <w:r>
+        <w:t>|--------|------|</w:t>
+      </w:r>
+    </w:p>
+    <w:p>
+      <w:r>
+        <w:t>| **Theorem 1 (MD tracking)** | Bounds time-averaged actor suboptimality for MD target; drift enters through \(O(\lambda)\) target movement (Lemma 9) and \(1/\lambda\) terms from MD progress (trade-off). |</w:t>
+      </w:r>
+    </w:p>
+    <w:p>
+      <w:r>
+        <w:t>| **Corollary 1 (Gibbs tracking)** | Same tracking functional for Gibbs target; bound includes **non-vanishing \(1/\tau\)** piece even when replay changes slowly—actor cannot track arbitrarily closely purely by slowing data shift. |</w:t>
+      </w:r>
+    </w:p>
+    <w:p>
+      <w:r>
+        <w:t>| **Theorem 3 (best-iterate value gap)** | With \(\lambda = \Theta(N^{-4/5})\), \(h\) small enough, best iterate over \(N\) actor updates achieves \(V_\tau^{\pi_{w_r}}(\rho) - V_\tau^{\pi^*}(\rho) \le O(N^{-1/5} + \varepsilon_{\mathrm{approx}}(N))\). |</w:t>
+      </w:r>
+    </w:p>
+    <w:p>
+      <w:r>
+        <w:t>**Rate \(N^{-1/5}\):** slower than “nice” convex \(O(1/N)\) or exponential MD in tabular exact-critic settings; reflects **partial** actor steps + evolving target + approximation errors bundled into \(\varepsilon_{\mathrm{approx}}\).</w:t>
+      </w:r>
+    </w:p>
+    <w:p>
+      <w:r>
+        <w:t>**Figure 2 (Appendix K):** with **exact** critics on a toy MDP, average tracking error vs \(\lambda\): MD target (solid) vs Gibbs (dashed) at matched actor budgets \(n\). Gibbs error plateaus; MD error can shrink as \(\lambda \downarrow\) (at cost of slower MD policy improvement via \(1/\lambda\) in Theorem 1).</w:t>
+      </w:r>
+    </w:p>
+    <w:p>
+      <w:pPr>
+        <w:pStyle w:val="Heading2"/>
+      </w:pPr>
+      <w:r>
+        <w:t>6. Related work (how I place this paper)</w:t>
+      </w:r>
+    </w:p>
+    <w:p>
+      <w:pPr>
+        <w:pStyle w:val="ListBullet"/>
+      </w:pPr>
+      <w:r>
+        <w:t>**Policy MD / entropy RL (Lan; Ju &amp; Lan; Kerimkulov et al.):** exact or high-accuracy critic, updates in policy space—fast rates but not squashed Gaussian + partial steps.</w:t>
+      </w:r>
+    </w:p>
+    <w:p>
+      <w:pPr>
+        <w:pStyle w:val="ListBullet"/>
+      </w:pPr>
+      <w:r>
+        <w:t>**Parametric SAC analysis (Sherman, Alfano, Yuan, Agarwal lines):** closer to implementation but different objective/target choices; this paper explicitly compares **Gibbs vs MD target** under one actor formalism.</w:t>
+      </w:r>
+    </w:p>
+    <w:p>
+      <w:pPr>
+        <w:pStyle w:val="ListBullet"/>
+      </w:pPr>
+      <w:r>
+        <w:t>**Actor–critic with critic error (Labbi, Zorba et al.):** complementary; this work **fixes** critic error to \(\varepsilon_{\mathrm{crit}}\) and studies actor/target coupling.</w:t>
+      </w:r>
+    </w:p>
+    <w:p>
+      <w:r>
+        <w:t>**Novelty assessment:** incremental but real for **SAC theory**—first population guarantees for squashed Gaussian + one reverse-KL step + explicit **target-type comparison**. Less novel as a general RL algorithm paper.</w:t>
+      </w:r>
+    </w:p>
+    <w:p>
+      <w:pPr>
+        <w:pStyle w:val="Heading2"/>
+      </w:pPr>
+      <w:r>
+        <w:t>7. Experiments (what they actually show)</w:t>
+      </w:r>
+    </w:p>
+    <w:p>
+      <w:r>
+        <w:t>Appendix K only: tabular state, quadratic cost, affine transitions, **exact linear critic solve** + controlled perturbations to vary \(R_{\hat Q}\) at fixed \(\varepsilon_{\mathrm{crit}}\). Figure 1: value vs iterations when curvature condition satisfied (green) vs violated (orange). **No MuJoCo/DMC**, no neural nets, no validation of \(N^{-1/5}\) scaling in log-log plots.</w:t>
+      </w:r>
+    </w:p>
+    <w:p>
+      <w:pPr>
+        <w:pStyle w:val="Heading2"/>
+      </w:pPr>
+      <w:r>
+        <w:t>8. Extended strengths</w:t>
+      </w:r>
+    </w:p>
+    <w:p>
+      <w:r>
+        <w:t>1. **Implementation-aligned actor:** fixed-covariance squashed Gaussian + single projected reverse-KL step is exactly the fragile part of SAC omitted from policy-space MD proofs.</w:t>
+      </w:r>
+    </w:p>
+    <w:p>
+      <w:r>
+        <w:t>2. **Explicit Gibbs vs MD tracking dichotomy (Corollary 1):** the persistent \(1/\tau\) term is a derived contrast, not folklore; Figure 2 supports the mechanism on toy data.</w:t>
+      </w:r>
+    </w:p>
+    <w:p>
+      <w:r>
+        <w:t>3. **Curvature narrative links failure modes to \(\hat Q\) geometry** via Legendre operator—conceptually useful even if hard to test in deep RL.</w:t>
+      </w:r>
+    </w:p>
+    <w:p>
+      <w:r>
+        <w:t>4. **Clear \(\lambda\)–\(N\) trade-off** in Theorem 3 (\(\lambda \sim N^{-4/5}\)) for best-iterate value bound—rare explicit tuning exponent in SAC-like analyses.</w:t>
+      </w:r>
+    </w:p>
+    <w:p>
+      <w:r>
+        <w:t>5. **Writing quality:** assumptions numbered, algorithm box, proof roadmap in appendix—easy for theory readers to navigate 36 pages.</w:t>
+      </w:r>
+    </w:p>
+    <w:p>
+      <w:pPr>
+        <w:pStyle w:val="Heading2"/>
+      </w:pPr>
+      <w:r>
+        <w:t>9. Extended weaknesses</w:t>
+      </w:r>
+    </w:p>
+    <w:p>
+      <w:r>
+        <w:t>1. **Population critic oracle** hides TD bootstrapping, target networks, double Q, and non-stationary replay—main theorems are conditional on \(\varepsilon_{\mathrm{crit}}\), not on sample complexity.</w:t>
+      </w:r>
+    </w:p>
+    <w:p>
+      <w:r>
+        <w:t>2. **Single actor gradient step** vs standard SAC (often multiple actor updates per env step); no theorem for “\(K\) inner steps.”</w:t>
+      </w:r>
+    </w:p>
+    <w:p>
+      <w:r>
+        <w:t>3. **\(R_{\hat Q}/2 &lt; \tau\)** is strong and **unverifiable** for deep critics; experiments only show binary satisfy/violate on toy Fourier critics.</w:t>
+      </w:r>
+    </w:p>
+    <w:p>
+      <w:r>
+        <w:t>4. **MD target chain \(\pi_n\)** may not match every SAC codebase (some implementations implicitly define target from current actor or use separate slow-moving target networks on Q, not on policy MD chain).</w:t>
+      </w:r>
+    </w:p>
+    <w:p>
+      <w:r>
+        <w:t>5. **Part of MD advantage is definitional:** small \(\lambda\) ⇒ small KL proximal step ⇒ \(O(\lambda)\) drift—paper acknowledges via \(1/\lambda\) in Theorem 1 but could foreground how much is **design of Eq. (5)** vs inherent to entropy RL.</w:t>
+      </w:r>
+    </w:p>
+    <w:p>
+      <w:r>
+        <w:t>6. **Limited ICLR audience payoff:** no actionable hyperparameter rule beyond qualitative “small \(\lambda\) helps tracking”; \(N^{-1/5}\) is not sharp enough to guide wall-clock training.</w:t>
+      </w:r>
+    </w:p>
+    <w:p>
+      <w:pPr>
+        <w:pStyle w:val="Heading2"/>
+      </w:pPr>
+      <w:r>
+        <w:t>10. Recommendation rationale</w:t>
+      </w:r>
+    </w:p>
+    <w:p>
+      <w:pPr>
+        <w:pStyle w:val="ListBullet"/>
+      </w:pPr>
+      <w:r>
+        <w:t>**For RL theory subcommunity:** weak accept — fills a documented gap between SAC practice and MD theory.</w:t>
+      </w:r>
+    </w:p>
+    <w:p>
+      <w:pPr>
+        <w:pStyle w:val="ListBullet"/>
+      </w:pPr>
+      <w:r>
+        <w:t>**For general ICLR (empirical + systems):** borderline — no deep RL evidence, limited engineering takeaway.</w:t>
+      </w:r>
+    </w:p>
+    <w:p>
+      <w:r>
+        <w:t>————————————————————</w:t>
+      </w:r>
+    </w:p>
+    <w:p>
+      <w:pPr>
+        <w:pStyle w:val="Heading1"/>
+      </w:pPr>
+      <w:r>
+        <w:t>OpenReview paste-in — 42504 (English)</w:t>
+      </w:r>
+    </w:p>
+    <w:p>
+      <w:pPr>
+        <w:pStyle w:val="Heading2"/>
       </w:pPr>
       <w:r>
         <w:t>AI Documentation For Reviewing (optional; not shown to authors)</w:t>
@@ -51,21 +447,12 @@
     </w:p>
     <w:p>
       <w:r>
-        <w:t xml:space="preserve">I read the full submission PDF. I drafted this review in English and produced the Chinese section with LLM assistance for paste-in. My own assessment before polishing: </w:t>
-      </w:r>
-      <w:r>
-        <w:rPr>
-          <w:b/>
-        </w:rPr>
-        <w:t>weak accept</w:t>
-      </w:r>
-      <w:r>
-        <w:t xml:space="preserve"> for readers in RL theory; limited practical takeaway for the broader ICLR audience.</w:t>
+        <w:t>I read the full 36-page PDF. Extended notes above are for my own use; fields below are what I intend to paste. English is mine; Chinese section below uses LLM polish for paste-in. Pre-polish lean: **weak accept (theory) / borderline (broad ICLR)**.</w:t>
       </w:r>
     </w:p>
     <w:p>
       <w:pPr>
-        <w:pStyle w:val="Heading3"/>
+        <w:pStyle w:val="Heading2"/>
       </w:pPr>
       <w:r>
         <w:t>Paper Summary *</w:t>
@@ -73,138 +460,12 @@
     </w:p>
     <w:p>
       <w:r>
-        <w:t xml:space="preserve">This paper analyzes a </w:t>
-      </w:r>
-      <w:r>
-        <w:rPr>
-          <w:b/>
-        </w:rPr>
-        <w:t>population-level</w:t>
-      </w:r>
-      <w:r>
-        <w:t xml:space="preserve"> formalization of Soft Actor-Critic (SAC): a </w:t>
-      </w:r>
-      <w:r>
-        <w:rPr>
-          <w:b/>
-        </w:rPr>
-        <w:t>fixed-covariance squashed Gaussian</w:t>
-      </w:r>
-      <w:r>
-        <w:t xml:space="preserve"> actor (linear mean, tanh push-forward) with </w:t>
-      </w:r>
-      <w:r>
-        <w:rPr>
-          <w:b/>
-        </w:rPr>
-        <w:t>one projected reverse-KL gradient step</w:t>
-      </w:r>
-      <w:r>
-        <w:t xml:space="preserve"> per outer iteration, and a </w:t>
-      </w:r>
-      <w:r>
-        <w:rPr>
-          <w:b/>
-        </w:rPr>
-        <w:t>critic oracle</w:t>
-      </w:r>
-      <w:r>
-        <w:t xml:space="preserve"> \(\hat Q_n\) with uniform error \(\varepsilon_{\mathrm{crit}}\). The </w:t>
-      </w:r>
-      <w:r>
-        <w:rPr>
-          <w:b/>
-        </w:rPr>
-        <w:t>target policy</w:t>
-      </w:r>
-      <w:r>
-        <w:t xml:space="preserve"> is either the classical </w:t>
-      </w:r>
-      <w:r>
-        <w:rPr>
-          <w:b/>
-        </w:rPr>
-        <w:t>Gibbs</w:t>
-      </w:r>
-      <w:r>
-        <w:t xml:space="preserve"> (softmax of \(-\hat Q_n/\tau\), Eq. (4)) or a </w:t>
-      </w:r>
-      <w:r>
-        <w:rPr>
-          <w:b/>
-        </w:rPr>
-        <w:t>policy mirror descent</w:t>
-      </w:r>
-      <w:r>
-        <w:t xml:space="preserve"> target (Eq. (5)) with proximal step \(\lambda\), where the MD chain \(\{\pi_n\}\) is updated from the </w:t>
-      </w:r>
-      <w:r>
-        <w:rPr>
-          <w:b/>
-        </w:rPr>
-        <w:t>previous target</w:t>
-      </w:r>
-      <w:r>
-        <w:t xml:space="preserve"> (not from the current actor \(\pi_{w_n}\)). Under optimal-occupancy concentrability and a </w:t>
-      </w:r>
-      <w:r>
-        <w:rPr>
-          <w:b/>
-        </w:rPr>
-        <w:t>Legendre-operator curvature</w:t>
-      </w:r>
-      <w:r>
-        <w:t xml:space="preserve"> condition \(R_{\hat Q}/2 &lt; \tau\), the authors prove strong convexity/smoothness of the actor KL objective, bound </w:t>
-      </w:r>
-      <w:r>
-        <w:rPr>
-          <w:b/>
-        </w:rPr>
-        <w:t>target drift</w:t>
-      </w:r>
-      <w:r>
-        <w:t xml:space="preserve"> and </w:t>
-      </w:r>
-      <w:r>
-        <w:rPr>
-          <w:b/>
-        </w:rPr>
-        <w:t>actor tracking error</w:t>
-      </w:r>
-      <w:r>
-        <w:t xml:space="preserve">, and obtain a </w:t>
-      </w:r>
-      <w:r>
-        <w:rPr>
-          <w:b/>
-        </w:rPr>
-        <w:t>best-iterate</w:t>
-      </w:r>
-      <w:r>
-        <w:t xml:space="preserve"> regularized value gap \(O(N^{-1/5})\) (plus approximation error) when \(\lambda = \Theta(N^{-4/5})\). </w:t>
-      </w:r>
-      <w:r>
-        <w:rPr>
-          <w:b/>
-        </w:rPr>
-        <w:t>Corollary 1</w:t>
-      </w:r>
-      <w:r>
-        <w:t xml:space="preserve"> contrasts Gibbs vs MD: the Gibbs tracking bound retains a </w:t>
-      </w:r>
-      <w:r>
-        <w:rPr>
-          <w:b/>
-        </w:rPr>
-        <w:t>non-vanishing</w:t>
-      </w:r>
-      <w:r>
-        <w:t xml:space="preserve"> \(1/\tau\) term, whereas \(\lambda\) controls MD target drift. Appendix experiments on a solvable MDP illustrate failure when the curvature condition is violated.</w:t>
+        <w:t>This paper analyzes a **population-level** SAC formalization: **fixed-covariance squashed Gaussian** actor (linear mean in pre-tanh space, tanh to \((-1,1)^M\)), **one projected reverse-KL gradient step** per outer iteration toward an evolving target, and a **critic oracle** \(\hat Q_n\) with \(\|\hat Q_n - Q_\tau^{\pi_{w_n}}\|_\infty \le \varepsilon_{\mathrm{crit}}\). Targets are either the **Gibbs** policy \(\propto \exp(-\hat Q_n/\tau)\) (Eq. 4) or a **policy mirror-descent** target (Eq. 5) with step \(\lambda\), where the MD chain \(\{\pi_n\}\) updates from the **previous target** (not the current actor \(\pi_{w_n}\)). Under concentrability and **Legendre-operator curvature** \(R_{\hat Q}/2 &lt; \tau\), the authors prove the actor KL objective is strongly convex/smooth on \(B(R)\), bound **target drift** and **tracking error**, and obtain **best-iterate** regularized value gap \(O(N^{-1/5})\) (plus \(\varepsilon_{\mathrm{approx}}\)) when \(\lambda = \Theta(N^{-4/5})\). **Corollary 1:** Gibbs tracking retains a **non-vanishing \(1/\tau\)** term; MD drift is **\(\lambda\)-controlled**. Appendix toy MDP (exact critics) shows failure when curvature is violated (Fig. 1) and tracking MD vs Gibbs vs \(\lambda\) (Fig. 2).</w:t>
       </w:r>
     </w:p>
     <w:p>
       <w:pPr>
-        <w:pStyle w:val="Heading3"/>
+        <w:pStyle w:val="Heading2"/>
       </w:pPr>
       <w:r>
         <w:t>Ratings</w:t>
@@ -212,152 +473,32 @@
     </w:p>
     <w:p>
       <w:r>
+        <w:t>| Dimension | Score | Justification |</w:t>
+      </w:r>
+    </w:p>
+    <w:p>
+      <w:r>
         <w:t>|-----------|-------|---------------|</w:t>
       </w:r>
     </w:p>
-    <w:tbl>
-      <w:tblPr>
-        <w:tblStyle w:val="TableGrid"/>
-        <w:tblW w:type="auto" w:w="0"/>
-        <w:tblLook w:firstColumn="1" w:firstRow="1" w:lastColumn="0" w:lastRow="0" w:noHBand="0" w:noVBand="1" w:val="04A0"/>
-      </w:tblPr>
-      <w:tblGrid>
-        <w:gridCol w:w="2880"/>
-        <w:gridCol w:w="2880"/>
-        <w:gridCol w:w="2880"/>
-      </w:tblGrid>
-      <w:tr>
-        <w:tc>
-          <w:tcPr>
-            <w:tcW w:type="dxa" w:w="2880"/>
-          </w:tcPr>
-          <w:p>
-            <w:r>
-              <w:t>Dimension</w:t>
-            </w:r>
-          </w:p>
-        </w:tc>
-        <w:tc>
-          <w:tcPr>
-            <w:tcW w:type="dxa" w:w="2880"/>
-          </w:tcPr>
-          <w:p>
-            <w:r>
-              <w:t>Score</w:t>
-            </w:r>
-          </w:p>
-        </w:tc>
-        <w:tc>
-          <w:tcPr>
-            <w:tcW w:type="dxa" w:w="2880"/>
-          </w:tcPr>
-          <w:p>
-            <w:r>
-              <w:t>Justification</w:t>
-            </w:r>
-          </w:p>
-        </w:tc>
-      </w:tr>
-      <w:tr>
-        <w:tc>
-          <w:tcPr>
-            <w:tcW w:type="dxa" w:w="2880"/>
-          </w:tcPr>
-          <w:p>
-            <w:r>
-              <w:t>**Presentation**</w:t>
-            </w:r>
-          </w:p>
-        </w:tc>
-        <w:tc>
-          <w:tcPr>
-            <w:tcW w:type="dxa" w:w="2880"/>
-          </w:tcPr>
-          <w:p>
-            <w:r>
-              <w:t>**3**</w:t>
-            </w:r>
-          </w:p>
-        </w:tc>
-        <w:tc>
-          <w:tcPr>
-            <w:tcW w:type="dxa" w:w="2880"/>
-          </w:tcPr>
-          <w:p>
-            <w:r>
-              <w:t>Algorithm, assumptions, and theorems are clearly linked; heavy notation is signposted.</w:t>
-            </w:r>
-          </w:p>
-        </w:tc>
-      </w:tr>
-      <w:tr>
-        <w:tc>
-          <w:tcPr>
-            <w:tcW w:type="dxa" w:w="2880"/>
-          </w:tcPr>
-          <w:p>
-            <w:r>
-              <w:t>**Informativeness**</w:t>
-            </w:r>
-          </w:p>
-        </w:tc>
-        <w:tc>
-          <w:tcPr>
-            <w:tcW w:type="dxa" w:w="2880"/>
-          </w:tcPr>
-          <w:p>
-            <w:r>
-              <w:t>**2**</w:t>
-            </w:r>
-          </w:p>
-        </w:tc>
-        <w:tc>
-          <w:tcPr>
-            <w:tcW w:type="dxa" w:w="2880"/>
-          </w:tcPr>
-          <w:p>
-            <w:r>
-              <w:t>Meaningful for RL theory (SAC parametrization + tracking), but narrow audience and no deep RL validation.</w:t>
-            </w:r>
-          </w:p>
-        </w:tc>
-      </w:tr>
-      <w:tr>
-        <w:tc>
-          <w:tcPr>
-            <w:tcW w:type="dxa" w:w="2880"/>
-          </w:tcPr>
-          <w:p>
-            <w:r>
-              <w:t>**Soundness**</w:t>
-            </w:r>
-          </w:p>
-        </w:tc>
-        <w:tc>
-          <w:tcPr>
-            <w:tcW w:type="dxa" w:w="2880"/>
-          </w:tcPr>
-          <w:p>
-            <w:r>
-              <w:t>**2**</w:t>
-            </w:r>
-          </w:p>
-        </w:tc>
-        <w:tc>
-          <w:tcPr>
-            <w:tcW w:type="dxa" w:w="2880"/>
-          </w:tcPr>
-          <w:p>
-            <w:r>
-              <w:t>Proof program appears coherent; results are conditional on strong oracle/curvature assumptions and omit sampling and critic TD dynamics.</w:t>
-            </w:r>
-          </w:p>
-        </w:tc>
-      </w:tr>
-    </w:tbl>
+    <w:p>
+      <w:r>
+        <w:t>| **Presentation** | **3** | Clear algorithm/assumption/theorem map; heavy but organized. |</w:t>
+      </w:r>
+    </w:p>
+    <w:p>
+      <w:r>
+        <w:t>| **Informativeness** | **2** | Valuable SAC theory niche; no deep RL validation or verifiable curvature in practice. |</w:t>
+      </w:r>
+    </w:p>
+    <w:p>
+      <w:r>
+        <w:t>| **Soundness** | **2** | Coherent proof program under strong oracle/geometry assumptions; no sampling/TD dynamics. |</w:t>
+      </w:r>
+    </w:p>
     <w:p>
       <w:pPr>
-        <w:pStyle w:val="Heading3"/>
+        <w:pStyle w:val="Heading2"/>
       </w:pPr>
       <w:r>
         <w:t>Critical Strengths</w:t>
@@ -365,62 +506,22 @@
     </w:p>
     <w:p>
       <w:r>
-        <w:t xml:space="preserve">1. </w:t>
-      </w:r>
-      <w:r>
-        <w:rPr>
-          <w:b/>
-        </w:rPr>
-        <w:t>Closes a gap between SAC practice and theory.</w:t>
-      </w:r>
-      <w:r>
-        <w:t xml:space="preserve"> The analysis matches squashed Gaussian actors and partial KL updates (not abstract policy-space mirror descent) and yields an explicit </w:t>
-      </w:r>
-      <w:r>
-        <w:rPr>
-          <w:b/>
-        </w:rPr>
-        <w:t>\(O(N^{-1/5})\)</w:t>
-      </w:r>
-      <w:r>
-        <w:t xml:space="preserve"> best-iterate rate with a clear \(\lambda\)–\(N\) trade-off (Theorem 3).</w:t>
+        <w:t>1. **Population SAC with partial KL steps** linked to explicit **\(O(N^{-1/5})\)** best-iterate rate and \(\lambda \sim N^{-4/5}\) tuning (Theorem 3).</w:t>
       </w:r>
     </w:p>
     <w:p>
       <w:r>
-        <w:t xml:space="preserve">2. </w:t>
+        <w:t>2. **Quantitative Gibbs vs MD tracking** (Corollary 1, Lemma 9, Fig. 2): **\(1/\tau\)** persistence vs **\(\lambda\)-controlled** target drift—relevant to proximal soft targets.</w:t>
       </w:r>
+    </w:p>
+    <w:p>
       <w:r>
-        <w:rPr>
-          <w:b/>
-        </w:rPr>
-        <w:t>Quantitative Gibbs vs mirror-descent tracking.</w:t>
-      </w:r>
-      <w:r>
-        <w:t xml:space="preserve"> Showing a </w:t>
-      </w:r>
-      <w:r>
-        <w:rPr>
-          <w:b/>
-        </w:rPr>
-        <w:t>persistent \(1/\tau\)</w:t>
-      </w:r>
-      <w:r>
-        <w:t xml:space="preserve"> contribution in the Gibbs tracking bound versus </w:t>
-      </w:r>
-      <w:r>
-        <w:rPr>
-          <w:b/>
-        </w:rPr>
-        <w:t>\(\lambda\)-controlled drift</w:t>
-      </w:r>
-      <w:r>
-        <w:t xml:space="preserve"> for MD targets is a derived, design-relevant distinction (Corollary 1, Lemma 2, Figure 2), not merely definitional.</w:t>
+        <w:t>3. **Curvature condition** \(R_{\hat Q}/2 &lt; \tau\) explains when reverse-KL actor subproblem is well-conditioned (Theorem 2), with toy ablation at fixed \(\varepsilon_{\mathrm{crit}}\).</w:t>
       </w:r>
     </w:p>
     <w:p>
       <w:pPr>
-        <w:pStyle w:val="Heading3"/>
+        <w:pStyle w:val="Heading2"/>
       </w:pPr>
       <w:r>
         <w:t>Critical Weaknesses</w:t>
@@ -428,53 +529,22 @@
     </w:p>
     <w:p>
       <w:r>
-        <w:t xml:space="preserve">1. </w:t>
-      </w:r>
-      <w:r>
-        <w:rPr>
-          <w:b/>
-        </w:rPr>
-        <w:t>Limited practical impact.</w:t>
-      </w:r>
-      <w:r>
-        <w:t xml:space="preserve"> Population critic oracle, single exact projected actor step, and an unverifiable global curvature condition \(R_{\hat Q}/2 &lt; \tau\) (only toy Fourier examples) mean the main rate is </w:t>
-      </w:r>
-      <w:r>
-        <w:rPr>
-          <w:b/>
-        </w:rPr>
-        <w:t>conditional</w:t>
-      </w:r>
-      <w:r>
-        <w:t xml:space="preserve"> for standard deep SAC; main-text experiments do not validate the </w:t>
-      </w:r>
-      <w:r>
-        <w:rPr>
-          <w:b/>
-        </w:rPr>
-        <w:t>\(N^{-1/5}\)</w:t>
-      </w:r>
-      <w:r>
-        <w:t xml:space="preserve"> rate on realistic training.</w:t>
+        <w:t>1. **Conditional for deep SAC:** oracle critic, one exact projected actor step, uncheckable global \(R_{\hat Q}\); no realistic env validation of rate or constants.</w:t>
       </w:r>
     </w:p>
     <w:p>
       <w:r>
-        <w:t xml:space="preserve">2. </w:t>
+        <w:t>2. **MD benefits partly encoded in Eq. (5):** \(O(\lambda)\) drift vs \(1/\lambda\) improvement trade-off should be disentangled from “intrinsic” Gibbs difficulty; \(\pi_n\) chain may not match all SAC implementations.</w:t>
       </w:r>
+    </w:p>
+    <w:p>
       <w:r>
-        <w:rPr>
-          <w:b/>
-        </w:rPr>
-        <w:t>MD tracking advantages are partly built into the target.</w:t>
-      </w:r>
-      <w:r>
-        <w:t xml:space="preserve"> The \(O(\lambda)\) target drift follows from the \(1/\lambda\) KL penalty in Eq. (5); the incremental insight over “proximal targets move slowly” should be stated more explicitly, and the \(\pi_n\) target chain may not match all SAC implementations (target networks / actor-defined targets).</w:t>
+        <w:t>3. **Audience fit:** 36-page theory with appendix-only experiments may under-deliver for empirical ICLR expectations.</w:t>
       </w:r>
     </w:p>
     <w:p>
       <w:pPr>
-        <w:pStyle w:val="Heading3"/>
+        <w:pStyle w:val="Heading2"/>
       </w:pPr>
       <w:r>
         <w:t>Questions For Authors *</w:t>
@@ -482,61 +552,35 @@
     </w:p>
     <w:p>
       <w:r>
-        <w:t xml:space="preserve">1. Can you provide </w:t>
-      </w:r>
-      <w:r>
-        <w:rPr>
-          <w:b/>
-        </w:rPr>
-        <w:t>checkable sufficient conditions</w:t>
-      </w:r>
-      <w:r>
-        <w:t xml:space="preserve"> (architecture, regularization, or online estimates) under which \(R_{\hat Q}/2 &lt; \tau\) holds with high probability during learning?</w:t>
+        <w:t>1. **Checkable conditions** (architecture, regularization, online estimators) for \(R_{\hat Q}/2 &lt; \tau\) w.h.p. during learning?</w:t>
       </w:r>
     </w:p>
     <w:p>
       <w:r>
-        <w:t xml:space="preserve">2. How do the bounds change with </w:t>
-      </w:r>
-      <w:r>
-        <w:rPr>
-          <w:b/>
-        </w:rPr>
-        <w:t>multiple actor gradient steps</w:t>
-      </w:r>
-      <w:r>
-        <w:t xml:space="preserve"> per critic update (standard SAC), and is there a path to </w:t>
-      </w:r>
-      <w:r>
-        <w:rPr>
-          <w:b/>
-        </w:rPr>
-        <w:t>joint stochastic actor–critic</w:t>
-      </w:r>
-      <w:r>
-        <w:t xml:space="preserve"> analysis?</w:t>
+        <w:t>2. **Multiple actor steps** per critic update: can Theorem 3 extend with an inner-loop factor \(K\)?</w:t>
       </w:r>
     </w:p>
     <w:p>
       <w:r>
-        <w:t xml:space="preserve">3. Please clarify how much of the mirror-vs-Gibbs tracking gap in Figure 2 is </w:t>
+        <w:t>3. **Joint stochastic actor–critic:** any path to replace \(\varepsilon_{\mathrm{crit}}\) with sample complexity?</w:t>
       </w:r>
+    </w:p>
+    <w:p>
       <w:r>
-        <w:rPr>
-          <w:b/>
-        </w:rPr>
-        <w:t>intrinsic to the MD target definition</w:t>
+        <w:t>4. In Fig. 2, how much of the MD–Gibbs gap remains if Gibbs targets are **slowed** (e.g., target network on Q) to match effective drift of small \(\lambda\)?</w:t>
       </w:r>
+    </w:p>
+    <w:p>
       <w:r>
-        <w:t xml:space="preserve"> versus problem-independent constants in the tracking lemmas.</w:t>
+        <w:t>5. Can you report **log-log** empirical convergence rates on the toy MDP to compare with \(N^{-1/5}\)?</w:t>
       </w:r>
     </w:p>
     <w:p>
       <w:pPr>
-        <w:pStyle w:val="Heading3"/>
+        <w:pStyle w:val="Heading2"/>
       </w:pPr>
       <w:r>
-        <w:t>Suggested overall (if your form includes it)</w:t>
+        <w:t>Suggested overall</w:t>
       </w:r>
     </w:p>
     <w:p>
@@ -555,49 +599,124 @@
         <w:t>**Confidence:** 3</w:t>
       </w:r>
     </w:p>
-    <w:p/>
+    <w:p>
+      <w:r>
+        <w:t>————————————————————</w:t>
+      </w:r>
+    </w:p>
+    <w:p>
+      <w:pPr>
+        <w:pStyle w:val="Heading1"/>
+      </w:pPr>
+      <w:r>
+        <w:t>Extended review — 42504 (中文)</w:t>
+      </w:r>
+    </w:p>
     <w:p>
       <w:pPr>
         <w:pStyle w:val="Heading2"/>
       </w:pPr>
       <w:r>
-        <w:t>中文</w:t>
+        <w:t>1. 问题与动机</w:t>
+      </w:r>
+    </w:p>
+    <w:p>
+      <w:r>
+        <w:t>SAC 在连续控制中广泛使用，但理论常假设 policy 空间更新或光滑 policy gradient，而实现上是 **tanh 压扁高斯 + 每轮仅少量 reverse-KL 步**。本文在 **population** 层面对齐这一实现，并比较两类 **target**：经典 **Gibbs**（\(\exp(-\hat Q/\tau)\)）与 **policy mirror descent**（式 (5)，步长 \(\lambda\)），研究 **target 漂移** 与 **actor tracking** 如何影响有限步收敛。</w:t>
       </w:r>
     </w:p>
     <w:p>
       <w:pPr>
-        <w:pStyle w:val="Heading3"/>
+        <w:pStyle w:val="Heading2"/>
       </w:pPr>
       <w:r>
-        <w:t>AI 文档说明（可选；作者不可见）</w:t>
+        <w:t>2. 两类 target 为何不同</w:t>
+      </w:r>
+    </w:p>
+    <w:p>
+      <w:pPr>
+        <w:pStyle w:val="ListBullet"/>
+      </w:pPr>
+      <w:r>
+        <w:t>**Gibbs**：每步从当前 \(\hat Q_n\) 重新做 softmax，\(\hat Q\) 或 occupancy 一变，target 可跳变；tracking 界中出现 **不随迭代消失的 \(1/\tau\)**（推论 1）。</w:t>
+      </w:r>
+    </w:p>
+    <w:p>
+      <w:pPr>
+        <w:pStyle w:val="ListBullet"/>
+      </w:pPr>
+      <w:r>
+        <w:t>**MD**：target 链 \(\pi_{n+1}\) 由 **上一 target** 经 KL  proximal 更新得到；**\(\lambda\) 小**则 target 动得慢，actor 更易跟踪，但 MD 本身 policy improvement 变慢（定理 1 中 **\(1/\lambda\)** 项）。</w:t>
+      </w:r>
+    </w:p>
+    <w:p>
+      <w:pPr>
+        <w:pStyle w:val="Heading2"/>
+      </w:pPr>
+      <w:r>
+        <w:t>3. 曲率条件</w:t>
       </w:r>
     </w:p>
     <w:p>
       <w:r>
-        <w:t>已阅读投稿 PDF 全文；英文为本人撰写，中文由 LLM 整理便于粘贴。润色前倾向：</w:t>
-      </w:r>
-      <w:r>
-        <w:rPr>
-          <w:b/>
-        </w:rPr>
-        <w:t>弱接收</w:t>
-      </w:r>
-      <w:r>
-        <w:t xml:space="preserve">（RL 理论读者）；对 ICLR 广义受众 </w:t>
-      </w:r>
-      <w:r>
-        <w:rPr>
-          <w:b/>
-        </w:rPr>
-        <w:t>工程启示有限</w:t>
-      </w:r>
-      <w:r>
-        <w:t>。</w:t>
+        <w:t>**\(R_{\hat Q}/2 &lt; \tau\)** 时 reverse-KL actor 子问题在 \(B(R)\) 上强凸/光滑，才能分析 **单步** 梯度跟踪。深度 critic 难以验证；附录仅 Fourier 线性 critic 有例。图 1 在固定 \(\varepsilon_{\mathrm{crit}}\) 下比较满足/违反曲率。</w:t>
       </w:r>
     </w:p>
     <w:p>
       <w:pPr>
-        <w:pStyle w:val="Heading3"/>
+        <w:pStyle w:val="Heading2"/>
+      </w:pPr>
+      <w:r>
+        <w:t>4. 主结论与实验</w:t>
+      </w:r>
+    </w:p>
+    <w:p>
+      <w:r>
+        <w:t>定理 3：**best-iterate** 值差距 **\(O(N^{-1/5})\)**（加逼近误差），取 **\(\lambda=\Theta(N^{-4/5})\)**。实验仅在可精确解 critic 的玩具 MDP（附录 K），**无** 深度 RL。</w:t>
+      </w:r>
+    </w:p>
+    <w:p>
+      <w:pPr>
+        <w:pStyle w:val="Heading2"/>
+      </w:pPr>
+      <w:r>
+        <w:t>5. 贡献强弱判断</w:t>
+      </w:r>
+    </w:p>
+    <w:p>
+      <w:r>
+        <w:t>对 **SAC 理论** 有填补；对 **广义 ICLR** 工程启示有限。MD 相对 Gibbs 的部分优势来自 **target 定义** 与 \(\lambda\) 权衡，作者应更明确增量 novelty。</w:t>
+      </w:r>
+    </w:p>
+    <w:p>
+      <w:r>
+        <w:t>————————————————————</w:t>
+      </w:r>
+    </w:p>
+    <w:p>
+      <w:pPr>
+        <w:pStyle w:val="Heading1"/>
+      </w:pPr>
+      <w:r>
+        <w:t>OpenReview paste-in — 42504 (中文)</w:t>
+      </w:r>
+    </w:p>
+    <w:p>
+      <w:pPr>
+        <w:pStyle w:val="Heading2"/>
+      </w:pPr>
+      <w:r>
+        <w:t>AI 文档说明（可选）</w:t>
+      </w:r>
+    </w:p>
+    <w:p>
+      <w:r>
+        <w:t>已读 36 页全文；上文为扩展笔记。以下为拟粘贴字段。英文本人撰写；中文 LLM 整理。</w:t>
+      </w:r>
+    </w:p>
+    <w:p>
+      <w:pPr>
+        <w:pStyle w:val="Heading2"/>
       </w:pPr>
       <w:r>
         <w:t>论文摘要 *</w:t>
@@ -605,138 +724,12 @@
     </w:p>
     <w:p>
       <w:r>
-        <w:t xml:space="preserve">本文在 </w:t>
-      </w:r>
-      <w:r>
-        <w:rPr>
-          <w:b/>
-        </w:rPr>
-        <w:t>population</w:t>
-      </w:r>
-      <w:r>
-        <w:t xml:space="preserve"> 设定下形式化 SAC：actor 为 </w:t>
-      </w:r>
-      <w:r>
-        <w:rPr>
-          <w:b/>
-        </w:rPr>
-        <w:t>固定协方差 tanh 压扁高斯</w:t>
-      </w:r>
-      <w:r>
-        <w:t xml:space="preserve">（线性均值），每轮外层迭代对 evolving target 仅做 </w:t>
-      </w:r>
-      <w:r>
-        <w:rPr>
-          <w:b/>
-        </w:rPr>
-        <w:t>一步</w:t>
-      </w:r>
-      <w:r>
-        <w:t xml:space="preserve"> 投影 reverse-KL 梯度；critic 为 </w:t>
-      </w:r>
-      <w:r>
-        <w:rPr>
-          <w:b/>
-        </w:rPr>
-        <w:t>oracle</w:t>
-      </w:r>
-      <w:r>
-        <w:t xml:space="preserve"> \(\hat Q_n\)，满足 \(\|\hat Q_n - Q_\tau^{\pi_{w_n}}\|_\infty \le \varepsilon_{\mathrm{crit}}\)。</w:t>
-      </w:r>
-      <w:r>
-        <w:rPr>
-          <w:b/>
-        </w:rPr>
-        <w:t>Target</w:t>
-      </w:r>
-      <w:r>
-        <w:t xml:space="preserve"> 为经典 </w:t>
-      </w:r>
-      <w:r>
-        <w:rPr>
-          <w:b/>
-        </w:rPr>
-        <w:t>Gibbs</w:t>
-      </w:r>
-      <w:r>
-        <w:t xml:space="preserve">（式 (4)，\(\propto \exp(-\hat Q_n/\tau)\)）或 </w:t>
-      </w:r>
-      <w:r>
-        <w:rPr>
-          <w:b/>
-        </w:rPr>
-        <w:t>policy mirror descent</w:t>
-      </w:r>
-      <w:r>
-        <w:t xml:space="preserve">（式 (5)，步长 \(\lambda\)），其中 MD 链 \(\{\pi_n\}\) 由 </w:t>
-      </w:r>
-      <w:r>
-        <w:rPr>
-          <w:b/>
-        </w:rPr>
-        <w:t>上一 target</w:t>
-      </w:r>
-      <w:r>
-        <w:t xml:space="preserve"> 递推（非当前 actor \(\pi_{w_n}\)）。在 concentrability 与 </w:t>
-      </w:r>
-      <w:r>
-        <w:rPr>
-          <w:b/>
-        </w:rPr>
-        <w:t>Legendre 算子</w:t>
-      </w:r>
-      <w:r>
-        <w:t xml:space="preserve">曲率条件 \(R_{\hat Q}/2 &lt; \tau\) 下，作者证明 actor KL 目标强凸/光滑，控制 </w:t>
-      </w:r>
-      <w:r>
-        <w:rPr>
-          <w:b/>
-        </w:rPr>
-        <w:t>target 漂移</w:t>
-      </w:r>
-      <w:r>
-        <w:t xml:space="preserve"> 与 </w:t>
-      </w:r>
-      <w:r>
-        <w:rPr>
-          <w:b/>
-        </w:rPr>
-        <w:t>actor tracking 误差</w:t>
-      </w:r>
-      <w:r>
-        <w:t xml:space="preserve">，并在 \(\lambda=\Theta(N^{-4/5})\) 时得到 </w:t>
-      </w:r>
-      <w:r>
-        <w:rPr>
-          <w:b/>
-        </w:rPr>
-        <w:t>best-iterate</w:t>
-      </w:r>
-      <w:r>
-        <w:t xml:space="preserve"> 值差距 \(O(N^{-1/5})\)（含逼近误差）。</w:t>
-      </w:r>
-      <w:r>
-        <w:rPr>
-          <w:b/>
-        </w:rPr>
-        <w:t>推论 1</w:t>
-      </w:r>
-      <w:r>
-        <w:t xml:space="preserve"> 对比 Gibbs 与 MD：Gibbs tracking 界含 </w:t>
-      </w:r>
-      <w:r>
-        <w:rPr>
-          <w:b/>
-        </w:rPr>
-        <w:t>不消失</w:t>
-      </w:r>
-      <w:r>
-        <w:t xml:space="preserve"> 的 \(1/\tau\)；MD 可通过 \(\lambda\) 控制漂移。附录玩具 MDP 展示曲率条件破坏时的退化。</w:t>
+        <w:t>（同英文 Summary 之中文对应，略长版）population SAC：固定协方差 tanh 高斯 actor、每轮 **一步** 投影 reverse-KL、critic **oracle** \(\varepsilon_{\mathrm{crit}}\)。Target 为 **Gibbs**（式 4）或 **MD**（式 5，\(\lambda\)，链 \(\{\pi_n\}\) 由上一 target 递推）。在 concentrability 与 **\(R_{\hat Q}/2&lt;\tau\)** 下，证明 actor 目标强凸/光滑，控制漂移与 tracking，**\(\lambda=\Theta(N^{-4/5})\)** 时 **best-iterate** 差距 **\(O(N^{-1/5})\)**。推论 1：Gibbs tracking 含 **\(1/\tau\)** 残留；MD 由 **\(\lambda\)** 控漂移。附录玩具 MDP 验证曲率与 Fig. 2 tracking。</w:t>
       </w:r>
     </w:p>
     <w:p>
       <w:pPr>
-        <w:pStyle w:val="Heading3"/>
+        <w:pStyle w:val="Heading2"/>
       </w:pPr>
       <w:r>
         <w:t>评分</w:t>
@@ -744,152 +737,32 @@
     </w:p>
     <w:p>
       <w:r>
+        <w:t>| 维度 | 分数 | 理由 |</w:t>
+      </w:r>
+    </w:p>
+    <w:p>
+      <w:r>
         <w:t>|------|------|------|</w:t>
       </w:r>
     </w:p>
-    <w:tbl>
-      <w:tblPr>
-        <w:tblStyle w:val="TableGrid"/>
-        <w:tblW w:type="auto" w:w="0"/>
-        <w:tblLook w:firstColumn="1" w:firstRow="1" w:lastColumn="0" w:lastRow="0" w:noHBand="0" w:noVBand="1" w:val="04A0"/>
-      </w:tblPr>
-      <w:tblGrid>
-        <w:gridCol w:w="2880"/>
-        <w:gridCol w:w="2880"/>
-        <w:gridCol w:w="2880"/>
-      </w:tblGrid>
-      <w:tr>
-        <w:tc>
-          <w:tcPr>
-            <w:tcW w:type="dxa" w:w="2880"/>
-          </w:tcPr>
-          <w:p>
-            <w:r>
-              <w:t>维度</w:t>
-            </w:r>
-          </w:p>
-        </w:tc>
-        <w:tc>
-          <w:tcPr>
-            <w:tcW w:type="dxa" w:w="2880"/>
-          </w:tcPr>
-          <w:p>
-            <w:r>
-              <w:t>分数</w:t>
-            </w:r>
-          </w:p>
-        </w:tc>
-        <w:tc>
-          <w:tcPr>
-            <w:tcW w:type="dxa" w:w="2880"/>
-          </w:tcPr>
-          <w:p>
-            <w:r>
-              <w:t>理由</w:t>
-            </w:r>
-          </w:p>
-        </w:tc>
-      </w:tr>
-      <w:tr>
-        <w:tc>
-          <w:tcPr>
-            <w:tcW w:type="dxa" w:w="2880"/>
-          </w:tcPr>
-          <w:p>
-            <w:r>
-              <w:t>**Presentation 呈现**</w:t>
-            </w:r>
-          </w:p>
-        </w:tc>
-        <w:tc>
-          <w:tcPr>
-            <w:tcW w:type="dxa" w:w="2880"/>
-          </w:tcPr>
-          <w:p>
-            <w:r>
-              <w:t>**3**</w:t>
-            </w:r>
-          </w:p>
-        </w:tc>
-        <w:tc>
-          <w:tcPr>
-            <w:tcW w:type="dxa" w:w="2880"/>
-          </w:tcPr>
-          <w:p>
-            <w:r>
-              <w:t>算法、假设与定理对应清楚。</w:t>
-            </w:r>
-          </w:p>
-        </w:tc>
-      </w:tr>
-      <w:tr>
-        <w:tc>
-          <w:tcPr>
-            <w:tcW w:type="dxa" w:w="2880"/>
-          </w:tcPr>
-          <w:p>
-            <w:r>
-              <w:t>**Informativeness 信息量**</w:t>
-            </w:r>
-          </w:p>
-        </w:tc>
-        <w:tc>
-          <w:tcPr>
-            <w:tcW w:type="dxa" w:w="2880"/>
-          </w:tcPr>
-          <w:p>
-            <w:r>
-              <w:t>**2**</w:t>
-            </w:r>
-          </w:p>
-        </w:tc>
-        <w:tc>
-          <w:tcPr>
-            <w:tcW w:type="dxa" w:w="2880"/>
-          </w:tcPr>
-          <w:p>
-            <w:r>
-              <w:t>对 SAC 理论分析有意义，但受众窄、无深度 RL 验证。</w:t>
-            </w:r>
-          </w:p>
-        </w:tc>
-      </w:tr>
-      <w:tr>
-        <w:tc>
-          <w:tcPr>
-            <w:tcW w:type="dxa" w:w="2880"/>
-          </w:tcPr>
-          <w:p>
-            <w:r>
-              <w:t>**Soundness 可靠性**</w:t>
-            </w:r>
-          </w:p>
-        </w:tc>
-        <w:tc>
-          <w:tcPr>
-            <w:tcW w:type="dxa" w:w="2880"/>
-          </w:tcPr>
-          <w:p>
-            <w:r>
-              <w:t>**2**</w:t>
-            </w:r>
-          </w:p>
-        </w:tc>
-        <w:tc>
-          <w:tcPr>
-            <w:tcW w:type="dxa" w:w="2880"/>
-          </w:tcPr>
-          <w:p>
-            <w:r>
-              <w:t>证明链完整感强；强 oracle/曲率假设；缺采样与 critic TD 动力学。</w:t>
-            </w:r>
-          </w:p>
-        </w:tc>
-      </w:tr>
-    </w:tbl>
+    <w:p>
+      <w:r>
+        <w:t>| Presentation | **3** | 结构清晰。 |</w:t>
+      </w:r>
+    </w:p>
+    <w:p>
+      <w:r>
+        <w:t>| Informativeness | **2** | 理论受众窄；缺深度 RL。 |</w:t>
+      </w:r>
+    </w:p>
+    <w:p>
+      <w:r>
+        <w:t>| Soundness | **2** | 强假设下证明完整感强；无 TD/采样。 |</w:t>
+      </w:r>
+    </w:p>
     <w:p>
       <w:pPr>
-        <w:pStyle w:val="Heading3"/>
+        <w:pStyle w:val="Heading2"/>
       </w:pPr>
       <w:r>
         <w:t>关键优点</w:t>
@@ -897,62 +770,22 @@
     </w:p>
     <w:p>
       <w:r>
-        <w:t xml:space="preserve">1. </w:t>
-      </w:r>
-      <w:r>
-        <w:rPr>
-          <w:b/>
-        </w:rPr>
-        <w:t>贴近实现的 SAC 理论</w:t>
-      </w:r>
-      <w:r>
-        <w:t xml:space="preserve">：squashed Gaussian + 部分 KL 更新，给出显式 </w:t>
-      </w:r>
-      <w:r>
-        <w:rPr>
-          <w:b/>
-        </w:rPr>
-        <w:t>\(O(N^{-1/5})\)</w:t>
-      </w:r>
-      <w:r>
-        <w:t xml:space="preserve"> best-iterate 率及 \(\lambda\)–\(N\) 权衡（定理 3）。</w:t>
+        <w:t xml:space="preserve">1. 贴近 SAC 的 population 模型 + **\(O(N^{-1/5})\)** 显式率与 \(\lambda\)–\(N\) 标度。  </w:t>
       </w:r>
     </w:p>
     <w:p>
       <w:r>
-        <w:t xml:space="preserve">2. </w:t>
+        <w:t xml:space="preserve">2. **Gibbs vs MD** tracking 定量对照（**\(1/\tau\)** vs **\(\lambda\)**）。  </w:t>
       </w:r>
+    </w:p>
+    <w:p>
       <w:r>
-        <w:rPr>
-          <w:b/>
-        </w:rPr>
-        <w:t>Gibbs 与 MD 的 tracking 定量对照</w:t>
-      </w:r>
-      <w:r>
-        <w:t xml:space="preserve">：Gibbs 界中 </w:t>
-      </w:r>
-      <w:r>
-        <w:rPr>
-          <w:b/>
-        </w:rPr>
-        <w:t>\(1/\tau\)</w:t>
-      </w:r>
-      <w:r>
-        <w:t xml:space="preserve"> 残留项 vs MD 的 </w:t>
-      </w:r>
-      <w:r>
-        <w:rPr>
-          <w:b/>
-        </w:rPr>
-        <w:t>\(\lambda\)</w:t>
-      </w:r>
-      <w:r>
-        <w:t xml:space="preserve"> 控漂移，对 proximal soft target 设计有推导层面的意义（推论 1、引理 2、图 2）。</w:t>
+        <w:t>3. 曲率条件与 Fig. 1 失败模式相联系。</w:t>
       </w:r>
     </w:p>
     <w:p>
       <w:pPr>
-        <w:pStyle w:val="Heading3"/>
+        <w:pStyle w:val="Heading2"/>
       </w:pPr>
       <w:r>
         <w:t>关键缺点</w:t>
@@ -960,62 +793,22 @@
     </w:p>
     <w:p>
       <w:r>
-        <w:t xml:space="preserve">1. </w:t>
-      </w:r>
-      <w:r>
-        <w:rPr>
-          <w:b/>
-        </w:rPr>
-        <w:t>实际影响有限</w:t>
-      </w:r>
-      <w:r>
-        <w:t xml:space="preserve">：population oracle、单步精确投影 actor、难验证的全局曲率 \(R_{\hat Q}/2&lt;\tau\)，使主结论对标准深度 SAC </w:t>
-      </w:r>
-      <w:r>
-        <w:rPr>
-          <w:b/>
-        </w:rPr>
-        <w:t>条件性</w:t>
-      </w:r>
-      <w:r>
-        <w:t xml:space="preserve">强；正文实验未在真实训练上验证 </w:t>
-      </w:r>
-      <w:r>
-        <w:rPr>
-          <w:b/>
-        </w:rPr>
-        <w:t>\(N^{-1/5}\)</w:t>
-      </w:r>
-      <w:r>
-        <w:t xml:space="preserve"> 率。</w:t>
+        <w:t xml:space="preserve">1. oracle、单步 actor、不可验证 \(R_{\hat Q}\) → 对深度 SAC **条件性**强。  </w:t>
       </w:r>
     </w:p>
     <w:p>
       <w:r>
-        <w:t xml:space="preserve">2. </w:t>
+        <w:t xml:space="preserve">2. MD 优势部分来自式 (5) 定义；与实现中 target network 等未必一致。  </w:t>
       </w:r>
+    </w:p>
+    <w:p>
       <w:r>
-        <w:rPr>
-          <w:b/>
-        </w:rPr>
-        <w:t>MD 优势部分来自 target 定义</w:t>
-      </w:r>
-      <w:r>
-        <w:t xml:space="preserve">：\(O(\lambda)\) 漂移与式 (5) 中 </w:t>
-      </w:r>
-      <w:r>
-        <w:rPr>
-          <w:b/>
-        </w:rPr>
-        <w:t>\(1/\lambda\) KL</w:t>
-      </w:r>
-      <w:r>
-        <w:t xml:space="preserve"> 内在相关；相对「proximal target 动得慢」的增量 insight 应更明确；\(\pi_n\) 链与部分 SAC 实现（target network 等）未必一致。</w:t>
+        <w:t>3. 主会 empirical 期望下贡献偏窄。</w:t>
       </w:r>
     </w:p>
     <w:p>
       <w:pPr>
-        <w:pStyle w:val="Heading3"/>
+        <w:pStyle w:val="Heading2"/>
       </w:pPr>
       <w:r>
         <w:t>给作者的问题 *</w:t>
@@ -1023,61 +816,35 @@
     </w:p>
     <w:p>
       <w:r>
-        <w:t xml:space="preserve">1. 是否有 </w:t>
-      </w:r>
-      <w:r>
-        <w:rPr>
-          <w:b/>
-        </w:rPr>
-        <w:t>可检验</w:t>
-      </w:r>
-      <w:r>
-        <w:t xml:space="preserve"> 条件（结构、正则或在线估计）保证训练时 \(R_{\hat Q}/2 &lt; \tau\)？</w:t>
+        <w:t xml:space="preserve">1. 训练时如何检验/保证 \(R_{\hat Q}/2&lt;\tau\)？  </w:t>
       </w:r>
     </w:p>
     <w:p>
       <w:r>
-        <w:t xml:space="preserve">2. </w:t>
-      </w:r>
-      <w:r>
-        <w:rPr>
-          <w:b/>
-        </w:rPr>
-        <w:t>每 critic 多步 actor</w:t>
-      </w:r>
-      <w:r>
-        <w:t xml:space="preserve">（标准 SAC）与 </w:t>
-      </w:r>
-      <w:r>
-        <w:rPr>
-          <w:b/>
-        </w:rPr>
-        <w:t>联合随机 actor–critic</w:t>
-      </w:r>
-      <w:r>
-        <w:t xml:space="preserve"> 如何扩展？</w:t>
+        <w:t xml:space="preserve">2. 多步 actor 内循环？  </w:t>
       </w:r>
     </w:p>
     <w:p>
       <w:r>
-        <w:t xml:space="preserve">3. 图 2 中 mirror 相对 Gibbs 的优势，多少来自 </w:t>
+        <w:t xml:space="preserve">3. 能否给出采样复杂度而不仅是 \(\varepsilon_{\mathrm{crit}}\)？  </w:t>
       </w:r>
+    </w:p>
+    <w:p>
       <w:r>
-        <w:rPr>
-          <w:b/>
-        </w:rPr>
-        <w:t>MD target 定义本身</w:t>
+        <w:t xml:space="preserve">4. 放慢 Gibbs target 后 MD 优势是否仍存在？  </w:t>
       </w:r>
+    </w:p>
+    <w:p>
       <w:r>
-        <w:t>，多少来自 tracking 引理中的问题常数？</w:t>
+        <w:t>5. 玩具 MDP 上是否拟合 \(N^{-1/5}\) 斜率？</w:t>
       </w:r>
     </w:p>
     <w:p>
       <w:pPr>
-        <w:pStyle w:val="Heading3"/>
+        <w:pStyle w:val="Heading2"/>
       </w:pPr>
       <w:r>
-        <w:t>建议总评（若表单包含）</w:t>
+        <w:t>建议总评</w:t>
       </w:r>
     </w:p>
     <w:p>
@@ -1085,7 +852,7 @@
         <w:pStyle w:val="ListBullet"/>
       </w:pPr>
       <w:r>
-        <w:t>**Recommendation 总评：** 弱接收（理论）/ 边界（广义 ICLR）</w:t>
+        <w:t xml:space="preserve">**Recommendation：** 弱接收（理论）/ 边界（广义 ICLR）  </w:t>
       </w:r>
     </w:p>
     <w:p>
@@ -1093,13 +860,17 @@
         <w:pStyle w:val="ListBullet"/>
       </w:pPr>
       <w:r>
-        <w:t>**Confidence 置信度：** 3</w:t>
+        <w:t>**Confidence：** 3</w:t>
       </w:r>
     </w:p>
-    <w:p/>
+    <w:p>
+      <w:r>
+        <w:t>————————————————————</w:t>
+      </w:r>
+    </w:p>
     <w:p>
       <w:pPr>
-        <w:pStyle w:val="Heading1"/>
+        <w:pStyle w:val="Title"/>
       </w:pPr>
       <w:r>
         <w:t>Submission 50972 — *Q-Learning with Normalizing Flows* (QNF)</w:t>
@@ -1107,15 +878,274 @@
     </w:p>
     <w:p>
       <w:pPr>
-        <w:pStyle w:val="Heading2"/>
+        <w:pStyle w:val="Heading1"/>
       </w:pPr>
       <w:r>
-        <w:t>English</w:t>
+        <w:t>Extended review (English)</w:t>
       </w:r>
     </w:p>
     <w:p>
       <w:pPr>
-        <w:pStyle w:val="Heading3"/>
+        <w:pStyle w:val="Heading2"/>
+      </w:pPr>
+      <w:r>
+        <w:t>1. Motivation</w:t>
+      </w:r>
+    </w:p>
+    <w:p>
+      <w:r>
+        <w:t>Discrete Q-learning uses **max** over actions; continuous control replaces max with **softmax** over actions weighted by \(\exp(Q(s,a)/\alpha)\), but then you need either (i) a separate actor to represent that distribution, or (ii) a generative model that **is** the softmax. SAC/CrossQ/MPO: learn \(Q\) (or critic) + **policy extraction** (regression to softmax). **QNF** parameterizes the **policy density directly** as a **normalizing flow**, so the policy **is** the implicit softmax of a scalar potential—avoiding an explicit “actor improvement” network that chases a moving softmax target.</w:t>
+      </w:r>
+    </w:p>
+    <w:p>
+      <w:pPr>
+        <w:pStyle w:val="Heading2"/>
+      </w:pPr>
+      <w:r>
+        <w:t>2. Method pipeline</w:t>
+      </w:r>
+    </w:p>
+    <w:p>
+      <w:pPr>
+        <w:pStyle w:val="ListBullet"/>
+      </w:pPr>
+      <w:r>
+        <w:t>**Policy:** flow \(f_\theta(s,a)\) with tractable density \(\pi_\theta(a|s)\); interpret as softmax of implicit Q (Eqs. 11–12 in paper).</w:t>
+      </w:r>
+    </w:p>
+    <w:p>
+      <w:pPr>
+        <w:pStyle w:val="ListBullet"/>
+      </w:pPr>
+      <w:r>
+        <w:t>**Critics:** twin Q (or value + advantage decomposition as in algorithm figure); **target networks** for stability.</w:t>
+      </w:r>
+    </w:p>
+    <w:p>
+      <w:pPr>
+        <w:pStyle w:val="ListBullet"/>
+      </w:pPr>
+      <w:r>
+        <w:t>**Update:** **semi-gradient soft TD** on flow parameters (Eq. 15)—distinct from Trust-PCL-style **full** gradient through the Bellman operator.</w:t>
+      </w:r>
+    </w:p>
+    <w:p>
+      <w:pPr>
+        <w:pStyle w:val="ListBullet"/>
+      </w:pPr>
+      <w:r>
+        <w:t>**Entropy temperature \(\alpha\):** not fixed grid only—**closed-form OLS** each step on pairs \((\log \pi_\theta(a|s), \text{advantage})\) (Eq. 17), “stateless greedy” autotune.</w:t>
+      </w:r>
+    </w:p>
+    <w:p>
+      <w:pPr>
+        <w:pStyle w:val="ListBullet"/>
+      </w:pPr>
+      <w:r>
+        <w:t>**Greedification (Eqs. 18–20):** extra term with scale \(\lambda\) pushes policy toward colder / more peaked distribution when TD residual small—addresses stagnation when \(\lambda=0\).</w:t>
+      </w:r>
+    </w:p>
+    <w:p>
+      <w:r>
+        <w:t>**QMANSF:** masked autoregressive **neural spline flow**—authors’ main architecture; alternatives QMAF, QRNVP, QCNSF, QEBFlow, QMLP, QGauss compared in Fig. 3.</w:t>
+      </w:r>
+    </w:p>
+    <w:p>
+      <w:pPr>
+        <w:pStyle w:val="Heading2"/>
+      </w:pPr>
+      <w:r>
+        <w:t>3. Baselines and protocol</w:t>
+      </w:r>
+    </w:p>
+    <w:p>
+      <w:pPr>
+        <w:pStyle w:val="ListBullet"/>
+      </w:pPr>
+      <w:r>
+        <w:t>**8 DeepMind Control** tasks, **500k** env steps, **5 seeds**, report **IQM** + **95% bootstrap CI** (Agarwal et al. 2021).</w:t>
+      </w:r>
+    </w:p>
+    <w:p>
+      <w:pPr>
+        <w:pStyle w:val="ListBullet"/>
+      </w:pPr>
+      <w:r>
+        <w:t>Baselines: **SAC**, **CrossQ**, **FMER**, **FPO**, **MEow** (flow-related / entropy RL methods).</w:t>
+      </w:r>
+    </w:p>
+    <w:p>
+      <w:pPr>
+        <w:pStyle w:val="ListBullet"/>
+      </w:pPr>
+      <w:r>
+        <w:t>**Shared hyperparameters across envs** for all methods (simplicity but may hurt fairness).</w:t>
+      </w:r>
+    </w:p>
+    <w:p>
+      <w:pPr>
+        <w:pStyle w:val="ListBullet"/>
+      </w:pPr>
+      <w:r>
+        <w:t>**Stochastic evaluation** for all (flows lack deterministic mode)—fair to flows, may hurt exploitation-heavy comparison vs deterministic eval SAC.</w:t>
+      </w:r>
+    </w:p>
+    <w:p>
+      <w:pPr>
+        <w:pStyle w:val="Heading2"/>
+      </w:pPr>
+      <w:r>
+        <w:t>4. Results (detailed read)</w:t>
+      </w:r>
+    </w:p>
+    <w:p>
+      <w:pPr>
+        <w:pStyle w:val="ListBullet"/>
+      </w:pPr>
+      <w:r>
+        <w:t>**Figure 2 (main comparison):** QNF **competitive** on several locomotion/manipulation tasks but **lags SAC/CrossQ** on **exploitation-heavy** runners (**cheetah-run**, **walker-run**) and on **hopper-stand** (weak reward / need exploration)—authors acknowledge CrossQ adapts entropy setpoint while QNF with greedification may **wait for signal** and fail to discover stand-up behavior.</w:t>
+      </w:r>
+    </w:p>
+    <w:p>
+      <w:pPr>
+        <w:pStyle w:val="ListBullet"/>
+      </w:pPr>
+      <w:r>
+        <w:t>**Figure 3:** **QMANSF** among best flow variants—few layers, high expressivity per layer.</w:t>
+      </w:r>
+    </w:p>
+    <w:p>
+      <w:pPr>
+        <w:pStyle w:val="ListBullet"/>
+      </w:pPr>
+      <w:r>
+        <w:t>**Figure 4:** **\(\alpha\) sensitivity** high across envs; autotune OLS matches best fixed \(\alpha\) in many cases; **\(\lambda=0.1\)** reasonable for greed; large \(\lambda\) can **collapse** policy.</w:t>
+      </w:r>
+    </w:p>
+    <w:p>
+      <w:pPr>
+        <w:pStyle w:val="Heading2"/>
+      </w:pPr>
+      <w:r>
+        <w:t>5. Related positioning</w:t>
+      </w:r>
+    </w:p>
+    <w:p>
+      <w:pPr>
+        <w:pStyle w:val="ListBullet"/>
+      </w:pPr>
+      <w:r>
+        <w:t>**MEow / energy-based flows (NeurIPS 2024 line):** also flow + entropy RL; QNF differs by **direct Q-flow** + semi-gradient TD + OLS \(\alpha\) + greedification.</w:t>
+      </w:r>
+    </w:p>
+    <w:p>
+      <w:pPr>
+        <w:pStyle w:val="ListBullet"/>
+      </w:pPr>
+      <w:r>
+        <w:t>**Trust-PCL / soft Q with flows:** gradient-type differences matter for bias/variance—paper argues semi-gradient is practical.</w:t>
+      </w:r>
+    </w:p>
+    <w:p>
+      <w:pPr>
+        <w:pStyle w:val="Heading2"/>
+      </w:pPr>
+      <w:r>
+        <w:t>6. Extended strengths</w:t>
+      </w:r>
+    </w:p>
+    <w:p>
+      <w:r>
+        <w:t>1. **Conceptual clarity:** one generative model replaces actor–critic “two-headed” softmax extraction; Figure 1 algorithm is easy to teach.</w:t>
+      </w:r>
+    </w:p>
+    <w:p>
+      <w:r>
+        <w:t>2. **Training knobs with ablations:** \(\alpha\) OLS and greed \(\lambda\) are not afterthoughts—Fig. 4 supports narrative.</w:t>
+      </w:r>
+    </w:p>
+    <w:p>
+      <w:r>
+        <w:t>3. **Architecture study (Fig. 3)** within QNF family—QMANSF justified, not arbitrary.</w:t>
+      </w:r>
+    </w:p>
+    <w:p>
+      <w:r>
+        <w:t>4. **Honest limitation section:** sim-only, dense reward, compute vs Gaussian actor, stability tricks (split quadratic solve).</w:t>
+      </w:r>
+    </w:p>
+    <w:p>
+      <w:r>
+        <w:t>5. **Reproducibility claim:** anonymous code link promised—important if baselines are sensitive (SAC \(\alpha\) init 0.2 vs official 1.0 noted in text).</w:t>
+      </w:r>
+    </w:p>
+    <w:p>
+      <w:pPr>
+        <w:pStyle w:val="Heading2"/>
+      </w:pPr>
+      <w:r>
+        <w:t>7. Extended weaknesses</w:t>
+      </w:r>
+    </w:p>
+    <w:p>
+      <w:r>
+        <w:t>1. **Abstract vs evidence:** “perform similarly to widely used actor-critic” is **overstated** where CrossQ/SAC win clearly on multiple reported tasks.</w:t>
+      </w:r>
+    </w:p>
+    <w:p>
+      <w:r>
+        <w:t>2. **No wall-clock / sample-normalized compute**—flows cost more per step; unclear if gaps shrink with equal wall time.</w:t>
+      </w:r>
+    </w:p>
+    <w:p>
+      <w:r>
+        <w:t>3. **Single hyperparameter sheet across 8 envs**—may under-tune SAC/CrossQ or over-tune QNF; MEow from Hopper defaults + manual entropy tweak—**baseline fairness** weak.</w:t>
+      </w:r>
+    </w:p>
+    <w:p>
+      <w:r>
+        <w:t>4. **No theory** for semi-gradient TD + flows; no convergence or bias characterization.</w:t>
+      </w:r>
+    </w:p>
+    <w:p>
+      <w:r>
+        <w:t>5. **Scope:** no sparse reward, high-D action, real robots; greedification may harm exploration—hopper-stand is a red flag for deployment.</w:t>
+      </w:r>
+    </w:p>
+    <w:p>
+      <w:r>
+        <w:t>6. **Statistical testing:** CIs shown but few formal tests vs strongest baseline per task.</w:t>
+      </w:r>
+    </w:p>
+    <w:p>
+      <w:pPr>
+        <w:pStyle w:val="Heading2"/>
+      </w:pPr>
+      <w:r>
+        <w:t>8. Recommendation rationale</w:t>
+      </w:r>
+    </w:p>
+    <w:p>
+      <w:r>
+        <w:t>**Borderline accept:** interesting unification and reasonable engineering effort for 15 pages, but empirical headline oversells and key tasks show **clear baseline wins**. Would strengthen with matched-compute tables and per-task tuned baselines.</w:t>
+      </w:r>
+    </w:p>
+    <w:p>
+      <w:r>
+        <w:t>————————————————————</w:t>
+      </w:r>
+    </w:p>
+    <w:p>
+      <w:pPr>
+        <w:pStyle w:val="Heading1"/>
+      </w:pPr>
+      <w:r>
+        <w:t>OpenReview paste-in — 50972 (English)</w:t>
+      </w:r>
+    </w:p>
+    <w:p>
+      <w:pPr>
+        <w:pStyle w:val="Heading2"/>
       </w:pPr>
       <w:r>
         <w:t>AI Documentation For Reviewing (optional)</w:t>
@@ -1123,21 +1153,12 @@
     </w:p>
     <w:p>
       <w:r>
-        <w:t xml:space="preserve">I read the full 15-page PDF. English review is mine; Chinese adapted with LLM assistance. Tendency: </w:t>
-      </w:r>
-      <w:r>
-        <w:rPr>
-          <w:b/>
-        </w:rPr>
-        <w:t>borderline accept</w:t>
-      </w:r>
-      <w:r>
-        <w:t>.</w:t>
+        <w:t>Read full 15-page PDF. Extended notes above for myself; below for OpenReview. Tendency: **borderline accept**.</w:t>
       </w:r>
     </w:p>
     <w:p>
       <w:pPr>
-        <w:pStyle w:val="Heading3"/>
+        <w:pStyle w:val="Heading2"/>
       </w:pPr>
       <w:r>
         <w:t>Paper Summary *</w:t>
@@ -1145,138 +1166,12 @@
     </w:p>
     <w:p>
       <w:r>
-        <w:t xml:space="preserve">The paper proposes </w:t>
-      </w:r>
-      <w:r>
-        <w:rPr>
-          <w:b/>
-        </w:rPr>
-        <w:t>Q Normalizing Flows (QNF)</w:t>
-      </w:r>
-      <w:r>
-        <w:t xml:space="preserve">: the </w:t>
-      </w:r>
-      <w:r>
-        <w:rPr>
-          <w:b/>
-        </w:rPr>
-        <w:t>entropy-regularized policy</w:t>
-      </w:r>
-      <w:r>
-        <w:t xml:space="preserve"> is parameterized directly as a </w:t>
-      </w:r>
-      <w:r>
-        <w:rPr>
-          <w:b/>
-        </w:rPr>
-        <w:t>normalizing flow</w:t>
-      </w:r>
-      <w:r>
-        <w:t xml:space="preserve"> density, so the policy </w:t>
-      </w:r>
-      <w:r>
-        <w:rPr>
-          <w:b/>
-        </w:rPr>
-        <w:t>is</w:t>
-      </w:r>
-      <w:r>
-        <w:t xml:space="preserve"> the softmax of an implicit \(Q\) (Eqs. 11–12), rather than learning scalar \(Q(s,a)\) plus a separate actor regression (SAC/MPO). Training uses </w:t>
-      </w:r>
-      <w:r>
-        <w:rPr>
-          <w:b/>
-        </w:rPr>
-        <w:t>soft TD</w:t>
-      </w:r>
-      <w:r>
-        <w:t xml:space="preserve"> with twin critics and target networks; the flow is updated with </w:t>
-      </w:r>
-      <w:r>
-        <w:rPr>
-          <w:b/>
-        </w:rPr>
-        <w:t>semi-gradient TD</w:t>
-      </w:r>
-      <w:r>
-        <w:t xml:space="preserve"> (Eq. 15), distinct from Trust-PCL’s full gradient-TD. </w:t>
-      </w:r>
-      <w:r>
-        <w:rPr>
-          <w:b/>
-        </w:rPr>
-        <w:t>\(\alpha\)</w:t>
-      </w:r>
-      <w:r>
-        <w:t xml:space="preserve"> is tuned via closed-form </w:t>
-      </w:r>
-      <w:r>
-        <w:rPr>
-          <w:b/>
-        </w:rPr>
-        <w:t>OLS</w:t>
-      </w:r>
-      <w:r>
-        <w:t xml:space="preserve"> on \((\log\pi_\theta, \text{advantage})\) (Eq. 17). A </w:t>
-      </w:r>
-      <w:r>
-        <w:rPr>
-          <w:b/>
-        </w:rPr>
-        <w:t>greedification</w:t>
-      </w:r>
-      <w:r>
-        <w:t xml:space="preserve"> term (Eqs. 18–20, scale \(\lambda\)) pushes toward colder softmaps when TD residual vanishes. </w:t>
-      </w:r>
-      <w:r>
-        <w:rPr>
-          <w:b/>
-        </w:rPr>
-        <w:t>QMANSF</w:t>
-      </w:r>
-      <w:r>
-        <w:t xml:space="preserve"> (masked autoregressive neural spline flows) is evaluated on </w:t>
-      </w:r>
-      <w:r>
-        <w:rPr>
-          <w:b/>
-        </w:rPr>
-        <w:t>8 DeepMind Control</w:t>
-      </w:r>
-      <w:r>
-        <w:t xml:space="preserve"> tasks (500k steps, 5 seeds, IQM + bootstrap CIs) against </w:t>
-      </w:r>
-      <w:r>
-        <w:rPr>
-          <w:b/>
-        </w:rPr>
-        <w:t>SAC, CrossQ, FMER, FPO, MEow</w:t>
-      </w:r>
-      <w:r>
-        <w:t xml:space="preserve">, with flow-architecture and \(\alpha\)/\(\lambda\) ablations. QNF is </w:t>
-      </w:r>
-      <w:r>
-        <w:rPr>
-          <w:b/>
-        </w:rPr>
-        <w:t>competitive</w:t>
-      </w:r>
-      <w:r>
-        <w:t xml:space="preserve"> on several tasks but </w:t>
-      </w:r>
-      <w:r>
-        <w:rPr>
-          <w:b/>
-        </w:rPr>
-        <w:t>underperforms</w:t>
-      </w:r>
-      <w:r>
-        <w:t xml:space="preserve"> SAC/CrossQ on exploitation-heavy tasks (e.g., cheetah-run, walker-run) and weak-exploration settings (e.g., hopper-stand). Scope is simulation-only, dense-reward focused.</w:t>
+        <w:t>**Q Normalizing Flows (QNF)** represent the **entropy-regularized policy** as a **normalizing flow**, so the policy density **is** the softmax of an implicit Q (Eqs. 11–12), avoiding separate actor regression (SAC/MPO). Training: **soft TD** with twin critics and targets; flow trained by **semi-gradient TD** (Eq. 15). **\(\alpha\)** via closed-form **OLS** on \((\log\pi_\theta, \text{advantage})\) (Eq. 17). **Greedification** (Eqs. 18–20, \(\lambda\)) encourages colder policies when TD residual vanishes. **QMANSF** (masked autoregressive spline flow) evaluated on **8 DMC** tasks (500k steps, 5 seeds, IQM + bootstrap CIs) vs **SAC, CrossQ, FMER, FPO, MEow**, plus flow-type and \(\alpha\)/\(\lambda\) ablations. **Competitive** on several tasks; **underperforms** SAC/CrossQ on exploitation tasks (**cheetah-run**, **walker-run**) and **hopper-stand** (exploration). Sim-only, dense rewards; shared hyperparameters across envs.</w:t>
       </w:r>
     </w:p>
     <w:p>
       <w:pPr>
-        <w:pStyle w:val="Heading3"/>
+        <w:pStyle w:val="Heading2"/>
       </w:pPr>
       <w:r>
         <w:t>Ratings</w:t>
@@ -1284,152 +1179,32 @@
     </w:p>
     <w:p>
       <w:r>
+        <w:t>| Dimension | Score | Justification |</w:t>
+      </w:r>
+    </w:p>
+    <w:p>
+      <w:r>
         <w:t>|-----------|-------|---------------|</w:t>
       </w:r>
     </w:p>
-    <w:tbl>
-      <w:tblPr>
-        <w:tblStyle w:val="TableGrid"/>
-        <w:tblW w:type="auto" w:w="0"/>
-        <w:tblLook w:firstColumn="1" w:firstRow="1" w:lastColumn="0" w:lastRow="0" w:noHBand="0" w:noVBand="1" w:val="04A0"/>
-      </w:tblPr>
-      <w:tblGrid>
-        <w:gridCol w:w="2880"/>
-        <w:gridCol w:w="2880"/>
-        <w:gridCol w:w="2880"/>
-      </w:tblGrid>
-      <w:tr>
-        <w:tc>
-          <w:tcPr>
-            <w:tcW w:type="dxa" w:w="2880"/>
-          </w:tcPr>
-          <w:p>
-            <w:r>
-              <w:t>Dimension</w:t>
-            </w:r>
-          </w:p>
-        </w:tc>
-        <w:tc>
-          <w:tcPr>
-            <w:tcW w:type="dxa" w:w="2880"/>
-          </w:tcPr>
-          <w:p>
-            <w:r>
-              <w:t>Score</w:t>
-            </w:r>
-          </w:p>
-        </w:tc>
-        <w:tc>
-          <w:tcPr>
-            <w:tcW w:type="dxa" w:w="2880"/>
-          </w:tcPr>
-          <w:p>
-            <w:r>
-              <w:t>Justification</w:t>
-            </w:r>
-          </w:p>
-        </w:tc>
-      </w:tr>
-      <w:tr>
-        <w:tc>
-          <w:tcPr>
-            <w:tcW w:type="dxa" w:w="2880"/>
-          </w:tcPr>
-          <w:p>
-            <w:r>
-              <w:t>**Presentation**</w:t>
-            </w:r>
-          </w:p>
-        </w:tc>
-        <w:tc>
-          <w:tcPr>
-            <w:tcW w:type="dxa" w:w="2880"/>
-          </w:tcPr>
-          <w:p>
-            <w:r>
-              <w:t>**3**</w:t>
-            </w:r>
-          </w:p>
-        </w:tc>
-        <w:tc>
-          <w:tcPr>
-            <w:tcW w:type="dxa" w:w="2880"/>
-          </w:tcPr>
-          <w:p>
-            <w:r>
-              <w:t>Motivation, Algorithm 1, and Figure 1 clearly explain QNF updates; related work positions MEow/Trust-PCL.</w:t>
-            </w:r>
-          </w:p>
-        </w:tc>
-      </w:tr>
-      <w:tr>
-        <w:tc>
-          <w:tcPr>
-            <w:tcW w:type="dxa" w:w="2880"/>
-          </w:tcPr>
-          <w:p>
-            <w:r>
-              <w:t>**Informativeness**</w:t>
-            </w:r>
-          </w:p>
-        </w:tc>
-        <w:tc>
-          <w:tcPr>
-            <w:tcW w:type="dxa" w:w="2880"/>
-          </w:tcPr>
-          <w:p>
-            <w:r>
-              <w:t>**2**</w:t>
-            </w:r>
-          </w:p>
-        </w:tc>
-        <w:tc>
-          <w:tcPr>
-            <w:tcW w:type="dxa" w:w="2880"/>
-          </w:tcPr>
-          <w:p>
-            <w:r>
-              <w:t>Unifies softmax policy with flows and useful \(\alpha\)-OLS/greedification; narrow benchmarks and no convergence theory.</w:t>
-            </w:r>
-          </w:p>
-        </w:tc>
-      </w:tr>
-      <w:tr>
-        <w:tc>
-          <w:tcPr>
-            <w:tcW w:type="dxa" w:w="2880"/>
-          </w:tcPr>
-          <w:p>
-            <w:r>
-              <w:t>**Soundness**</w:t>
-            </w:r>
-          </w:p>
-        </w:tc>
-        <w:tc>
-          <w:tcPr>
-            <w:tcW w:type="dxa" w:w="2880"/>
-          </w:tcPr>
-          <w:p>
-            <w:r>
-              <w:t>**2**</w:t>
-            </w:r>
-          </w:p>
-        </w:tc>
-        <w:tc>
-          <w:tcPr>
-            <w:tcW w:type="dxa" w:w="2880"/>
-          </w:tcPr>
-          <w:p>
-            <w:r>
-              <w:t>Design is plausible and ablations support choices; several tasks lag strong baselines; baseline tuning not fully harmonized.</w:t>
-            </w:r>
-          </w:p>
-        </w:tc>
-      </w:tr>
-    </w:tbl>
+    <w:p>
+      <w:r>
+        <w:t>| **Presentation** | **3** | Clear motivation, Algorithm 1, Fig. 1; related work covers MEow/Trust-PCL. |</w:t>
+      </w:r>
+    </w:p>
+    <w:p>
+      <w:r>
+        <w:t>| **Informativeness** | **2** | Useful Q-flow + autotune/greed; narrow benchmarks, no theory. |</w:t>
+      </w:r>
+    </w:p>
+    <w:p>
+      <w:r>
+        <w:t>| **Soundness** | **2** | Plausible design + ablations; multiple task losses to strong baselines; tuning fairness unclear. |</w:t>
+      </w:r>
+    </w:p>
     <w:p>
       <w:pPr>
-        <w:pStyle w:val="Heading3"/>
+        <w:pStyle w:val="Heading2"/>
       </w:pPr>
       <w:r>
         <w:t>Critical Strengths</w:t>
@@ -1437,62 +1212,22 @@
     </w:p>
     <w:p>
       <w:r>
-        <w:t xml:space="preserve">1. </w:t>
-      </w:r>
-      <w:r>
-        <w:rPr>
-          <w:b/>
-        </w:rPr>
-        <w:t>Clean conceptual unification.</w:t>
-      </w:r>
-      <w:r>
-        <w:t xml:space="preserve"> Representing the </w:t>
-      </w:r>
-      <w:r>
-        <w:rPr>
-          <w:b/>
-        </w:rPr>
-        <w:t>softmax policy as the generative model</w:t>
-      </w:r>
-      <w:r>
-        <w:t xml:space="preserve"> removes SAC-style separate policy-improvement regression while keeping standard off-policy TD machinery.</w:t>
+        <w:t>1. **Softmax-as-flow** removes separate policy-improvement head while keeping off-policy TD stack.</w:t>
       </w:r>
     </w:p>
     <w:p>
       <w:r>
-        <w:t xml:space="preserve">2. </w:t>
+        <w:t>2. **\(\alpha\) OLS autotune and greedification** with Fig. 4 ablations—practical response to fixed-\(\alpha\) sensitivity.</w:t>
       </w:r>
+    </w:p>
+    <w:p>
       <w:r>
-        <w:rPr>
-          <w:b/>
-        </w:rPr>
-        <w:t>Training mechanisms with ablations.</w:t>
-      </w:r>
-      <w:r>
-        <w:t xml:space="preserve"> </w:t>
-      </w:r>
-      <w:r>
-        <w:rPr>
-          <w:b/>
-        </w:rPr>
-        <w:t>\(\alpha\) OLS autotuning</w:t>
-      </w:r>
-      <w:r>
-        <w:t xml:space="preserve"> and </w:t>
-      </w:r>
-      <w:r>
-        <w:rPr>
-          <w:b/>
-        </w:rPr>
-        <w:t>greedification</w:t>
-      </w:r>
-      <w:r>
-        <w:t xml:space="preserve"> address fixed-\(\alpha\) sensitivity (Figure 4) and stagnation at \(\lambda=0\), with experiments matching the narrative.</w:t>
+        <w:t>3. **QMANSF** supported by intra-QNF comparison (Fig. 3).</w:t>
       </w:r>
     </w:p>
     <w:p>
       <w:pPr>
-        <w:pStyle w:val="Heading3"/>
+        <w:pStyle w:val="Heading2"/>
       </w:pPr>
       <w:r>
         <w:t>Critical Weaknesses</w:t>
@@ -1500,44 +1235,22 @@
     </w:p>
     <w:p>
       <w:r>
-        <w:t xml:space="preserve">1. </w:t>
-      </w:r>
-      <w:r>
-        <w:rPr>
-          <w:b/>
-        </w:rPr>
-        <w:t>Empirical claims exceed evidence.</w:t>
-      </w:r>
-      <w:r>
-        <w:t xml:space="preserve"> The abstract’s “similar to widely used actor-critic” is not supported on multiple reported tasks where </w:t>
-      </w:r>
-      <w:r>
-        <w:rPr>
-          <w:b/>
-        </w:rPr>
-        <w:t>CrossQ/SAC win</w:t>
-      </w:r>
-      <w:r>
-        <w:t>; missing wall-clock, broader benchmarks (sparse/high-dimensional), and statistical head-to-head tests at matched compute.</w:t>
+        <w:t>1. **Empirical claim stronger than tables:** SAC/CrossQ win important tasks; abstract “similar to widely used actor-critic” not justified.</w:t>
       </w:r>
     </w:p>
     <w:p>
       <w:r>
-        <w:t xml:space="preserve">2. </w:t>
+        <w:t>2. **Fairness / cost:** shared cross-env hyperparams, MEow origin tuning, stochastic-only eval; missing wall-time and matched-compute comparisons.</w:t>
       </w:r>
+    </w:p>
+    <w:p>
       <w:r>
-        <w:rPr>
-          <w:b/>
-        </w:rPr>
-        <w:t>Complexity and fairness.</w:t>
-      </w:r>
-      <w:r>
-        <w:t xml:space="preserve"> Flows add sampling/log-det cost and instability heuristics; comparisons use shared hyperparameters across envs and stochastic eval for all flows—fairness to tuned SAC/CrossQ and MEow is unclear.</w:t>
+        <w:t>3. **Exploration failures (hopper-stand)** limit claim of general continuous Q-learning replacement.</w:t>
       </w:r>
     </w:p>
     <w:p>
       <w:pPr>
-        <w:pStyle w:val="Heading3"/>
+        <w:pStyle w:val="Heading2"/>
       </w:pPr>
       <w:r>
         <w:t>Questions For Authors *</w:t>
@@ -1545,67 +1258,32 @@
     </w:p>
     <w:p>
       <w:r>
-        <w:t xml:space="preserve">1. On </w:t>
-      </w:r>
-      <w:r>
-        <w:rPr>
-          <w:b/>
-        </w:rPr>
-        <w:t>cheetah-run / walker-run / hopper-stand</w:t>
-      </w:r>
-      <w:r>
-        <w:t xml:space="preserve">, please report </w:t>
-      </w:r>
-      <w:r>
-        <w:rPr>
-          <w:b/>
-        </w:rPr>
-        <w:t>final IQM</w:t>
-      </w:r>
-      <w:r>
-        <w:t xml:space="preserve"> vs SAC/CrossQ at </w:t>
-      </w:r>
-      <w:r>
-        <w:rPr>
-          <w:b/>
-        </w:rPr>
-        <w:t>matched environment steps and wall-time</w:t>
-      </w:r>
-      <w:r>
-        <w:t>, with significance tests.</w:t>
+        <w:t>1. **cheetah-run / walker-run / hopper-stand:** final IQM vs SAC/CrossQ at **matched steps and wall-time** with significance tests?</w:t>
       </w:r>
     </w:p>
     <w:p>
       <w:r>
-        <w:t xml:space="preserve">2. Does performance rely on </w:t>
-      </w:r>
-      <w:r>
-        <w:rPr>
-          <w:b/>
-        </w:rPr>
-        <w:t>\(\alpha\)-OLS + greed</w:t>
-      </w:r>
-      <w:r>
-        <w:t xml:space="preserve"> specifically, or on the single-model parameterization? Ablate against a flow actor with SAC-style entropy tuning and no greed.</w:t>
+        <w:t>2. Ablate **flow + SAC-style entropy tuning without greed** vs full QNF—is gain from parameterization or from OLS/greed?</w:t>
       </w:r>
     </w:p>
     <w:p>
       <w:r>
-        <w:t xml:space="preserve">3. Will </w:t>
+        <w:t>3. Will **full hyperparameter tables + code** reproduce every baseline exactly (including SAC \(\alpha\) init and MEow tuning)?</w:t>
       </w:r>
+    </w:p>
+    <w:p>
       <w:r>
-        <w:rPr>
-          <w:b/>
-        </w:rPr>
-        <w:t>full hyperparameter tables and code</w:t>
+        <w:t>4. Deterministic-eval protocol for Gaussian baselines only—how much does stochastic eval change rankings?</w:t>
       </w:r>
+    </w:p>
+    <w:p>
       <w:r>
-        <w:t xml:space="preserve"> reproduce all baselines exactly (anonymous supplement claim)?</w:t>
+        <w:t>5. Any **bias** analysis for semi-gradient TD through flow density?</w:t>
       </w:r>
     </w:p>
     <w:p>
       <w:pPr>
-        <w:pStyle w:val="Heading3"/>
+        <w:pStyle w:val="Heading2"/>
       </w:pPr>
       <w:r>
         <w:t>Suggested overall</w:t>
@@ -1616,7 +1294,7 @@
         <w:pStyle w:val="ListBullet"/>
       </w:pPr>
       <w:r>
-        <w:t>**Recommendation:** Borderline Accept</w:t>
+        <w:t xml:space="preserve">**Recommendation:** Borderline Accept  </w:t>
       </w:r>
     </w:p>
     <w:p>
@@ -1627,18 +1305,79 @@
         <w:t>**Confidence:** 3</w:t>
       </w:r>
     </w:p>
-    <w:p/>
+    <w:p>
+      <w:r>
+        <w:t>————————————————————</w:t>
+      </w:r>
+    </w:p>
+    <w:p>
+      <w:pPr>
+        <w:pStyle w:val="Heading1"/>
+      </w:pPr>
+      <w:r>
+        <w:t>Extended review — 50972 (中文)</w:t>
+      </w:r>
+    </w:p>
     <w:p>
       <w:pPr>
         <w:pStyle w:val="Heading2"/>
       </w:pPr>
       <w:r>
-        <w:t>中文</w:t>
+        <w:t>方法概述</w:t>
+      </w:r>
+    </w:p>
+    <w:p>
+      <w:r>
+        <w:t>QNF 用 **normalizing flow** 直接表示 **熵正则策略**，等价于隐式 Q 的 softmax，省去 SAC 式 **actor 对 softmax 的回归**。训练：**soft TD** + 双 critic + target；flow 用 **semi-gradient TD**（非 Trust-PCL 全梯度）。**\(\alpha\)** 用 advantage 与 \(\log\pi\) 的 **OLS 闭式解** 自适应；**greedification（\(\lambda\)）** 在 TD 残差小时把策略推得更「冷」。</w:t>
       </w:r>
     </w:p>
     <w:p>
       <w:pPr>
-        <w:pStyle w:val="Heading3"/>
+        <w:pStyle w:val="Heading2"/>
+      </w:pPr>
+      <w:r>
+        <w:t>实验解读</w:t>
+      </w:r>
+    </w:p>
+    <w:p>
+      <w:r>
+        <w:t>8 个 DMC、500k 步、5 seed、IQM+CI。QNF 多任务 **有竞争力**，但在 **cheetah-run、walker-run** 等利用型任务上 **弱于 SAC/CrossQ**；**hopper-stand** 探索不足。Fig. 4 显示 **\(\alpha\)** 敏感，OLS 自动调 \(\alpha\) 有效；**\(\lambda\)** 过大可能崩溃。</w:t>
+      </w:r>
+    </w:p>
+    <w:p>
+      <w:pPr>
+        <w:pStyle w:val="Heading2"/>
+      </w:pPr>
+      <w:r>
+        <w:t>优缺点（扩展）</w:t>
+      </w:r>
+    </w:p>
+    <w:p>
+      <w:r>
+        <w:t xml:space="preserve">**优点：** 概念统一、算法图清晰；\(\alpha\)/\(\lambda\) 有消融；QMANSF 有架构对比。  </w:t>
+      </w:r>
+    </w:p>
+    <w:p>
+      <w:r>
+        <w:t>**缺点：** 摘要「与主流 actor-critic 相当」**证据不足**；跨环境共用超参、MEow 调参来源、缺 wall-time；hopper-stand 失败限制泛化 claim；无收敛理论。</w:t>
+      </w:r>
+    </w:p>
+    <w:p>
+      <w:r>
+        <w:t>————————————————————</w:t>
+      </w:r>
+    </w:p>
+    <w:p>
+      <w:pPr>
+        <w:pStyle w:val="Heading1"/>
+      </w:pPr>
+      <w:r>
+        <w:t>OpenReview paste-in — 50972 (中文)</w:t>
+      </w:r>
+    </w:p>
+    <w:p>
+      <w:pPr>
+        <w:pStyle w:val="Heading2"/>
       </w:pPr>
       <w:r>
         <w:t>AI 文档说明（可选）</w:t>
@@ -1646,21 +1385,12 @@
     </w:p>
     <w:p>
       <w:r>
-        <w:t>已读 15 页全文；英文自撰，中文 LLM 整理。倾向：</w:t>
-      </w:r>
-      <w:r>
-        <w:rPr>
-          <w:b/>
-        </w:rPr>
-        <w:t>边界接收</w:t>
-      </w:r>
-      <w:r>
-        <w:t>。</w:t>
+        <w:t>已读 15 页全文。倾向：**边界接收**。</w:t>
       </w:r>
     </w:p>
     <w:p>
       <w:pPr>
-        <w:pStyle w:val="Heading3"/>
+        <w:pStyle w:val="Heading2"/>
       </w:pPr>
       <w:r>
         <w:t>论文摘要 *</w:t>
@@ -1668,156 +1398,12 @@
     </w:p>
     <w:p>
       <w:r>
-        <w:t xml:space="preserve">本文提出 </w:t>
-      </w:r>
-      <w:r>
-        <w:rPr>
-          <w:b/>
-        </w:rPr>
-        <w:t>Q Normalizing Flows (QNF)</w:t>
-      </w:r>
-      <w:r>
-        <w:t xml:space="preserve">：用 </w:t>
-      </w:r>
-      <w:r>
-        <w:rPr>
-          <w:b/>
-        </w:rPr>
-        <w:t>normalizing flow</w:t>
-      </w:r>
-      <w:r>
-        <w:t xml:space="preserve"> 直接参数化 </w:t>
-      </w:r>
-      <w:r>
-        <w:rPr>
-          <w:b/>
-        </w:rPr>
-        <w:t>熵正则策略</w:t>
-      </w:r>
-      <w:r>
-        <w:t xml:space="preserve">，使策略密度 </w:t>
-      </w:r>
-      <w:r>
-        <w:rPr>
-          <w:b/>
-        </w:rPr>
-        <w:t>即为</w:t>
-      </w:r>
-      <w:r>
-        <w:t xml:space="preserve"> 隐式 \(Q\) 的 softmax（式 11–12），而非先学 \(Q(s,a)\) 再单独 actor 回归（SAC/MPO）。训练为 </w:t>
-      </w:r>
-      <w:r>
-        <w:rPr>
-          <w:b/>
-        </w:rPr>
-        <w:t>soft TD</w:t>
-      </w:r>
-      <w:r>
-        <w:t xml:space="preserve">、双 critic 与 target；flow 用 </w:t>
-      </w:r>
-      <w:r>
-        <w:rPr>
-          <w:b/>
-        </w:rPr>
-        <w:t>semi-gradient TD</w:t>
-      </w:r>
-      <w:r>
-        <w:t>（式 15），区别于 Trust-PCL 的 full gradient-TD。</w:t>
-      </w:r>
-      <w:r>
-        <w:rPr>
-          <w:b/>
-        </w:rPr>
-        <w:t>\(\alpha\)</w:t>
-      </w:r>
-      <w:r>
-        <w:t xml:space="preserve"> 通过对 \((\log\pi_\theta,\text{advantage})\) 的 </w:t>
-      </w:r>
-      <w:r>
-        <w:rPr>
-          <w:b/>
-        </w:rPr>
-        <w:t>OLS 闭式解</w:t>
-      </w:r>
-      <w:r>
-        <w:t>（式 17）自适应；</w:t>
-      </w:r>
-      <w:r>
-        <w:rPr>
-          <w:b/>
-        </w:rPr>
-        <w:t>greedification</w:t>
-      </w:r>
-      <w:r>
-        <w:t>（式 18–20，\(\lambda\)）在 TD 残差趋零时推向更冷 softmax。</w:t>
-      </w:r>
-      <w:r>
-        <w:rPr>
-          <w:b/>
-        </w:rPr>
-        <w:t>QMANSF</w:t>
-      </w:r>
-      <w:r>
-        <w:t xml:space="preserve"> 在 </w:t>
-      </w:r>
-      <w:r>
-        <w:rPr>
-          <w:b/>
-        </w:rPr>
-        <w:t>8 个 DMC</w:t>
-      </w:r>
-      <w:r>
-        <w:t xml:space="preserve"> 任务（500k 步、5 seed、IQM+CI）上对比 </w:t>
-      </w:r>
-      <w:r>
-        <w:rPr>
-          <w:b/>
-        </w:rPr>
-        <w:t>SAC、CrossQ、FMER、FPO、MEow</w:t>
-      </w:r>
-      <w:r>
-        <w:t xml:space="preserve">，并做 flow 与 \(\alpha\)/\(\lambda\) 消融。多任务 </w:t>
-      </w:r>
-      <w:r>
-        <w:rPr>
-          <w:b/>
-        </w:rPr>
-        <w:t>有竞争力</w:t>
-      </w:r>
-      <w:r>
-        <w:t xml:space="preserve">，但在 </w:t>
-      </w:r>
-      <w:r>
-        <w:rPr>
-          <w:b/>
-        </w:rPr>
-        <w:t>利用型</w:t>
-      </w:r>
-      <w:r>
-        <w:t xml:space="preserve">（cheetah-run、walker-run）与 </w:t>
-      </w:r>
-      <w:r>
-        <w:rPr>
-          <w:b/>
-        </w:rPr>
-        <w:t>弱探索</w:t>
-      </w:r>
-      <w:r>
-        <w:t xml:space="preserve">（hopper-stand）上 </w:t>
-      </w:r>
-      <w:r>
-        <w:rPr>
-          <w:b/>
-        </w:rPr>
-        <w:t>弱于</w:t>
-      </w:r>
-      <w:r>
-        <w:t xml:space="preserve"> SAC/CrossQ。仅限仿真、偏 dense reward。</w:t>
+        <w:t>（见英文 Summary 中文对应）QNF：flow 即 softmax 策略；semi-gradient soft TD；**\(\alpha\)** OLS 自适应；**greedification**。QMANSF 在 8 个 DMC 上对比 SAC/CrossQ 等。多任务有竞争力，利用型与 hopper-stand **弱于** 强基线。</w:t>
       </w:r>
     </w:p>
     <w:p>
       <w:pPr>
-        <w:pStyle w:val="Heading3"/>
+        <w:pStyle w:val="Heading2"/>
       </w:pPr>
       <w:r>
         <w:t>评分</w:t>
@@ -1825,152 +1411,32 @@
     </w:p>
     <w:p>
       <w:r>
+        <w:t>| 维度 | 分数 | 理由 |</w:t>
+      </w:r>
+    </w:p>
+    <w:p>
+      <w:r>
         <w:t>|------|------|------|</w:t>
       </w:r>
     </w:p>
-    <w:tbl>
-      <w:tblPr>
-        <w:tblStyle w:val="TableGrid"/>
-        <w:tblW w:type="auto" w:w="0"/>
-        <w:tblLook w:firstColumn="1" w:firstRow="1" w:lastColumn="0" w:lastRow="0" w:noHBand="0" w:noVBand="1" w:val="04A0"/>
-      </w:tblPr>
-      <w:tblGrid>
-        <w:gridCol w:w="2880"/>
-        <w:gridCol w:w="2880"/>
-        <w:gridCol w:w="2880"/>
-      </w:tblGrid>
-      <w:tr>
-        <w:tc>
-          <w:tcPr>
-            <w:tcW w:type="dxa" w:w="2880"/>
-          </w:tcPr>
-          <w:p>
-            <w:r>
-              <w:t>维度</w:t>
-            </w:r>
-          </w:p>
-        </w:tc>
-        <w:tc>
-          <w:tcPr>
-            <w:tcW w:type="dxa" w:w="2880"/>
-          </w:tcPr>
-          <w:p>
-            <w:r>
-              <w:t>分数</w:t>
-            </w:r>
-          </w:p>
-        </w:tc>
-        <w:tc>
-          <w:tcPr>
-            <w:tcW w:type="dxa" w:w="2880"/>
-          </w:tcPr>
-          <w:p>
-            <w:r>
-              <w:t>理由</w:t>
-            </w:r>
-          </w:p>
-        </w:tc>
-      </w:tr>
-      <w:tr>
-        <w:tc>
-          <w:tcPr>
-            <w:tcW w:type="dxa" w:w="2880"/>
-          </w:tcPr>
-          <w:p>
-            <w:r>
-              <w:t>**Presentation**</w:t>
-            </w:r>
-          </w:p>
-        </w:tc>
-        <w:tc>
-          <w:tcPr>
-            <w:tcW w:type="dxa" w:w="2880"/>
-          </w:tcPr>
-          <w:p>
-            <w:r>
-              <w:t>**3**</w:t>
-            </w:r>
-          </w:p>
-        </w:tc>
-        <w:tc>
-          <w:tcPr>
-            <w:tcW w:type="dxa" w:w="2880"/>
-          </w:tcPr>
-          <w:p>
-            <w:r>
-              <w:t>动机、算法与 Figure 1 清楚。</w:t>
-            </w:r>
-          </w:p>
-        </w:tc>
-      </w:tr>
-      <w:tr>
-        <w:tc>
-          <w:tcPr>
-            <w:tcW w:type="dxa" w:w="2880"/>
-          </w:tcPr>
-          <w:p>
-            <w:r>
-              <w:t>**Informativeness**</w:t>
-            </w:r>
-          </w:p>
-        </w:tc>
-        <w:tc>
-          <w:tcPr>
-            <w:tcW w:type="dxa" w:w="2880"/>
-          </w:tcPr>
-          <w:p>
-            <w:r>
-              <w:t>**2**</w:t>
-            </w:r>
-          </w:p>
-        </w:tc>
-        <w:tc>
-          <w:tcPr>
-            <w:tcW w:type="dxa" w:w="2880"/>
-          </w:tcPr>
-          <w:p>
-            <w:r>
-              <w:t>思路新、训练技巧有用，但 benchmark 窄、无收敛理论。</w:t>
-            </w:r>
-          </w:p>
-        </w:tc>
-      </w:tr>
-      <w:tr>
-        <w:tc>
-          <w:tcPr>
-            <w:tcW w:type="dxa" w:w="2880"/>
-          </w:tcPr>
-          <w:p>
-            <w:r>
-              <w:t>**Soundness**</w:t>
-            </w:r>
-          </w:p>
-        </w:tc>
-        <w:tc>
-          <w:tcPr>
-            <w:tcW w:type="dxa" w:w="2880"/>
-          </w:tcPr>
-          <w:p>
-            <w:r>
-              <w:t>**2**</w:t>
-            </w:r>
-          </w:p>
-        </w:tc>
-        <w:tc>
-          <w:tcPr>
-            <w:tcW w:type="dxa" w:w="2880"/>
-          </w:tcPr>
-          <w:p>
-            <w:r>
-              <w:t>方法合理；多任务落后强基线；基线调参对齐不充分。</w:t>
-            </w:r>
-          </w:p>
-        </w:tc>
-      </w:tr>
-    </w:tbl>
+    <w:p>
+      <w:r>
+        <w:t>| Presentation | **3** | 清楚。 |</w:t>
+      </w:r>
+    </w:p>
+    <w:p>
+      <w:r>
+        <w:t>| Informativeness | **2** | 思路新但 benchmark 窄。 |</w:t>
+      </w:r>
+    </w:p>
+    <w:p>
+      <w:r>
+        <w:t>| Soundness | **2** | 合理；基线对齐与算力对比不足。 |</w:t>
+      </w:r>
+    </w:p>
     <w:p>
       <w:pPr>
-        <w:pStyle w:val="Heading3"/>
+        <w:pStyle w:val="Heading2"/>
       </w:pPr>
       <w:r>
         <w:t>关键优点</w:t>
@@ -1978,35 +1444,22 @@
     </w:p>
     <w:p>
       <w:r>
-        <w:t xml:space="preserve">1. </w:t>
-      </w:r>
-      <w:r>
-        <w:rPr>
-          <w:b/>
-        </w:rPr>
-        <w:t>概念统一</w:t>
-      </w:r>
-      <w:r>
-        <w:t>：softmax 策略即生成模型，去掉 SAC 式独立 policy improvement，仍用标准 off-policy TD。</w:t>
+        <w:t xml:space="preserve">1. softmax 与 flow 统一，去掉独立 policy improvement。  </w:t>
       </w:r>
     </w:p>
     <w:p>
       <w:r>
-        <w:t xml:space="preserve">2. </w:t>
+        <w:t xml:space="preserve">2. \(\alpha\) OLS 与 greed 有 Fig. 4 支撑。  </w:t>
       </w:r>
+    </w:p>
+    <w:p>
       <w:r>
-        <w:rPr>
-          <w:b/>
-        </w:rPr>
-        <w:t>\(\alpha\) OLS 与 greedification</w:t>
-      </w:r>
-      <w:r>
-        <w:t xml:space="preserve"> 有 Figure 4 等消融支撑，针对固定 \(\alpha\) 敏感与 \(\lambda=0\) 停滞。</w:t>
+        <w:t>3. QMANSF 经 Fig. 3 论证。</w:t>
       </w:r>
     </w:p>
     <w:p>
       <w:pPr>
-        <w:pStyle w:val="Heading3"/>
+        <w:pStyle w:val="Heading2"/>
       </w:pPr>
       <w:r>
         <w:t>关键缺点</w:t>
@@ -2014,35 +1467,17 @@
     </w:p>
     <w:p>
       <w:r>
-        <w:t xml:space="preserve">1. </w:t>
-      </w:r>
-      <w:r>
-        <w:rPr>
-          <w:b/>
-        </w:rPr>
-        <w:t>实验不足以支撑「与主流 actor–critic 相当」</w:t>
-      </w:r>
-      <w:r>
-        <w:t>：多篇任务 SAC/CrossQ 更优；缺 wall-time、更广 benchmark 与同算力显著性检验。</w:t>
+        <w:t xml:space="preserve">1. 摘要表述强于实验（SAC/CrossQ 多任务更优）。  </w:t>
       </w:r>
     </w:p>
     <w:p>
       <w:r>
-        <w:t xml:space="preserve">2. </w:t>
-      </w:r>
-      <w:r>
-        <w:rPr>
-          <w:b/>
-        </w:rPr>
-        <w:t>复杂度高、对比难完全公平</w:t>
-      </w:r>
-      <w:r>
-        <w:t>：flow 更贵更不稳；跨环境共用超参、MEow 等基线来源不一。</w:t>
+        <w:t xml:space="preserve">2. 超参共用、缺 wall-time、探索任务失败。  </w:t>
       </w:r>
     </w:p>
     <w:p>
       <w:pPr>
-        <w:pStyle w:val="Heading3"/>
+        <w:pStyle w:val="Heading2"/>
       </w:pPr>
       <w:r>
         <w:t>给作者的问题 *</w:t>
@@ -2050,58 +1485,32 @@
     </w:p>
     <w:p>
       <w:r>
-        <w:t>1. cheetah-run / walker-run / hopper-stand：</w:t>
-      </w:r>
-      <w:r>
-        <w:rPr>
-          <w:b/>
-        </w:rPr>
-        <w:t>同步数、同 wall-time</w:t>
-      </w:r>
-      <w:r>
-        <w:t xml:space="preserve"> 下相对 SAC/CrossQ 的 </w:t>
-      </w:r>
-      <w:r>
-        <w:rPr>
-          <w:b/>
-        </w:rPr>
-        <w:t>最终 IQM 与显著性</w:t>
-      </w:r>
-      <w:r>
-        <w:t>？</w:t>
+        <w:t xml:space="preserve">1. 关键任务上同步数、同 wall-time 的 IQM 与显著性？  </w:t>
       </w:r>
     </w:p>
     <w:p>
       <w:r>
-        <w:t xml:space="preserve">2. 收益是否主要来自 </w:t>
-      </w:r>
-      <w:r>
-        <w:rPr>
-          <w:b/>
-        </w:rPr>
-        <w:t>\(\alpha\)-OLS + greed</w:t>
-      </w:r>
-      <w:r>
-        <w:t>，而非单模型参数化？能否 ablate flow + SAC 熵调、无 greed？</w:t>
+        <w:t xml:space="preserve">2. 消融：无 greed / SAC 式调熵？  </w:t>
       </w:r>
     </w:p>
     <w:p>
       <w:r>
-        <w:t xml:space="preserve">3. 是否公开 </w:t>
+        <w:t xml:space="preserve">3. 代码与超参能否精确复现 baseline？  </w:t>
       </w:r>
+    </w:p>
+    <w:p>
       <w:r>
-        <w:rPr>
-          <w:b/>
-        </w:rPr>
-        <w:t>完整超参与代码</w:t>
+        <w:t xml:space="preserve">4. 随机 eval 对排序影响？  </w:t>
       </w:r>
+    </w:p>
+    <w:p>
       <w:r>
-        <w:t xml:space="preserve"> 以精确复现各 baseline？</w:t>
+        <w:t>5. semi-gradient 偏差分析？</w:t>
       </w:r>
     </w:p>
     <w:p>
       <w:pPr>
-        <w:pStyle w:val="Heading3"/>
+        <w:pStyle w:val="Heading2"/>
       </w:pPr>
       <w:r>
         <w:t>建议总评</w:t>
@@ -2123,10 +1532,14 @@
         <w:t>**Confidence：** 3</w:t>
       </w:r>
     </w:p>
-    <w:p/>
     <w:p>
       <w:r>
-        <w:t>*Generated for reviewer paste-in. Adjust AI Documentation to match your actual AI use policy.*</w:t>
+        <w:t>————————————————————</w:t>
+      </w:r>
+    </w:p>
+    <w:p>
+      <w:r>
+        <w:t>*Document version: extended detail for local reading + OpenReview paste-in. Adjust AI Documentation to match your conference AI policy.*</w:t>
       </w:r>
     </w:p>
     <w:sectPr>
@@ -2503,7 +1916,7 @@
     <w:qFormat/>
     <w:rsid w:val="00FC693F"/>
     <w:rPr>
-      <w:rFonts w:ascii="Times New Roman" w:hAnsi="Times New Roman"/>
+      <w:rFonts w:ascii="Calibri" w:hAnsi="Calibri"/>
       <w:sz w:val="22"/>
     </w:rPr>
   </w:style>

</xml_diff>

<commit_message>
Reformat reviews to strict OpenReview field layout
Co-authored-by: Han Wang <202300300096@mail.sdu.edu.cn>
</commit_message>
<xml_diff>
--- a/reviews/ICLR2027_42504_50972_reviews.docx
+++ b/reviews/ICLR2027_42504_50972_reviews.docx
@@ -7,32 +7,22 @@
         <w:pStyle w:val="Title"/>
       </w:pPr>
       <w:r>
-        <w:t>ICLR 2027 Review Notes — Submissions 42504 &amp; 50972 (Extended + OpenReview Paste-In)</w:t>
+        <w:t>ICLR 2027 OpenReview Reviews — Submissions 42504 &amp; 50972</w:t>
       </w:r>
     </w:p>
     <w:p>
       <w:r>
-        <w:t>This document has two layers for each paper:</w:t>
+        <w:t xml:space="preserve">Copy each **English** or **中文** block below into the corresponding OpenReview fields.  </w:t>
       </w:r>
     </w:p>
     <w:p>
       <w:r>
-        <w:t>1. **Extended review** — background, method walkthrough, theorem intuition, empirical read, and positioning (for your own reading and discussion).</w:t>
+        <w:t>**Scales:** Presentation / Informativeness / Soundness are **1–3** (select the number in the form; rationale is in the table for your notes).</w:t>
       </w:r>
     </w:p>
     <w:p>
       <w:r>
-        <w:t>2. **OpenReview blocks** — shorter fields marked for copy-paste into OpenReview (Summary, Strengths, Weaknesses, Questions, 1–3 scores).</w:t>
-      </w:r>
-    </w:p>
-    <w:p>
-      <w:r>
-        <w:t>Scores use the **1–3** scale (Presentation / Informativeness / Soundness).</w:t>
-      </w:r>
-    </w:p>
-    <w:p>
-      <w:r>
-        <w:t>————————————————————</w:t>
+        <w:t>————————————————————————</w:t>
       </w:r>
     </w:p>
     <w:p>
@@ -48,393 +38,7 @@
         <w:pStyle w:val="Heading1"/>
       </w:pPr>
       <w:r>
-        <w:t>Extended review (English)</w:t>
-      </w:r>
-    </w:p>
-    <w:p>
-      <w:pPr>
-        <w:pStyle w:val="Heading2"/>
-      </w:pPr>
-      <w:r>
-        <w:t>1. What problem is this paper trying to solve?</w:t>
-      </w:r>
-    </w:p>
-    <w:p>
-      <w:r>
-        <w:t>Soft Actor-Critic (SAC) is the de facto off-policy algorithm for continuous control with entropy regularization. In code, each outer loop typically:</w:t>
-      </w:r>
-    </w:p>
-    <w:p>
-      <w:pPr>
-        <w:pStyle w:val="ListBullet"/>
-      </w:pPr>
-      <w:r>
-        <w:t>updates critics with soft Bellman / TD targets;</w:t>
-      </w:r>
-    </w:p>
-    <w:p>
-      <w:pPr>
-        <w:pStyle w:val="ListBullet"/>
-      </w:pPr>
-      <w:r>
-        <w:t>defines a **target policy** from the current Q-estimate (softmax / Gibbs form);</w:t>
-      </w:r>
-    </w:p>
-    <w:p>
-      <w:pPr>
-        <w:pStyle w:val="ListBullet"/>
-      </w:pPr>
-      <w:r>
-        <w:t>performs **one or a few** gradient steps on the actor to minimize reverse KL to that target—not a full convex projection.</w:t>
-      </w:r>
-    </w:p>
-    <w:p>
-      <w:r>
-        <w:t>Theory, by contrast, often assumes either (i) updates in **full policy space** with known critic (policy mirror descent, exponential convergence lines of work), or (ii) **direct policy gradient** with regularity that squashed Gaussians violate near action boundaries. This paper asks: *If we formalize SAC at the population level with a squashed Gaussian actor and a critic oracle, what finite-time guarantees can we prove when the target is either the classical Gibbs policy or a policy-mirror-descent (MD) target—and how do those targets differ for **tracking**?*</w:t>
-      </w:r>
-    </w:p>
-    <w:p>
-      <w:r>
-        <w:t>The contribution is **not** a new deep RL algorithm. It is a **mathematical model** of SAC-like training plus **comparative bounds** on target drift and actor tracking, culminating in a **best-iterate** \(O(N^{-1/5})\) rate (up to approximation error) when \(\lambda\) is tuned with \(N\).</w:t>
-      </w:r>
-    </w:p>
-    <w:p>
-      <w:pPr>
-        <w:pStyle w:val="Heading2"/>
-      </w:pPr>
-      <w:r>
-        <w:t>2. Setting and notation (compressed but precise)</w:t>
-      </w:r>
-    </w:p>
-    <w:p>
-      <w:pPr>
-        <w:pStyle w:val="ListBullet"/>
-      </w:pPr>
-      <w:r>
-        <w:t>**MDP:** infinite horizon, cost \(c\), discount \(\gamma\), actions \(A = (-1,1)^M\), entropy temperature \(\tau &gt; 0\).</w:t>
-      </w:r>
-    </w:p>
-    <w:p>
-      <w:pPr>
-        <w:pStyle w:val="ListBullet"/>
-      </w:pPr>
-      <w:r>
-        <w:t>**Regularized value** \(V_\tau^\pi(s)\): expected discounted cost minus \(\tau\) times per-state entropy of \(\pi(\cdot|s)\).</w:t>
-      </w:r>
-    </w:p>
-    <w:p>
-      <w:pPr>
-        <w:pStyle w:val="ListBullet"/>
-      </w:pPr>
-      <w:r>
-        <w:t>**Actor:** fixed diagonal covariance Gaussian in pre-tanh space, **linear mean** \(m_w(s) = x(s)^\top w\) (feature map \(x\)), then tanh push-forward to bounded actions. This matches the “Gaussian + squash” SAC parameterization at population level.</w:t>
-      </w:r>
-    </w:p>
-    <w:p>
-      <w:pPr>
-        <w:pStyle w:val="ListBullet"/>
-      </w:pPr>
-      <w:r>
-        <w:t>**Critic oracle:** at iteration \(n\), the learner receives \(\hat Q_n\) with uniform error \(\|\hat Q_n - Q_\tau^{\pi_{w_n}}\|_\infty \le \varepsilon_{\mathrm{crit}}\) (population, not mini-batch TD).</w:t>
-      </w:r>
-    </w:p>
-    <w:p>
-      <w:pPr>
-        <w:pStyle w:val="ListBullet"/>
-      </w:pPr>
-      <w:r>
-        <w:t>**Replay / occupancy:** state distribution \(\rho_n\) evolves (Definition 5 in paper); **concentrability** (Assumption 1) bounds mismatch between successive occupancies—standard in batch/off-policy theory.</w:t>
-      </w:r>
-    </w:p>
-    <w:p>
-      <w:pPr>
-        <w:pStyle w:val="ListBullet"/>
-      </w:pPr>
-      <w:r>
-        <w:t>**Actor step:** one projected gradient step with step size \(h\) on reverse KL objective \(J_n(w, \pi_n^{\mathrm{target}})\) toward the current target, with projection to ball \(B(R)\).</w:t>
-      </w:r>
-    </w:p>
-    <w:p>
-      <w:pPr>
-        <w:pStyle w:val="Heading2"/>
-      </w:pPr>
-      <w:r>
-        <w:t>3. The two targets (this is the conceptual core)</w:t>
-      </w:r>
-    </w:p>
-    <w:p>
-      <w:r>
-        <w:t xml:space="preserve">**Gibbs target (Eq. 4, “classical SAC soft policy”):**  </w:t>
-      </w:r>
-    </w:p>
-    <w:p>
-      <w:r>
-        <w:t>\(\pi_{n+1}^G(\cdot|s) \propto \exp(-\hat Q_n(s,\cdot)/\tau)\) (with appropriate base measure on \(A\)). This is the closed-form solution of the **one-step** entropy-regularized improvement problem when the critic is exact. In continuous actions the normalization constant is intractable in general, but the **gradient** of the actor objective still avoids needing \(Z_n(s)\) when defined carefully (paper’s SAC motivation).</w:t>
-      </w:r>
-    </w:p>
-    <w:p>
-      <w:r>
-        <w:t xml:space="preserve">**Mirror-descent target (Eq. 5):**  </w:t>
-      </w:r>
-    </w:p>
-    <w:p>
-      <w:r>
-        <w:t>A **proximal** update: \(\pi_{n+1}\) is the minimizer of a KL-regularized linear functional of \(\hat Q_n\) **anchored at the previous target** \(\pi_n\) (not at the current actor \(\pi_{w_n}\)). Step size / penalty \(\lambda\) controls how far the target moves per outer iteration. Intuitively:</w:t>
-      </w:r>
-    </w:p>
-    <w:p>
-      <w:pPr>
-        <w:pStyle w:val="ListBullet"/>
-      </w:pPr>
-      <w:r>
-        <w:t>Gibbs: each target is “fresh softmax of \(-\hat Q/\tau\)” — can jump when \(\hat Q\) or \(\rho_n\) changes.</w:t>
-      </w:r>
-    </w:p>
-    <w:p>
-      <w:pPr>
-        <w:pStyle w:val="ListBullet"/>
-      </w:pPr>
-      <w:r>
-        <w:t>MD: target chain \(\{\pi_n\}\) is **inertial**; large \(\lambda\) → aggressive improvement; small \(\lambda\) → slowly moving target.</w:t>
-      </w:r>
-    </w:p>
-    <w:p>
-      <w:r>
-        <w:t>**Why targets “change” at all:** the critic \(\hat Q_n\) changes as \(w_n\) and \(\rho_n\) change; the paper separates **target drift** (how fast \(\pi_n^{\mathrm{target}}\) moves) from **actor tracking error** (how well one KL gradient step follows that target).</w:t>
-      </w:r>
-    </w:p>
-    <w:p>
-      <w:pPr>
-        <w:pStyle w:val="Heading2"/>
-      </w:pPr>
-      <w:r>
-        <w:t>4. Curvature condition (Theorem 2) — what it means</w:t>
-      </w:r>
-    </w:p>
-    <w:p>
-      <w:r>
-        <w:t>The reverse-KL actor objective is generally **non-convex** in \(w\) because of tanh and because \(\hat Q\) enters through the target log-density. The paper introduces a **Legendre-type operator** \(T\) applied to \(\hat Q(s,\cdot)\) in action space and a scalar **curvature** \(R_{\hat Q}\) (sup of operator norms across states).</w:t>
-      </w:r>
-    </w:p>
-    <w:p>
-      <w:r>
-        <w:t>**Key condition:** \(R_{\hat Q}/2 &lt; \tau\).</w:t>
-      </w:r>
-    </w:p>
-    <w:p>
-      <w:r>
-        <w:t>When this holds on a ball of radius \(R\), the actor objective \(w \mapsto J_n(w, \pi_{n+1})\) is **strongly convex and smooth** with explicit constants \(\kappa\) and \(L\). Then a **single** gradient step analysis is tractable (like convex tracking).</w:t>
-      </w:r>
-    </w:p>
-    <w:p>
-      <w:r>
-        <w:t>**Interpretation:** entropy \(\tau\) must dominate “how bent” the critic looks along the squashed action map. Violating this matches Appendix/Figure 1 **orange** curves: training can fail or stall even with equal \(\varepsilon_{\mathrm{crit}}\).</w:t>
-      </w:r>
-    </w:p>
-    <w:p>
-      <w:r>
-        <w:t>**Gap for practitioners:** only **Fourier-linear critic** examples give checkable bounds on \(R_{\hat Q}\); for deep nets there is no recipe to verify or monitor this during training.</w:t>
-      </w:r>
-    </w:p>
-    <w:p>
-      <w:pPr>
-        <w:pStyle w:val="Heading2"/>
-      </w:pPr>
-      <w:r>
-        <w:t>5. Main results (prose)</w:t>
-      </w:r>
-    </w:p>
-    <w:p>
-      <w:r>
-        <w:t>| Result | Role |</w:t>
-      </w:r>
-    </w:p>
-    <w:p>
-      <w:r>
-        <w:t>|--------|------|</w:t>
-      </w:r>
-    </w:p>
-    <w:p>
-      <w:r>
-        <w:t>| **Theorem 1 (MD tracking)** | Bounds time-averaged actor suboptimality for MD target; drift enters through \(O(\lambda)\) target movement (Lemma 9) and \(1/\lambda\) terms from MD progress (trade-off). |</w:t>
-      </w:r>
-    </w:p>
-    <w:p>
-      <w:r>
-        <w:t>| **Corollary 1 (Gibbs tracking)** | Same tracking functional for Gibbs target; bound includes **non-vanishing \(1/\tau\)** piece even when replay changes slowly—actor cannot track arbitrarily closely purely by slowing data shift. |</w:t>
-      </w:r>
-    </w:p>
-    <w:p>
-      <w:r>
-        <w:t>| **Theorem 3 (best-iterate value gap)** | With \(\lambda = \Theta(N^{-4/5})\), \(h\) small enough, best iterate over \(N\) actor updates achieves \(V_\tau^{\pi_{w_r}}(\rho) - V_\tau^{\pi^*}(\rho) \le O(N^{-1/5} + \varepsilon_{\mathrm{approx}}(N))\). |</w:t>
-      </w:r>
-    </w:p>
-    <w:p>
-      <w:r>
-        <w:t>**Rate \(N^{-1/5}\):** slower than “nice” convex \(O(1/N)\) or exponential MD in tabular exact-critic settings; reflects **partial** actor steps + evolving target + approximation errors bundled into \(\varepsilon_{\mathrm{approx}}\).</w:t>
-      </w:r>
-    </w:p>
-    <w:p>
-      <w:r>
-        <w:t>**Figure 2 (Appendix K):** with **exact** critics on a toy MDP, average tracking error vs \(\lambda\): MD target (solid) vs Gibbs (dashed) at matched actor budgets \(n\). Gibbs error plateaus; MD error can shrink as \(\lambda \downarrow\) (at cost of slower MD policy improvement via \(1/\lambda\) in Theorem 1).</w:t>
-      </w:r>
-    </w:p>
-    <w:p>
-      <w:pPr>
-        <w:pStyle w:val="Heading2"/>
-      </w:pPr>
-      <w:r>
-        <w:t>6. Related work (how I place this paper)</w:t>
-      </w:r>
-    </w:p>
-    <w:p>
-      <w:pPr>
-        <w:pStyle w:val="ListBullet"/>
-      </w:pPr>
-      <w:r>
-        <w:t>**Policy MD / entropy RL (Lan; Ju &amp; Lan; Kerimkulov et al.):** exact or high-accuracy critic, updates in policy space—fast rates but not squashed Gaussian + partial steps.</w:t>
-      </w:r>
-    </w:p>
-    <w:p>
-      <w:pPr>
-        <w:pStyle w:val="ListBullet"/>
-      </w:pPr>
-      <w:r>
-        <w:t>**Parametric SAC analysis (Sherman, Alfano, Yuan, Agarwal lines):** closer to implementation but different objective/target choices; this paper explicitly compares **Gibbs vs MD target** under one actor formalism.</w:t>
-      </w:r>
-    </w:p>
-    <w:p>
-      <w:pPr>
-        <w:pStyle w:val="ListBullet"/>
-      </w:pPr>
-      <w:r>
-        <w:t>**Actor–critic with critic error (Labbi, Zorba et al.):** complementary; this work **fixes** critic error to \(\varepsilon_{\mathrm{crit}}\) and studies actor/target coupling.</w:t>
-      </w:r>
-    </w:p>
-    <w:p>
-      <w:r>
-        <w:t>**Novelty assessment:** incremental but real for **SAC theory**—first population guarantees for squashed Gaussian + one reverse-KL step + explicit **target-type comparison**. Less novel as a general RL algorithm paper.</w:t>
-      </w:r>
-    </w:p>
-    <w:p>
-      <w:pPr>
-        <w:pStyle w:val="Heading2"/>
-      </w:pPr>
-      <w:r>
-        <w:t>7. Experiments (what they actually show)</w:t>
-      </w:r>
-    </w:p>
-    <w:p>
-      <w:r>
-        <w:t>Appendix K only: tabular state, quadratic cost, affine transitions, **exact linear critic solve** + controlled perturbations to vary \(R_{\hat Q}\) at fixed \(\varepsilon_{\mathrm{crit}}\). Figure 1: value vs iterations when curvature condition satisfied (green) vs violated (orange). **No MuJoCo/DMC**, no neural nets, no validation of \(N^{-1/5}\) scaling in log-log plots.</w:t>
-      </w:r>
-    </w:p>
-    <w:p>
-      <w:pPr>
-        <w:pStyle w:val="Heading2"/>
-      </w:pPr>
-      <w:r>
-        <w:t>8. Extended strengths</w:t>
-      </w:r>
-    </w:p>
-    <w:p>
-      <w:r>
-        <w:t>1. **Implementation-aligned actor:** fixed-covariance squashed Gaussian + single projected reverse-KL step is exactly the fragile part of SAC omitted from policy-space MD proofs.</w:t>
-      </w:r>
-    </w:p>
-    <w:p>
-      <w:r>
-        <w:t>2. **Explicit Gibbs vs MD tracking dichotomy (Corollary 1):** the persistent \(1/\tau\) term is a derived contrast, not folklore; Figure 2 supports the mechanism on toy data.</w:t>
-      </w:r>
-    </w:p>
-    <w:p>
-      <w:r>
-        <w:t>3. **Curvature narrative links failure modes to \(\hat Q\) geometry** via Legendre operator—conceptually useful even if hard to test in deep RL.</w:t>
-      </w:r>
-    </w:p>
-    <w:p>
-      <w:r>
-        <w:t>4. **Clear \(\lambda\)–\(N\) trade-off** in Theorem 3 (\(\lambda \sim N^{-4/5}\)) for best-iterate value bound—rare explicit tuning exponent in SAC-like analyses.</w:t>
-      </w:r>
-    </w:p>
-    <w:p>
-      <w:r>
-        <w:t>5. **Writing quality:** assumptions numbered, algorithm box, proof roadmap in appendix—easy for theory readers to navigate 36 pages.</w:t>
-      </w:r>
-    </w:p>
-    <w:p>
-      <w:pPr>
-        <w:pStyle w:val="Heading2"/>
-      </w:pPr>
-      <w:r>
-        <w:t>9. Extended weaknesses</w:t>
-      </w:r>
-    </w:p>
-    <w:p>
-      <w:r>
-        <w:t>1. **Population critic oracle** hides TD bootstrapping, target networks, double Q, and non-stationary replay—main theorems are conditional on \(\varepsilon_{\mathrm{crit}}\), not on sample complexity.</w:t>
-      </w:r>
-    </w:p>
-    <w:p>
-      <w:r>
-        <w:t>2. **Single actor gradient step** vs standard SAC (often multiple actor updates per env step); no theorem for “\(K\) inner steps.”</w:t>
-      </w:r>
-    </w:p>
-    <w:p>
-      <w:r>
-        <w:t>3. **\(R_{\hat Q}/2 &lt; \tau\)** is strong and **unverifiable** for deep critics; experiments only show binary satisfy/violate on toy Fourier critics.</w:t>
-      </w:r>
-    </w:p>
-    <w:p>
-      <w:r>
-        <w:t>4. **MD target chain \(\pi_n\)** may not match every SAC codebase (some implementations implicitly define target from current actor or use separate slow-moving target networks on Q, not on policy MD chain).</w:t>
-      </w:r>
-    </w:p>
-    <w:p>
-      <w:r>
-        <w:t>5. **Part of MD advantage is definitional:** small \(\lambda\) ⇒ small KL proximal step ⇒ \(O(\lambda)\) drift—paper acknowledges via \(1/\lambda\) in Theorem 1 but could foreground how much is **design of Eq. (5)** vs inherent to entropy RL.</w:t>
-      </w:r>
-    </w:p>
-    <w:p>
-      <w:r>
-        <w:t>6. **Limited ICLR audience payoff:** no actionable hyperparameter rule beyond qualitative “small \(\lambda\) helps tracking”; \(N^{-1/5}\) is not sharp enough to guide wall-clock training.</w:t>
-      </w:r>
-    </w:p>
-    <w:p>
-      <w:pPr>
-        <w:pStyle w:val="Heading2"/>
-      </w:pPr>
-      <w:r>
-        <w:t>10. Recommendation rationale</w:t>
-      </w:r>
-    </w:p>
-    <w:p>
-      <w:pPr>
-        <w:pStyle w:val="ListBullet"/>
-      </w:pPr>
-      <w:r>
-        <w:t>**For RL theory subcommunity:** weak accept — fills a documented gap between SAC practice and MD theory.</w:t>
-      </w:r>
-    </w:p>
-    <w:p>
-      <w:pPr>
-        <w:pStyle w:val="ListBullet"/>
-      </w:pPr>
-      <w:r>
-        <w:t>**For general ICLR (empirical + systems):** borderline — no deep RL evidence, limited engineering takeaway.</w:t>
-      </w:r>
-    </w:p>
-    <w:p>
-      <w:r>
-        <w:t>————————————————————</w:t>
-      </w:r>
-    </w:p>
-    <w:p>
-      <w:pPr>
-        <w:pStyle w:val="Heading1"/>
-      </w:pPr>
-      <w:r>
-        <w:t>OpenReview paste-in — 42504 (English)</w:t>
+        <w:t>English</w:t>
       </w:r>
     </w:p>
     <w:p>
@@ -447,7 +51,7 @@
     </w:p>
     <w:p>
       <w:r>
-        <w:t>I read the full 36-page PDF. Extended notes above are for my own use; fields below are what I intend to paste. English is mine; Chinese section below uses LLM polish for paste-in. Pre-polish lean: **weak accept (theory) / borderline (broad ICLR)**.</w:t>
+        <w:t>I read the full 36-page submission PDF. I wrote the assessment below in English first. The Chinese section was produced with LLM assistance for paste-in only. My unedited tendency before polish: **weak accept** for RL theory readers; **borderline** for the broad ICLR empirical audience. Original one-sentence take: population-level SAC analysis with a useful Gibbs-vs-MD tracking comparison, but strong oracle/curvature assumptions and appendix-only experiments limit practical impact.</w:t>
       </w:r>
     </w:p>
     <w:p>
@@ -460,7 +64,17 @@
     </w:p>
     <w:p>
       <w:r>
-        <w:t>This paper analyzes a **population-level** SAC formalization: **fixed-covariance squashed Gaussian** actor (linear mean in pre-tanh space, tanh to \((-1,1)^M\)), **one projected reverse-KL gradient step** per outer iteration toward an evolving target, and a **critic oracle** \(\hat Q_n\) with \(\|\hat Q_n - Q_\tau^{\pi_{w_n}}\|_\infty \le \varepsilon_{\mathrm{crit}}\). Targets are either the **Gibbs** policy \(\propto \exp(-\hat Q_n/\tau)\) (Eq. 4) or a **policy mirror-descent** target (Eq. 5) with step \(\lambda\), where the MD chain \(\{\pi_n\}\) updates from the **previous target** (not the current actor \(\pi_{w_n}\)). Under concentrability and **Legendre-operator curvature** \(R_{\hat Q}/2 &lt; \tau\), the authors prove the actor KL objective is strongly convex/smooth on \(B(R)\), bound **target drift** and **tracking error**, and obtain **best-iterate** regularized value gap \(O(N^{-1/5})\) (plus \(\varepsilon_{\mathrm{approx}}\)) when \(\lambda = \Theta(N^{-4/5})\). **Corollary 1:** Gibbs tracking retains a **non-vanishing \(1/\tau\)** term; MD drift is **\(\lambda\)-controlled**. Appendix toy MDP (exact critics) shows failure when curvature is violated (Fig. 1) and tracking MD vs Gibbs vs \(\lambda\) (Fig. 2).</w:t>
+        <w:t>This paper studies **Soft Actor-Critic (SAC)** at the **population** level: a **fixed-covariance squashed Gaussian** actor (linear mean in pre-tanh space, tanh map to bounded actions), **one projected reverse-KL gradient step** per outer iteration toward an evolving target policy, and a **critic oracle** \(\hat Q_n\) satisfying \(\|\hat Q_n - Q_\tau^{\pi_{w_n}}\|_\infty \le \varepsilon_{\mathrm{crit}}\). The authors compare two target constructions that appear in entropy-regularized policy improvement: the classical **Gibbs** target (softmax of \(-\hat Q_n/\tau\), Eq. (4)) and a **policy mirror descent (MD)** target (Eq. (5)) with proximal step \(\lambda\), where the MD chain \(\{\pi_n\}\) is updated from the **previous target** rather than from the current actor parameters \(\pi_{w_n}\).</w:t>
+      </w:r>
+    </w:p>
+    <w:p>
+      <w:r>
+        <w:t>Under **concentrability** of the optimal occupancy measure (Assumption 1) and a **Legendre-operator curvature** condition on the critic, \(R_{\hat Q}/2 &lt; \tau\) (Theorem 2), the reverse-KL actor objective is **strongly convex and smooth** on a parameter ball \(B(R)\). The analysis then separates **target drift** (how fast the target moves when \(\hat Q_n\) and replay distribution evolve) from **actor tracking error** (suboptimality after a single gradient step). For the MD target, Lemma 9 gives **\(O(\lambda)\)** drift of optimal actor parameters across iterations, while Theorem 1 balances this against **\(1/\lambda\)** terms reflecting MD policy improvement progress. **Corollary 1** is the central comparison for the **Gibbs** target: the tracking bound includes a **non-vanishing \(1/\tau\)** contribution, so the actor cannot track the Gibbs target arbitrarily closely even when data shift is slow. For MD targets, **\(\lambda\)** explicitly trades slower target motion (easier tracking) against slower implicit policy improvement.</w:t>
+      </w:r>
+    </w:p>
+    <w:p>
+      <w:r>
+        <w:t>The main finite-time result (**Theorem 3**) shows a **best-iterate** regularized value gap \(V_\tau^{\pi_{w_r}}(\rho) - V_\tau^{\pi^*}(\rho) \le O(N^{-1/5} + \varepsilon_{\mathrm{approx}}(N))\) over \(N\) actor updates when \(\lambda = \Theta(N^{-4/5})\) and the actor step size \(h\) is small enough relative to \(\tau\) and \(R_{\hat Q}\). Approximation error aggregates critic oracle error and actor projection error. Appendix experiments on a **solvable tabular MDP** with **exact critics** (Appendix K) illustrate that violating \(R_{\hat Q}/2 &lt; \tau\) degrades learning (Figure 1) and that MD vs Gibbs **tracking error** scales differently with \(\lambda\) at fixed actor budget (Figure 2). The paper does **not** validate the \(N^{-1/5}\) rate on deep RL benchmarks.</w:t>
       </w:r>
     </w:p>
     <w:p>
@@ -468,32 +82,68 @@
         <w:pStyle w:val="Heading2"/>
       </w:pPr>
       <w:r>
-        <w:t>Ratings</w:t>
+        <w:t>Presentation</w:t>
       </w:r>
     </w:p>
     <w:p>
       <w:r>
-        <w:t>| Dimension | Score | Justification |</w:t>
+        <w:t>| Score (1–3) | **3** |</w:t>
       </w:r>
     </w:p>
     <w:p>
       <w:r>
-        <w:t>|-----------|-------|---------------|</w:t>
+        <w:t>|-------------|-------|</w:t>
       </w:r>
     </w:p>
     <w:p>
       <w:r>
-        <w:t>| **Presentation** | **3** | Clear algorithm/assumption/theorem map; heavy but organized. |</w:t>
+        <w:t>| **Justification** | The SAC-like algorithm, assumptions, and main theorems (tracking lemmas, Corollary 1, Theorem 3) are mapped clearly; notation is heavy but signposted. Related work separates policy-space MD from parametric SAC. |</w:t>
+      </w:r>
+    </w:p>
+    <w:p>
+      <w:pPr>
+        <w:pStyle w:val="Heading2"/>
+      </w:pPr>
+      <w:r>
+        <w:t>Informativeness</w:t>
       </w:r>
     </w:p>
     <w:p>
       <w:r>
-        <w:t>| **Informativeness** | **2** | Valuable SAC theory niche; no deep RL validation or verifiable curvature in practice. |</w:t>
+        <w:t>| Score (1–3) | **2** |</w:t>
       </w:r>
     </w:p>
     <w:p>
       <w:r>
-        <w:t>| **Soundness** | **2** | Coherent proof program under strong oracle/geometry assumptions; no sampling/TD dynamics. |</w:t>
+        <w:t>|-------------|-------|</w:t>
+      </w:r>
+    </w:p>
+    <w:p>
+      <w:r>
+        <w:t>| **Justification** | Meaningful for readers who care about **theory for practical SAC parametrization** and **target design** (Gibbs vs MD tracking). Value is narrower for the general ICLR community because there is no deep RL validation and curvature is hard to verify in practice. |</w:t>
+      </w:r>
+    </w:p>
+    <w:p>
+      <w:pPr>
+        <w:pStyle w:val="Heading2"/>
+      </w:pPr>
+      <w:r>
+        <w:t>Soundness</w:t>
+      </w:r>
+    </w:p>
+    <w:p>
+      <w:r>
+        <w:t>| Score (1–3) | **2** |</w:t>
+      </w:r>
+    </w:p>
+    <w:p>
+      <w:r>
+        <w:t>|-------------|-------|</w:t>
+      </w:r>
+    </w:p>
+    <w:p>
+      <w:r>
+        <w:t>| **Justification** | The proof program (strong convexity → tracking → value gap) appears coherent under stated assumptions. Claims are **conditional** on population critic oracle, single exact projected actor step, and global curvature; finite-sample TD, target networks on Q, and multi-step actor updates are not analyzed. |</w:t>
       </w:r>
     </w:p>
     <w:p>
@@ -506,17 +156,22 @@
     </w:p>
     <w:p>
       <w:r>
-        <w:t>1. **Population SAC with partial KL steps** linked to explicit **\(O(N^{-1/5})\)** best-iterate rate and \(\lambda \sim N^{-4/5}\) tuning (Theorem 3).</w:t>
+        <w:t>1. **Implementation-aligned actor model.** Fixed-covariance squashed Gaussian plus **one reverse-KL gradient step** per iteration matches a core gap between policy-space mirror descent theory and deployed SAC, rather than analyzing an abstract policy-class update.</w:t>
       </w:r>
     </w:p>
     <w:p>
       <w:r>
-        <w:t>2. **Quantitative Gibbs vs MD tracking** (Corollary 1, Lemma 9, Fig. 2): **\(1/\tau\)** persistence vs **\(\lambda\)-controlled** target drift—relevant to proximal soft targets.</w:t>
+        <w:t>2. **Explicit best-iterate rate with tuning guidance.** Theorem 3 gives **\(O(N^{-1/5})\)** (up to \(\varepsilon_{\mathrm{approx}}\)) with **\(\lambda = \Theta(N^{-4/5})\)**, making the actor–target timescale trade-off concrete for theory readers.</w:t>
       </w:r>
     </w:p>
     <w:p>
       <w:r>
-        <w:t>3. **Curvature condition** \(R_{\hat Q}/2 &lt; \tau\) explains when reverse-KL actor subproblem is well-conditioned (Theorem 2), with toy ablation at fixed \(\varepsilon_{\mathrm{crit}}\).</w:t>
+        <w:t>3. **Derived Gibbs vs MD tracking distinction.** Corollary 1’s **persistent \(1/\tau\)** term versus **\(\lambda\)-controlled** MD drift is not merely definitional; Lemma 9 and Figure 2 support the mechanism on a controlled MDP with exact critics.</w:t>
+      </w:r>
+    </w:p>
+    <w:p>
+      <w:r>
+        <w:t>4. **Curvature condition tied to failure modes.** Theorem 2 links \(R_{\hat Q}/2 &lt; \tau\) to strong convexity of the actor subproblem; Appendix K ablations at matched \(\varepsilon_{\mathrm{crit}}\) show qualitatively different behavior when the condition fails (Figure 1).</w:t>
       </w:r>
     </w:p>
     <w:p>
@@ -529,17 +184,27 @@
     </w:p>
     <w:p>
       <w:r>
-        <w:t>1. **Conditional for deep SAC:** oracle critic, one exact projected actor step, uncheckable global \(R_{\hat Q}\); no realistic env validation of rate or constants.</w:t>
+        <w:t>1. **Population critic oracle.** Uniform \(\varepsilon_{\mathrm{crit}}\) bounds omit TD bootstrapping, stochastic replay, double critics, and critic target networks—so the main theorems are not directly about standard deep SAC training dynamics.</w:t>
       </w:r>
     </w:p>
     <w:p>
       <w:r>
-        <w:t>2. **MD benefits partly encoded in Eq. (5):** \(O(\lambda)\) drift vs \(1/\lambda\) improvement trade-off should be disentangled from “intrinsic” Gibbs difficulty; \(\pi_n\) chain may not match all SAC implementations.</w:t>
+        <w:t>2. **Uncheckable curvature in deep settings.** \(R_{\hat Q}\) is a global supremum over states and actions; constructive examples are mainly **linear Fourier critics** (Remark 1). No recipe to monitor or enforce \(R_{\hat Q}/2 &lt; \tau\) for ReLU/deep \(\hat Q\).</w:t>
       </w:r>
     </w:p>
     <w:p>
       <w:r>
-        <w:t>3. **Audience fit:** 36-page theory with appendix-only experiments may under-deliver for empirical ICLR expectations.</w:t>
+        <w:t>3. **Single actor step vs practice.** Standard SAC often performs multiple actor updates per environment step or critic update; the paper does not quantify how inner-loop steps change Theorem 3.</w:t>
+      </w:r>
+    </w:p>
+    <w:p>
+      <w:r>
+        <w:t>4. **Target chain vs codebases.** The MD target chain \(\pi_n\) in Eq. (5) may not align with every SAC implementation (e.g., actor-defined targets, slow-moving Q targets only). The incremental insight over “proximal targets move slowly” should be stated more sharply relative to Eq. (5)’s **\(1/\lambda\)** KL penalty.</w:t>
+      </w:r>
+    </w:p>
+    <w:p>
+      <w:r>
+        <w:t>5. **Limited empirical support for rates.** Appendix-only toy experiments demonstrate qualitative curvature and tracking phenomena but do not estimate the **\(N^{-1/5}\)** scaling or transfer to high-dimensional control.</w:t>
       </w:r>
     </w:p>
     <w:p>
@@ -552,27 +217,40 @@
     </w:p>
     <w:p>
       <w:r>
-        <w:t>1. **Checkable conditions** (architecture, regularization, online estimators) for \(R_{\hat Q}/2 &lt; \tau\) w.h.p. during learning?</w:t>
+        <w:t>1. Can you state **checkable sufficient conditions** (architecture, weight decay, Lipschitz bounds, or online estimates) under which \(R_{\hat Q}/2 &lt; \tau\) holds with high probability during learning for non-Fourier critics?</w:t>
       </w:r>
     </w:p>
     <w:p>
       <w:r>
-        <w:t>2. **Multiple actor steps** per critic update: can Theorem 3 extend with an inner-loop factor \(K\)?</w:t>
+        <w:t>2. How do the tracking and value-gap bounds change if the actor takes **\(K&gt;1\)** projected gradient steps per critic update (as in common SAC schedules)? Is there a target **\(K\)**–\(N\) scaling analogous to \(\lambda\)–\(N\)?</w:t>
       </w:r>
     </w:p>
     <w:p>
       <w:r>
-        <w:t>3. **Joint stochastic actor–critic:** any path to replace \(\varepsilon_{\mathrm{crit}}\) with sample complexity?</w:t>
+        <w:t>3. What is the path to replace the **critic oracle** with a sample-complexity guarantee for TD learning with function approximation, even in a simplified linear setting?</w:t>
       </w:r>
     </w:p>
     <w:p>
       <w:r>
-        <w:t>4. In Fig. 2, how much of the MD–Gibbs gap remains if Gibbs targets are **slowed** (e.g., target network on Q) to match effective drift of small \(\lambda\)?</w:t>
+        <w:t>4. In Figure 2, if one **slows the Gibbs target** artificially (e.g., exponential moving average on \(\hat Q\) or a target network) to match the effective drift of small \(\lambda\), how much of the MD advantage remains?</w:t>
       </w:r>
     </w:p>
     <w:p>
       <w:r>
-        <w:t>5. Can you report **log-log** empirical convergence rates on the toy MDP to compare with \(N^{-1/5}\)?</w:t>
+        <w:t>5. Can you add **log–log plots** of best-iterate value gap vs \(N\) on Appendix K to compare empirically with the **\(N^{-1/5}\)** exponent?</w:t>
+      </w:r>
+    </w:p>
+    <w:p>
+      <w:r>
+        <w:t>————————————————————————</w:t>
+      </w:r>
+    </w:p>
+    <w:p>
+      <w:pPr>
+        <w:pStyle w:val="Heading1"/>
+      </w:pPr>
+      <w:r>
+        <w:t>中文</w:t>
       </w:r>
     </w:p>
     <w:p>
@@ -580,138 +258,12 @@
         <w:pStyle w:val="Heading2"/>
       </w:pPr>
       <w:r>
-        <w:t>Suggested overall</w:t>
-      </w:r>
-    </w:p>
-    <w:p>
-      <w:pPr>
-        <w:pStyle w:val="ListBullet"/>
-      </w:pPr>
-      <w:r>
-        <w:t>**Recommendation:** Weak Accept (theory) / Borderline (general ICLR)</w:t>
-      </w:r>
-    </w:p>
-    <w:p>
-      <w:pPr>
-        <w:pStyle w:val="ListBullet"/>
-      </w:pPr>
-      <w:r>
-        <w:t>**Confidence:** 3</w:t>
+        <w:t>AI 文档说明（可选；作者不可见）</w:t>
       </w:r>
     </w:p>
     <w:p>
       <w:r>
-        <w:t>————————————————————</w:t>
-      </w:r>
-    </w:p>
-    <w:p>
-      <w:pPr>
-        <w:pStyle w:val="Heading1"/>
-      </w:pPr>
-      <w:r>
-        <w:t>Extended review — 42504 (中文)</w:t>
-      </w:r>
-    </w:p>
-    <w:p>
-      <w:pPr>
-        <w:pStyle w:val="Heading2"/>
-      </w:pPr>
-      <w:r>
-        <w:t>1. 问题与动机</w:t>
-      </w:r>
-    </w:p>
-    <w:p>
-      <w:r>
-        <w:t>SAC 在连续控制中广泛使用，但理论常假设 policy 空间更新或光滑 policy gradient，而实现上是 **tanh 压扁高斯 + 每轮仅少量 reverse-KL 步**。本文在 **population** 层面对齐这一实现，并比较两类 **target**：经典 **Gibbs**（\(\exp(-\hat Q/\tau)\)）与 **policy mirror descent**（式 (5)，步长 \(\lambda\)），研究 **target 漂移** 与 **actor tracking** 如何影响有限步收敛。</w:t>
-      </w:r>
-    </w:p>
-    <w:p>
-      <w:pPr>
-        <w:pStyle w:val="Heading2"/>
-      </w:pPr>
-      <w:r>
-        <w:t>2. 两类 target 为何不同</w:t>
-      </w:r>
-    </w:p>
-    <w:p>
-      <w:pPr>
-        <w:pStyle w:val="ListBullet"/>
-      </w:pPr>
-      <w:r>
-        <w:t>**Gibbs**：每步从当前 \(\hat Q_n\) 重新做 softmax，\(\hat Q\) 或 occupancy 一变，target 可跳变；tracking 界中出现 **不随迭代消失的 \(1/\tau\)**（推论 1）。</w:t>
-      </w:r>
-    </w:p>
-    <w:p>
-      <w:pPr>
-        <w:pStyle w:val="ListBullet"/>
-      </w:pPr>
-      <w:r>
-        <w:t>**MD**：target 链 \(\pi_{n+1}\) 由 **上一 target** 经 KL  proximal 更新得到；**\(\lambda\) 小**则 target 动得慢，actor 更易跟踪，但 MD 本身 policy improvement 变慢（定理 1 中 **\(1/\lambda\)** 项）。</w:t>
-      </w:r>
-    </w:p>
-    <w:p>
-      <w:pPr>
-        <w:pStyle w:val="Heading2"/>
-      </w:pPr>
-      <w:r>
-        <w:t>3. 曲率条件</w:t>
-      </w:r>
-    </w:p>
-    <w:p>
-      <w:r>
-        <w:t>**\(R_{\hat Q}/2 &lt; \tau\)** 时 reverse-KL actor 子问题在 \(B(R)\) 上强凸/光滑，才能分析 **单步** 梯度跟踪。深度 critic 难以验证；附录仅 Fourier 线性 critic 有例。图 1 在固定 \(\varepsilon_{\mathrm{crit}}\) 下比较满足/违反曲率。</w:t>
-      </w:r>
-    </w:p>
-    <w:p>
-      <w:pPr>
-        <w:pStyle w:val="Heading2"/>
-      </w:pPr>
-      <w:r>
-        <w:t>4. 主结论与实验</w:t>
-      </w:r>
-    </w:p>
-    <w:p>
-      <w:r>
-        <w:t>定理 3：**best-iterate** 值差距 **\(O(N^{-1/5})\)**（加逼近误差），取 **\(\lambda=\Theta(N^{-4/5})\)**。实验仅在可精确解 critic 的玩具 MDP（附录 K），**无** 深度 RL。</w:t>
-      </w:r>
-    </w:p>
-    <w:p>
-      <w:pPr>
-        <w:pStyle w:val="Heading2"/>
-      </w:pPr>
-      <w:r>
-        <w:t>5. 贡献强弱判断</w:t>
-      </w:r>
-    </w:p>
-    <w:p>
-      <w:r>
-        <w:t>对 **SAC 理论** 有填补；对 **广义 ICLR** 工程启示有限。MD 相对 Gibbs 的部分优势来自 **target 定义** 与 \(\lambda\) 权衡，作者应更明确增量 novelty。</w:t>
-      </w:r>
-    </w:p>
-    <w:p>
-      <w:r>
-        <w:t>————————————————————</w:t>
-      </w:r>
-    </w:p>
-    <w:p>
-      <w:pPr>
-        <w:pStyle w:val="Heading1"/>
-      </w:pPr>
-      <w:r>
-        <w:t>OpenReview paste-in — 42504 (中文)</w:t>
-      </w:r>
-    </w:p>
-    <w:p>
-      <w:pPr>
-        <w:pStyle w:val="Heading2"/>
-      </w:pPr>
-      <w:r>
-        <w:t>AI 文档说明（可选）</w:t>
-      </w:r>
-    </w:p>
-    <w:p>
-      <w:r>
-        <w:t>已读 36 页全文；上文为扩展笔记。以下为拟粘贴字段。英文本人撰写；中文 LLM 整理。</w:t>
+        <w:t>已阅读投稿全文（36 页）。英文评估为本人撰写；中文部分由 LLM 整理便于粘贴。润色前倾向：**弱接收**（RL 理论）；**边界**（广义 ICLR）。原话要点：population SAC + Gibbs/MD tracking 对照有贡献，但 oracle/曲率假设强、仅附录玩具实验，工程启示有限。</w:t>
       </w:r>
     </w:p>
     <w:p>
@@ -724,7 +276,17 @@
     </w:p>
     <w:p>
       <w:r>
-        <w:t>（同英文 Summary 之中文对应，略长版）population SAC：固定协方差 tanh 高斯 actor、每轮 **一步** 投影 reverse-KL、critic **oracle** \(\varepsilon_{\mathrm{crit}}\)。Target 为 **Gibbs**（式 4）或 **MD**（式 5，\(\lambda\)，链 \(\{\pi_n\}\) 由上一 target 递推）。在 concentrability 与 **\(R_{\hat Q}/2&lt;\tau\)** 下，证明 actor 目标强凸/光滑，控制漂移与 tracking，**\(\lambda=\Theta(N^{-4/5})\)** 时 **best-iterate** 差距 **\(O(N^{-1/5})\)**。推论 1：Gibbs tracking 含 **\(1/\tau\)** 残留；MD 由 **\(\lambda\)** 控漂移。附录玩具 MDP 验证曲率与 Fig. 2 tracking。</w:t>
+        <w:t>本文在 **population** 设定下分析 **Soft Actor-Critic (SAC)**：actor 为 **固定协方差 tanh 压扁高斯**（预 tanh 空间线性均值），每轮外层迭代对 evolving target 仅做 **一步** 投影 **reverse-KL** 梯度；critic 为 **oracle** \(\hat Q_n\)，满足 \(\|\hat Q_n - Q_\tau^{\pi_{w_n}}\|_\infty \le \varepsilon_{\mathrm{crit}}\)。比较两类 target：**Gibbs**（\(\propto \exp(-\hat Q_n/\tau)\)，式 (4)）与 **policy mirror descent**（式 (5)，步长 \(\lambda\)），其中 MD 链 \(\{\pi_n\}\) 由 **上一 target** 递推（非当前 actor \(\pi_{w_n}\)）。</w:t>
+      </w:r>
+    </w:p>
+    <w:p>
+      <w:r>
+        <w:t>在 **concentrability**（假设 1）与 **Legendre 算子曲率** \(R_{\hat Q}/2 &lt; \tau\)（定理 2）下，reverse-KL actor 目标在 \(B(R)\) 上 **强凸/光滑**。分析区分 **target 漂移** 与 **actor tracking 误差**。MD target 下引理 9 给出最优 actor 参数的 **\(O(\lambda)\)** 漂移；定理 1 与 **\(1/\lambda\)** 的 MD 改进项权衡。**推论 1** 对 **Gibbs** target：tracking 界含 **不消失的 \(1/\tau\)**，即使数据分布变化慢，actor 也无法任意精确跟踪 Gibbs target；MD 则可通过 **\(\lambda\)** 放慢 target。</w:t>
+      </w:r>
+    </w:p>
+    <w:p>
+      <w:r>
+        <w:t>**定理 3**：在 \(\lambda=\Theta(N^{-4/5})\) 及适当 \(h\) 下，\(N\) 次 actor 更新存在 **best-iterate** 正则化值差距 **\(O(N^{-1/5}+\varepsilon_{\mathrm{approx}}(N))\)**。附录 K **可精确解 critic 的表格 MDP** 上，违反曲率条件时学习退化（图 1）；图 2 比较 MD/Gibbs 的 tracking 随 \(\lambda\) 变化。**无**深度 RL 上对 **\(N^{-1/5}\)** 率的验证。</w:t>
       </w:r>
     </w:p>
     <w:p>
@@ -732,32 +294,22 @@
         <w:pStyle w:val="Heading2"/>
       </w:pPr>
       <w:r>
-        <w:t>评分</w:t>
+        <w:t>Presentation（呈现）</w:t>
       </w:r>
     </w:p>
     <w:p>
       <w:r>
-        <w:t>| 维度 | 分数 | 理由 |</w:t>
+        <w:t>| 分数 (1–3) | **3** |</w:t>
       </w:r>
     </w:p>
     <w:p>
       <w:r>
-        <w:t>|------|------|------|</w:t>
+        <w:t>|------------|-------|</w:t>
       </w:r>
     </w:p>
     <w:p>
       <w:r>
-        <w:t>| Presentation | **3** | 结构清晰。 |</w:t>
-      </w:r>
-    </w:p>
-    <w:p>
-      <w:r>
-        <w:t>| Informativeness | **2** | 理论受众窄；缺深度 RL。 |</w:t>
-      </w:r>
-    </w:p>
-    <w:p>
-      <w:r>
-        <w:t>| Soundness | **2** | 强假设下证明完整感强；无 TD/采样。 |</w:t>
+        <w:t>| **理由** | 算法、假设与定理（tracking、推论 1、定理 3）对应清楚；符号虽重但有指引。 |</w:t>
       </w:r>
     </w:p>
     <w:p>
@@ -765,22 +317,22 @@
         <w:pStyle w:val="Heading2"/>
       </w:pPr>
       <w:r>
-        <w:t>关键优点</w:t>
+        <w:t>Informativeness（信息量）</w:t>
       </w:r>
     </w:p>
     <w:p>
       <w:r>
-        <w:t xml:space="preserve">1. 贴近 SAC 的 population 模型 + **\(O(N^{-1/5})\)** 显式率与 \(\lambda\)–\(N\) 标度。  </w:t>
+        <w:t>| 分数 (1–3) | **2** |</w:t>
       </w:r>
     </w:p>
     <w:p>
       <w:r>
-        <w:t xml:space="preserve">2. **Gibbs vs MD** tracking 定量对照（**\(1/\tau\)** vs **\(\lambda\)**）。  </w:t>
+        <w:t>|------------|-------|</w:t>
       </w:r>
     </w:p>
     <w:p>
       <w:r>
-        <w:t>3. 曲率条件与 Fig. 1 失败模式相联系。</w:t>
+        <w:t>| **理由** | 对 **SAC 参数化理论** 与 **Gibbs/MD target** 设计有意义；对广义 ICLR 受众偏窄，缺深度 RL 验证且曲率难检验。 |</w:t>
       </w:r>
     </w:p>
     <w:p>
@@ -788,22 +340,22 @@
         <w:pStyle w:val="Heading2"/>
       </w:pPr>
       <w:r>
-        <w:t>关键缺点</w:t>
+        <w:t>Soundness（可靠性）</w:t>
       </w:r>
     </w:p>
     <w:p>
       <w:r>
-        <w:t xml:space="preserve">1. oracle、单步 actor、不可验证 \(R_{\hat Q}\) → 对深度 SAC **条件性**强。  </w:t>
+        <w:t>| 分数 (1–3) | **2** |</w:t>
       </w:r>
     </w:p>
     <w:p>
       <w:r>
-        <w:t xml:space="preserve">2. MD 优势部分来自式 (5) 定义；与实现中 target network 等未必一致。  </w:t>
+        <w:t>|------------|-------|</w:t>
       </w:r>
     </w:p>
     <w:p>
       <w:r>
-        <w:t>3. 主会 empirical 期望下贡献偏窄。</w:t>
+        <w:t>| **理由** | 在假设下证明链完整感强；结论 **条件性** 于 population oracle、单步 actor、全局曲率；未含 TD/采样与多步 actor。 |</w:t>
       </w:r>
     </w:p>
     <w:p>
@@ -811,32 +363,27 @@
         <w:pStyle w:val="Heading2"/>
       </w:pPr>
       <w:r>
-        <w:t>给作者的问题 *</w:t>
+        <w:t>Critical Strengths（关键优点）</w:t>
       </w:r>
     </w:p>
     <w:p>
       <w:r>
-        <w:t xml:space="preserve">1. 训练时如何检验/保证 \(R_{\hat Q}/2&lt;\tau\)？  </w:t>
+        <w:t xml:space="preserve">1. **贴近实现的 actor 模型**：固定协方差 squashed Gaussian + 每轮 **一步** reverse-KL，衔接 policy-space MD 与工程 SAC。  </w:t>
       </w:r>
     </w:p>
     <w:p>
       <w:r>
-        <w:t xml:space="preserve">2. 多步 actor 内循环？  </w:t>
+        <w:t xml:space="preserve">2. **显式 best-iterate 率**：定理 3 的 **\(O(N^{-1/5})\)** 与 **\(\lambda=\Theta(N^{-4/5})\)** 给出 actor–target 时间尺度权衡。  </w:t>
       </w:r>
     </w:p>
     <w:p>
       <w:r>
-        <w:t xml:space="preserve">3. 能否给出采样复杂度而不仅是 \(\varepsilon_{\mathrm{crit}}\)？  </w:t>
+        <w:t xml:space="preserve">3. **Gibbs vs MD 的推导性对照**：推论 1 中 **\(1/\tau\)** 残留 vs **\(\lambda\)** 控漂移；引理 9 与图 2 在精确 critic 设定下支持机制。  </w:t>
       </w:r>
     </w:p>
     <w:p>
       <w:r>
-        <w:t xml:space="preserve">4. 放慢 Gibbs target 后 MD 优势是否仍存在？  </w:t>
-      </w:r>
-    </w:p>
-    <w:p>
-      <w:r>
-        <w:t>5. 玩具 MDP 上是否拟合 \(N^{-1/5}\) 斜率？</w:t>
+        <w:t>4. **曲率与失败模式**：定理 2 将 \(R_{\hat Q}/2&lt;\tau\) 与 actor 子问题强凸性联系；附录 K 在相同 \(\varepsilon_{\mathrm{crit}}\) 下对比满足/违反曲率（图 1）。</w:t>
       </w:r>
     </w:p>
     <w:p>
@@ -844,28 +391,70 @@
         <w:pStyle w:val="Heading2"/>
       </w:pPr>
       <w:r>
-        <w:t>建议总评</w:t>
+        <w:t>Critical Weaknesses（关键缺点）</w:t>
+      </w:r>
+    </w:p>
+    <w:p>
+      <w:r>
+        <w:t xml:space="preserve">1. **Population critic oracle** 不含 TD、随机 replay、双 Q 与 critic target network，与标准深度 SAC 动力学有 gap。  </w:t>
+      </w:r>
+    </w:p>
+    <w:p>
+      <w:r>
+        <w:t xml:space="preserve">2. **\(R_{\hat Q}/2&lt;\tau\)** 对深度 critic **难验证**；可构造例主要为 Fourier 线性 critic。  </w:t>
+      </w:r>
+    </w:p>
+    <w:p>
+      <w:r>
+        <w:t xml:space="preserve">3. **单步 actor** vs 实践中每 critic **多步** actor 更新；定理 3 未覆盖。  </w:t>
+      </w:r>
+    </w:p>
+    <w:p>
+      <w:r>
+        <w:t xml:space="preserve">4. **MD 链 \(\pi_n\)** 与部分 SAC 实现（仅 Q target network 等）未必一致；MD 优势与式 (5) 中 **\(1/\lambda\)** KL 的内在关系应更明确。  </w:t>
+      </w:r>
+    </w:p>
+    <w:p>
+      <w:r>
+        <w:t>5. **实验** 仅附录玩具 MDP，未验证 **\(N^{-1/5}\)** 标度或高维控制。</w:t>
       </w:r>
     </w:p>
     <w:p>
       <w:pPr>
-        <w:pStyle w:val="ListBullet"/>
+        <w:pStyle w:val="Heading2"/>
       </w:pPr>
       <w:r>
-        <w:t xml:space="preserve">**Recommendation：** 弱接收（理论）/ 边界（广义 ICLR）  </w:t>
-      </w:r>
-    </w:p>
-    <w:p>
-      <w:pPr>
-        <w:pStyle w:val="ListBullet"/>
-      </w:pPr>
-      <w:r>
-        <w:t>**Confidence：** 3</w:t>
+        <w:t>Questions For Authors *（给作者的问题）</w:t>
       </w:r>
     </w:p>
     <w:p>
       <w:r>
-        <w:t>————————————————————</w:t>
+        <w:t xml:space="preserve">1. 对非 Fourier critic，是否有 **可检验** 的充分条件或在线估计保证 \(R_{\hat Q}/2&lt;\tau\)？  </w:t>
+      </w:r>
+    </w:p>
+    <w:p>
+      <w:r>
+        <w:t xml:space="preserve">2. 每 critic **\(K&gt;1\)** 步 actor 时，tracking 与值差距界如何变化？  </w:t>
+      </w:r>
+    </w:p>
+    <w:p>
+      <w:r>
+        <w:t xml:space="preserve">3. 能否将 **oracle** 替换为（即使线性）TD 的 **样本复杂度** 界？  </w:t>
+      </w:r>
+    </w:p>
+    <w:p>
+      <w:r>
+        <w:t xml:space="preserve">4. 若 **放慢 Gibbs target** 以匹配小 \(\lambda\) 的有效漂移，MD 优势还剩多少？  </w:t>
+      </w:r>
+    </w:p>
+    <w:p>
+      <w:r>
+        <w:t>5. 能否在附录 K 加 **log–log** 图比较 empirical 斜率与 **\(N^{-1/5}\)**？</w:t>
+      </w:r>
+    </w:p>
+    <w:p>
+      <w:r>
+        <w:t>————————————————————————</w:t>
       </w:r>
     </w:p>
     <w:p>
@@ -881,7 +470,7 @@
         <w:pStyle w:val="Heading1"/>
       </w:pPr>
       <w:r>
-        <w:t>Extended review (English)</w:t>
+        <w:t>English</w:t>
       </w:r>
     </w:p>
     <w:p>
@@ -889,271 +478,12 @@
         <w:pStyle w:val="Heading2"/>
       </w:pPr>
       <w:r>
-        <w:t>1. Motivation</w:t>
+        <w:t>AI Documentation For Reviewing (optional; not shown to authors)</w:t>
       </w:r>
     </w:p>
     <w:p>
       <w:r>
-        <w:t>Discrete Q-learning uses **max** over actions; continuous control replaces max with **softmax** over actions weighted by \(\exp(Q(s,a)/\alpha)\), but then you need either (i) a separate actor to represent that distribution, or (ii) a generative model that **is** the softmax. SAC/CrossQ/MPO: learn \(Q\) (or critic) + **policy extraction** (regression to softmax). **QNF** parameterizes the **policy density directly** as a **normalizing flow**, so the policy **is** the implicit softmax of a scalar potential—avoiding an explicit “actor improvement” network that chases a moving softmax target.</w:t>
-      </w:r>
-    </w:p>
-    <w:p>
-      <w:pPr>
-        <w:pStyle w:val="Heading2"/>
-      </w:pPr>
-      <w:r>
-        <w:t>2. Method pipeline</w:t>
-      </w:r>
-    </w:p>
-    <w:p>
-      <w:pPr>
-        <w:pStyle w:val="ListBullet"/>
-      </w:pPr>
-      <w:r>
-        <w:t>**Policy:** flow \(f_\theta(s,a)\) with tractable density \(\pi_\theta(a|s)\); interpret as softmax of implicit Q (Eqs. 11–12 in paper).</w:t>
-      </w:r>
-    </w:p>
-    <w:p>
-      <w:pPr>
-        <w:pStyle w:val="ListBullet"/>
-      </w:pPr>
-      <w:r>
-        <w:t>**Critics:** twin Q (or value + advantage decomposition as in algorithm figure); **target networks** for stability.</w:t>
-      </w:r>
-    </w:p>
-    <w:p>
-      <w:pPr>
-        <w:pStyle w:val="ListBullet"/>
-      </w:pPr>
-      <w:r>
-        <w:t>**Update:** **semi-gradient soft TD** on flow parameters (Eq. 15)—distinct from Trust-PCL-style **full** gradient through the Bellman operator.</w:t>
-      </w:r>
-    </w:p>
-    <w:p>
-      <w:pPr>
-        <w:pStyle w:val="ListBullet"/>
-      </w:pPr>
-      <w:r>
-        <w:t>**Entropy temperature \(\alpha\):** not fixed grid only—**closed-form OLS** each step on pairs \((\log \pi_\theta(a|s), \text{advantage})\) (Eq. 17), “stateless greedy” autotune.</w:t>
-      </w:r>
-    </w:p>
-    <w:p>
-      <w:pPr>
-        <w:pStyle w:val="ListBullet"/>
-      </w:pPr>
-      <w:r>
-        <w:t>**Greedification (Eqs. 18–20):** extra term with scale \(\lambda\) pushes policy toward colder / more peaked distribution when TD residual small—addresses stagnation when \(\lambda=0\).</w:t>
-      </w:r>
-    </w:p>
-    <w:p>
-      <w:r>
-        <w:t>**QMANSF:** masked autoregressive **neural spline flow**—authors’ main architecture; alternatives QMAF, QRNVP, QCNSF, QEBFlow, QMLP, QGauss compared in Fig. 3.</w:t>
-      </w:r>
-    </w:p>
-    <w:p>
-      <w:pPr>
-        <w:pStyle w:val="Heading2"/>
-      </w:pPr>
-      <w:r>
-        <w:t>3. Baselines and protocol</w:t>
-      </w:r>
-    </w:p>
-    <w:p>
-      <w:pPr>
-        <w:pStyle w:val="ListBullet"/>
-      </w:pPr>
-      <w:r>
-        <w:t>**8 DeepMind Control** tasks, **500k** env steps, **5 seeds**, report **IQM** + **95% bootstrap CI** (Agarwal et al. 2021).</w:t>
-      </w:r>
-    </w:p>
-    <w:p>
-      <w:pPr>
-        <w:pStyle w:val="ListBullet"/>
-      </w:pPr>
-      <w:r>
-        <w:t>Baselines: **SAC**, **CrossQ**, **FMER**, **FPO**, **MEow** (flow-related / entropy RL methods).</w:t>
-      </w:r>
-    </w:p>
-    <w:p>
-      <w:pPr>
-        <w:pStyle w:val="ListBullet"/>
-      </w:pPr>
-      <w:r>
-        <w:t>**Shared hyperparameters across envs** for all methods (simplicity but may hurt fairness).</w:t>
-      </w:r>
-    </w:p>
-    <w:p>
-      <w:pPr>
-        <w:pStyle w:val="ListBullet"/>
-      </w:pPr>
-      <w:r>
-        <w:t>**Stochastic evaluation** for all (flows lack deterministic mode)—fair to flows, may hurt exploitation-heavy comparison vs deterministic eval SAC.</w:t>
-      </w:r>
-    </w:p>
-    <w:p>
-      <w:pPr>
-        <w:pStyle w:val="Heading2"/>
-      </w:pPr>
-      <w:r>
-        <w:t>4. Results (detailed read)</w:t>
-      </w:r>
-    </w:p>
-    <w:p>
-      <w:pPr>
-        <w:pStyle w:val="ListBullet"/>
-      </w:pPr>
-      <w:r>
-        <w:t>**Figure 2 (main comparison):** QNF **competitive** on several locomotion/manipulation tasks but **lags SAC/CrossQ** on **exploitation-heavy** runners (**cheetah-run**, **walker-run**) and on **hopper-stand** (weak reward / need exploration)—authors acknowledge CrossQ adapts entropy setpoint while QNF with greedification may **wait for signal** and fail to discover stand-up behavior.</w:t>
-      </w:r>
-    </w:p>
-    <w:p>
-      <w:pPr>
-        <w:pStyle w:val="ListBullet"/>
-      </w:pPr>
-      <w:r>
-        <w:t>**Figure 3:** **QMANSF** among best flow variants—few layers, high expressivity per layer.</w:t>
-      </w:r>
-    </w:p>
-    <w:p>
-      <w:pPr>
-        <w:pStyle w:val="ListBullet"/>
-      </w:pPr>
-      <w:r>
-        <w:t>**Figure 4:** **\(\alpha\) sensitivity** high across envs; autotune OLS matches best fixed \(\alpha\) in many cases; **\(\lambda=0.1\)** reasonable for greed; large \(\lambda\) can **collapse** policy.</w:t>
-      </w:r>
-    </w:p>
-    <w:p>
-      <w:pPr>
-        <w:pStyle w:val="Heading2"/>
-      </w:pPr>
-      <w:r>
-        <w:t>5. Related positioning</w:t>
-      </w:r>
-    </w:p>
-    <w:p>
-      <w:pPr>
-        <w:pStyle w:val="ListBullet"/>
-      </w:pPr>
-      <w:r>
-        <w:t>**MEow / energy-based flows (NeurIPS 2024 line):** also flow + entropy RL; QNF differs by **direct Q-flow** + semi-gradient TD + OLS \(\alpha\) + greedification.</w:t>
-      </w:r>
-    </w:p>
-    <w:p>
-      <w:pPr>
-        <w:pStyle w:val="ListBullet"/>
-      </w:pPr>
-      <w:r>
-        <w:t>**Trust-PCL / soft Q with flows:** gradient-type differences matter for bias/variance—paper argues semi-gradient is practical.</w:t>
-      </w:r>
-    </w:p>
-    <w:p>
-      <w:pPr>
-        <w:pStyle w:val="Heading2"/>
-      </w:pPr>
-      <w:r>
-        <w:t>6. Extended strengths</w:t>
-      </w:r>
-    </w:p>
-    <w:p>
-      <w:r>
-        <w:t>1. **Conceptual clarity:** one generative model replaces actor–critic “two-headed” softmax extraction; Figure 1 algorithm is easy to teach.</w:t>
-      </w:r>
-    </w:p>
-    <w:p>
-      <w:r>
-        <w:t>2. **Training knobs with ablations:** \(\alpha\) OLS and greed \(\lambda\) are not afterthoughts—Fig. 4 supports narrative.</w:t>
-      </w:r>
-    </w:p>
-    <w:p>
-      <w:r>
-        <w:t>3. **Architecture study (Fig. 3)** within QNF family—QMANSF justified, not arbitrary.</w:t>
-      </w:r>
-    </w:p>
-    <w:p>
-      <w:r>
-        <w:t>4. **Honest limitation section:** sim-only, dense reward, compute vs Gaussian actor, stability tricks (split quadratic solve).</w:t>
-      </w:r>
-    </w:p>
-    <w:p>
-      <w:r>
-        <w:t>5. **Reproducibility claim:** anonymous code link promised—important if baselines are sensitive (SAC \(\alpha\) init 0.2 vs official 1.0 noted in text).</w:t>
-      </w:r>
-    </w:p>
-    <w:p>
-      <w:pPr>
-        <w:pStyle w:val="Heading2"/>
-      </w:pPr>
-      <w:r>
-        <w:t>7. Extended weaknesses</w:t>
-      </w:r>
-    </w:p>
-    <w:p>
-      <w:r>
-        <w:t>1. **Abstract vs evidence:** “perform similarly to widely used actor-critic” is **overstated** where CrossQ/SAC win clearly on multiple reported tasks.</w:t>
-      </w:r>
-    </w:p>
-    <w:p>
-      <w:r>
-        <w:t>2. **No wall-clock / sample-normalized compute**—flows cost more per step; unclear if gaps shrink with equal wall time.</w:t>
-      </w:r>
-    </w:p>
-    <w:p>
-      <w:r>
-        <w:t>3. **Single hyperparameter sheet across 8 envs**—may under-tune SAC/CrossQ or over-tune QNF; MEow from Hopper defaults + manual entropy tweak—**baseline fairness** weak.</w:t>
-      </w:r>
-    </w:p>
-    <w:p>
-      <w:r>
-        <w:t>4. **No theory** for semi-gradient TD + flows; no convergence or bias characterization.</w:t>
-      </w:r>
-    </w:p>
-    <w:p>
-      <w:r>
-        <w:t>5. **Scope:** no sparse reward, high-D action, real robots; greedification may harm exploration—hopper-stand is a red flag for deployment.</w:t>
-      </w:r>
-    </w:p>
-    <w:p>
-      <w:r>
-        <w:t>6. **Statistical testing:** CIs shown but few formal tests vs strongest baseline per task.</w:t>
-      </w:r>
-    </w:p>
-    <w:p>
-      <w:pPr>
-        <w:pStyle w:val="Heading2"/>
-      </w:pPr>
-      <w:r>
-        <w:t>8. Recommendation rationale</w:t>
-      </w:r>
-    </w:p>
-    <w:p>
-      <w:r>
-        <w:t>**Borderline accept:** interesting unification and reasonable engineering effort for 15 pages, but empirical headline oversells and key tasks show **clear baseline wins**. Would strengthen with matched-compute tables and per-task tuned baselines.</w:t>
-      </w:r>
-    </w:p>
-    <w:p>
-      <w:r>
-        <w:t>————————————————————</w:t>
-      </w:r>
-    </w:p>
-    <w:p>
-      <w:pPr>
-        <w:pStyle w:val="Heading1"/>
-      </w:pPr>
-      <w:r>
-        <w:t>OpenReview paste-in — 50972 (English)</w:t>
-      </w:r>
-    </w:p>
-    <w:p>
-      <w:pPr>
-        <w:pStyle w:val="Heading2"/>
-      </w:pPr>
-      <w:r>
-        <w:t>AI Documentation For Reviewing (optional)</w:t>
-      </w:r>
-    </w:p>
-    <w:p>
-      <w:r>
-        <w:t>Read full 15-page PDF. Extended notes above for myself; below for OpenReview. Tendency: **borderline accept**.</w:t>
+        <w:t>I read the full 15-page submission PDF. English review is mine; Chinese section adapted with LLM assistance for paste-in. Original tendency: **borderline accept**—clean idea and reasonable ablations, but the abstract overclaims relative to SAC/CrossQ on several tasks and baseline tuning/fairness is unclear.</w:t>
       </w:r>
     </w:p>
     <w:p>
@@ -1166,7 +496,17 @@
     </w:p>
     <w:p>
       <w:r>
-        <w:t>**Q Normalizing Flows (QNF)** represent the **entropy-regularized policy** as a **normalizing flow**, so the policy density **is** the softmax of an implicit Q (Eqs. 11–12), avoiding separate actor regression (SAC/MPO). Training: **soft TD** with twin critics and targets; flow trained by **semi-gradient TD** (Eq. 15). **\(\alpha\)** via closed-form **OLS** on \((\log\pi_\theta, \text{advantage})\) (Eq. 17). **Greedification** (Eqs. 18–20, \(\lambda\)) encourages colder policies when TD residual vanishes. **QMANSF** (masked autoregressive spline flow) evaluated on **8 DMC** tasks (500k steps, 5 seeds, IQM + bootstrap CIs) vs **SAC, CrossQ, FMER, FPO, MEow**, plus flow-type and \(\alpha\)/\(\lambda\) ablations. **Competitive** on several tasks; **underperforms** SAC/CrossQ on exploitation tasks (**cheetah-run**, **walker-run**) and **hopper-stand** (exploration). Sim-only, dense rewards; shared hyperparameters across envs.</w:t>
+        <w:t>The paper proposes **Q Normalizing Flows (QNF)** for **continuous-action, entropy-regularized** reinforcement learning. Instead of learning a scalar \(Q(s,a)\) and then **extracting** the softmax policy via a separate actor (as in SAC, CrossQ, MPO), QNF **parameterizes the policy density directly** as a **normalizing flow**, so the policy **is** the softmax of an implicit Q (Eqs. 11–12). This avoids an explicit policy-improvement regression step while retaining **off-policy soft TD** learning with **twin critics** and **target networks**.</w:t>
+      </w:r>
+    </w:p>
+    <w:p>
+      <w:r>
+        <w:t>Training updates the flow with **semi-gradient TD** (Eq. 15), which the authors distinguish from Trust-PCL-style **full** gradient-TD through the Bellman backup. **Entropy temperature \(\alpha\)** is adapted via a closed-form **ordinary least squares (OLS)** fit each step on pairs \((\log \pi_\theta(a|s), \text{advantage})\) (Eq. 17), addressing sensitivity to fixed \(\alpha\). A **greedification** term (Eqs. 18–20, scale \(\lambda\)) pushes the policy toward colder / more peaked softmax behavior when the TD residual is small, mitigating stagnation when \(\lambda=0\).</w:t>
+      </w:r>
+    </w:p>
+    <w:p>
+      <w:r>
+        <w:t>The main architecture **QMANSF** uses a **masked autoregressive neural spline flow**. Experiments cover **8 DeepMind Control** tasks at **500k** environment steps with **5 seeds**, reporting **IQM** and **95% bootstrap confidence intervals** (Agarwal et al., 2021), against **SAC, CrossQ, FMER, FPO, MEow**, plus ablations over flow types (Figure 3) and \(\alpha\)/\(\lambda\) (Figure 4). QNF is **competitive** on several tasks but **underperforms** strong actor–critic baselines on **exploitation-heavy** locomotion (**cheetah-run**, **walker-run**) and on **hopper-stand**, where the authors note CrossQ adapts entropy effectively while QNF with greedification may fail to discover stand-up behavior under weak reward signal. Scope is **simulation-only** and **dense-reward** focused; the authors acknowledge higher compute and stability tricks (e.g., split quadratic solve) versus Gaussian actors.</w:t>
       </w:r>
     </w:p>
     <w:p>
@@ -1174,32 +514,68 @@
         <w:pStyle w:val="Heading2"/>
       </w:pPr>
       <w:r>
-        <w:t>Ratings</w:t>
+        <w:t>Presentation</w:t>
       </w:r>
     </w:p>
     <w:p>
       <w:r>
-        <w:t>| Dimension | Score | Justification |</w:t>
+        <w:t>| Score (1–3) | **3** |</w:t>
       </w:r>
     </w:p>
     <w:p>
       <w:r>
-        <w:t>|-----------|-------|---------------|</w:t>
+        <w:t>|-------------|-------|</w:t>
       </w:r>
     </w:p>
     <w:p>
       <w:r>
-        <w:t>| **Presentation** | **3** | Clear motivation, Algorithm 1, Fig. 1; related work covers MEow/Trust-PCL. |</w:t>
+        <w:t>| **Justification** | Motivation, Algorithm 1, and Figure 1 clearly explain the QNF loop; related work positions MEow, Trust-PCL, and actor–critic softmax extraction. Limitations section is candid about compute and scope. |</w:t>
+      </w:r>
+    </w:p>
+    <w:p>
+      <w:pPr>
+        <w:pStyle w:val="Heading2"/>
+      </w:pPr>
+      <w:r>
+        <w:t>Informativeness</w:t>
       </w:r>
     </w:p>
     <w:p>
       <w:r>
-        <w:t>| **Informativeness** | **2** | Useful Q-flow + autotune/greed; narrow benchmarks, no theory. |</w:t>
+        <w:t>| Score (1–3) | **2** |</w:t>
       </w:r>
     </w:p>
     <w:p>
       <w:r>
-        <w:t>| **Soundness** | **2** | Plausible design + ablations; multiple task losses to strong baselines; tuning fairness unclear. |</w:t>
+        <w:t>|-------------|-------|</w:t>
+      </w:r>
+    </w:p>
+    <w:p>
+      <w:r>
+        <w:t>| **Justification** | The **softmax-as-flow** unification and **\(\alpha\)-OLS / greedification** mechanisms are useful ideas with ablations, but benchmarks are narrow (8 DMC, shared hyperparameters) and there is **no convergence or bias analysis** for semi-gradient TD with flows. |</w:t>
+      </w:r>
+    </w:p>
+    <w:p>
+      <w:pPr>
+        <w:pStyle w:val="Heading2"/>
+      </w:pPr>
+      <w:r>
+        <w:t>Soundness</w:t>
+      </w:r>
+    </w:p>
+    <w:p>
+      <w:r>
+        <w:t>| Score (1–3) | **2** |</w:t>
+      </w:r>
+    </w:p>
+    <w:p>
+      <w:r>
+        <w:t>|-------------|-------|</w:t>
+      </w:r>
+    </w:p>
+    <w:p>
+      <w:r>
+        <w:t>| **Justification** | Method design and ablations (Figures 3–4) support internal claims. Several headline comparisons favor SAC/CrossQ on important tasks; **shared cross-env hyperparameters**, MEow tuning from Hopper defaults, and **stochastic-only evaluation** raise fairness questions that are not fully resolved. |</w:t>
       </w:r>
     </w:p>
     <w:p>
@@ -1212,17 +588,22 @@
     </w:p>
     <w:p>
       <w:r>
-        <w:t>1. **Softmax-as-flow** removes separate policy-improvement head while keeping off-policy TD stack.</w:t>
+        <w:t>1. **Conceptual unification.** Representing the **entropy-regularized policy as the generative model** removes the separate actor head that regresses toward an implicit softmax of Q, simplifying the training loop while keeping standard off-policy TD machinery.</w:t>
       </w:r>
     </w:p>
     <w:p>
       <w:r>
-        <w:t>2. **\(\alpha\) OLS autotune and greedification** with Fig. 4 ablations—practical response to fixed-\(\alpha\) sensitivity.</w:t>
+        <w:t>2. **Practical training knobs with evidence.** **\(\alpha\) OLS autotuning** and **greedification** are motivated by fixed-\(\alpha\) sensitivity and \(\lambda=0\) stagnation; Figure 4 shows competitive returns with autotuned \(\alpha\) and documents collapse at large \(\lambda\).</w:t>
       </w:r>
     </w:p>
     <w:p>
       <w:r>
-        <w:t>3. **QMANSF** supported by intra-QNF comparison (Fig. 3).</w:t>
+        <w:t>3. **Architecture choice within QNF.** Figure 3 compares multiple flow families; **QMANSF** is consistently strong among QNF variants, supporting the main experimental configuration.</w:t>
+      </w:r>
+    </w:p>
+    <w:p>
+      <w:r>
+        <w:t>4. **Honest scope statement.** The paper acknowledges flow **compute cost**, **instability** mitigations, and lack of sparse/high-dimensional evaluation, which helps readers calibrate claims.</w:t>
       </w:r>
     </w:p>
     <w:p>
@@ -1235,17 +616,27 @@
     </w:p>
     <w:p>
       <w:r>
-        <w:t>1. **Empirical claim stronger than tables:** SAC/CrossQ win important tasks; abstract “similar to widely used actor-critic” not justified.</w:t>
+        <w:t>1. **Abstract vs results.** The claim that QNF performs **similarly to widely used actor–critic** methods is not supported on multiple reported tasks where **SAC/CrossQ achieve higher IQM**, especially exploitation-dominated runners.</w:t>
       </w:r>
     </w:p>
     <w:p>
       <w:r>
-        <w:t>2. **Fairness / cost:** shared cross-env hyperparams, MEow origin tuning, stochastic-only eval; missing wall-time and matched-compute comparisons.</w:t>
+        <w:t>2. **Baseline fairness and tuning.** One hyperparameter sheet across all environments, MEow built from Gym Hopper defaults with manual entropy adjustment, and SAC \(\alpha\) initialization differing from some official implementations (noted in text) make it hard to attribute gaps purely to modeling choice.</w:t>
       </w:r>
     </w:p>
     <w:p>
       <w:r>
-        <w:t>3. **Exploration failures (hopper-stand)** limit claim of general continuous Q-learning replacement.</w:t>
+        <w:t>3. **Exploration failure mode.** **hopper-stand** and related weak-signal settings expose a limitation of the greedification + autotune \(\alpha\) design relative to CrossQ’s entropy adaptation—undermining “general continuous Q-learning” messaging.</w:t>
+      </w:r>
+    </w:p>
+    <w:p>
+      <w:r>
+        <w:t>4. **Missing compute-normalized comparisons.** Flows require sampling and log-determinant computation; without **wall-time** or matched compute, sample-efficiency plots may misrank methods.</w:t>
+      </w:r>
+    </w:p>
+    <w:p>
+      <w:r>
+        <w:t>5. **No theory for semi-gradient TD through flows.** Bias/stationarity of the QNF update is argued informally; Trust-PCL contrast does not substitute for guarantees or systematic bias measurement.</w:t>
       </w:r>
     </w:p>
     <w:p>
@@ -1258,27 +649,40 @@
     </w:p>
     <w:p>
       <w:r>
-        <w:t>1. **cheetah-run / walker-run / hopper-stand:** final IQM vs SAC/CrossQ at **matched steps and wall-time** with significance tests?</w:t>
+        <w:t>1. On **cheetah-run, walker-run, and hopper-stand**, what are the **final IQM** and CIs vs SAC/CrossQ at **matched environment steps** and **matched wall-clock**, with statistical tests against the strongest baseline per task?</w:t>
       </w:r>
     </w:p>
     <w:p>
       <w:r>
-        <w:t>2. Ablate **flow + SAC-style entropy tuning without greed** vs full QNF—is gain from parameterization or from OLS/greed?</w:t>
+        <w:t>2. Does performance depend primarily on **flow parameterization**, or on **\(\alpha\)-OLS + greedification**? Please ablate **flow actor + SAC-style entropy tuning without greed** and **fixed \(\alpha\) + greed**.</w:t>
       </w:r>
     </w:p>
     <w:p>
       <w:r>
-        <w:t>3. Will **full hyperparameter tables + code** reproduce every baseline exactly (including SAC \(\alpha\) init and MEow tuning)?</w:t>
+        <w:t>3. Will the anonymous **code and full hyperparameter tables** reproduce **all** baselines exactly (including MEow and SAC \(\alpha\) init)?</w:t>
       </w:r>
     </w:p>
     <w:p>
       <w:r>
-        <w:t>4. Deterministic-eval protocol for Gaussian baselines only—how much does stochastic eval change rankings?</w:t>
+        <w:t>4. How much do rankings change if Gaussian baselines are evaluated **deterministically** while flows remain stochastic?</w:t>
       </w:r>
     </w:p>
     <w:p>
       <w:r>
-        <w:t>5. Any **bias** analysis for semi-gradient TD through flow density?</w:t>
+        <w:t>5. Can you characterize **semi-gradient bias** (even empirically) relative to a full-gradient Trust-PCL-style update on a small diagnostic task?</w:t>
+      </w:r>
+    </w:p>
+    <w:p>
+      <w:r>
+        <w:t>————————————————————————</w:t>
+      </w:r>
+    </w:p>
+    <w:p>
+      <w:pPr>
+        <w:pStyle w:val="Heading1"/>
+      </w:pPr>
+      <w:r>
+        <w:t>中文</w:t>
       </w:r>
     </w:p>
     <w:p>
@@ -1286,106 +690,12 @@
         <w:pStyle w:val="Heading2"/>
       </w:pPr>
       <w:r>
-        <w:t>Suggested overall</w:t>
-      </w:r>
-    </w:p>
-    <w:p>
-      <w:pPr>
-        <w:pStyle w:val="ListBullet"/>
-      </w:pPr>
-      <w:r>
-        <w:t xml:space="preserve">**Recommendation:** Borderline Accept  </w:t>
-      </w:r>
-    </w:p>
-    <w:p>
-      <w:pPr>
-        <w:pStyle w:val="ListBullet"/>
-      </w:pPr>
-      <w:r>
-        <w:t>**Confidence:** 3</w:t>
+        <w:t>AI 文档说明（可选；作者不可见）</w:t>
       </w:r>
     </w:p>
     <w:p>
       <w:r>
-        <w:t>————————————————————</w:t>
-      </w:r>
-    </w:p>
-    <w:p>
-      <w:pPr>
-        <w:pStyle w:val="Heading1"/>
-      </w:pPr>
-      <w:r>
-        <w:t>Extended review — 50972 (中文)</w:t>
-      </w:r>
-    </w:p>
-    <w:p>
-      <w:pPr>
-        <w:pStyle w:val="Heading2"/>
-      </w:pPr>
-      <w:r>
-        <w:t>方法概述</w:t>
-      </w:r>
-    </w:p>
-    <w:p>
-      <w:r>
-        <w:t>QNF 用 **normalizing flow** 直接表示 **熵正则策略**，等价于隐式 Q 的 softmax，省去 SAC 式 **actor 对 softmax 的回归**。训练：**soft TD** + 双 critic + target；flow 用 **semi-gradient TD**（非 Trust-PCL 全梯度）。**\(\alpha\)** 用 advantage 与 \(\log\pi\) 的 **OLS 闭式解** 自适应；**greedification（\(\lambda\)）** 在 TD 残差小时把策略推得更「冷」。</w:t>
-      </w:r>
-    </w:p>
-    <w:p>
-      <w:pPr>
-        <w:pStyle w:val="Heading2"/>
-      </w:pPr>
-      <w:r>
-        <w:t>实验解读</w:t>
-      </w:r>
-    </w:p>
-    <w:p>
-      <w:r>
-        <w:t>8 个 DMC、500k 步、5 seed、IQM+CI。QNF 多任务 **有竞争力**，但在 **cheetah-run、walker-run** 等利用型任务上 **弱于 SAC/CrossQ**；**hopper-stand** 探索不足。Fig. 4 显示 **\(\alpha\)** 敏感，OLS 自动调 \(\alpha\) 有效；**\(\lambda\)** 过大可能崩溃。</w:t>
-      </w:r>
-    </w:p>
-    <w:p>
-      <w:pPr>
-        <w:pStyle w:val="Heading2"/>
-      </w:pPr>
-      <w:r>
-        <w:t>优缺点（扩展）</w:t>
-      </w:r>
-    </w:p>
-    <w:p>
-      <w:r>
-        <w:t xml:space="preserve">**优点：** 概念统一、算法图清晰；\(\alpha\)/\(\lambda\) 有消融；QMANSF 有架构对比。  </w:t>
-      </w:r>
-    </w:p>
-    <w:p>
-      <w:r>
-        <w:t>**缺点：** 摘要「与主流 actor-critic 相当」**证据不足**；跨环境共用超参、MEow 调参来源、缺 wall-time；hopper-stand 失败限制泛化 claim；无收敛理论。</w:t>
-      </w:r>
-    </w:p>
-    <w:p>
-      <w:r>
-        <w:t>————————————————————</w:t>
-      </w:r>
-    </w:p>
-    <w:p>
-      <w:pPr>
-        <w:pStyle w:val="Heading1"/>
-      </w:pPr>
-      <w:r>
-        <w:t>OpenReview paste-in — 50972 (中文)</w:t>
-      </w:r>
-    </w:p>
-    <w:p>
-      <w:pPr>
-        <w:pStyle w:val="Heading2"/>
-      </w:pPr>
-      <w:r>
-        <w:t>AI 文档说明（可选）</w:t>
-      </w:r>
-    </w:p>
-    <w:p>
-      <w:r>
-        <w:t>已读 15 页全文。倾向：**边界接收**。</w:t>
+        <w:t>已阅读 15 页全文。英文为本人撰写；中文 LLM 整理便于粘贴。润色前倾向：**边界接收**——思路清晰、消融合理，但摘要相对 SAC/CrossQ 偏强，基线公平性与调参对齐不足。</w:t>
       </w:r>
     </w:p>
     <w:p>
@@ -1398,7 +708,17 @@
     </w:p>
     <w:p>
       <w:r>
-        <w:t>（见英文 Summary 中文对应）QNF：flow 即 softmax 策略；semi-gradient soft TD；**\(\alpha\)** OLS 自适应；**greedification**。QMANSF 在 8 个 DMC 上对比 SAC/CrossQ 等。多任务有竞争力，利用型与 hopper-stand **弱于** 强基线。</w:t>
+        <w:t>本文提出 **Q Normalizing Flows (QNF)**，用于 **连续动作、熵正则** 强化学习。不同于 SAC/CrossQ/MPO 先学 \(Q(s,a)\) 再 **单独 actor 回归 softmax**，QNF 用 **normalizing flow** **直接参数化策略密度**，使策略 **即为** 隐式 Q 的 softmax（式 11–12），省去显式 policy improvement 回归，仍采用 **off-policy soft TD**、**双 critic** 与 **target network**。</w:t>
+      </w:r>
+    </w:p>
+    <w:p>
+      <w:r>
+        <w:t>Flow 用 **semi-gradient TD**（式 15）更新，作者区分于 Trust-PCL 的 **full** gradient-TD。**熵温度 \(\alpha\)** 每步对 \((\log\pi_\theta,\text{advantage})\) 做 **OLS 闭式解**（式 17）自适应；**greedification**（式 18–20，\(\lambda\)）在 TD 残差小时推向更冷 softmax，缓解 \(\lambda=0\) 停滞。</w:t>
+      </w:r>
+    </w:p>
+    <w:p>
+      <w:r>
+        <w:t>主架构 **QMANSF** 为 **masked autoregressive neural spline flow**。**8 个 DMC** 任务、**500k** 步、**5 seed**、**IQM + 95% bootstrap CI**，对比 **SAC、CrossQ、FMER、FPO、MEow**；图 3 比较 flow 族，图 4 消融 \(\alpha\)/\(\lambda\)。多任务 **有竞争力**，但在 **cheetah-run、walker-run** 等利用型任务 **弱于 SAC/CrossQ**，**hopper-stand** 探索不足（CrossQ 熵适应更好）。仅 **仿真、dense reward**；作者承认 flow **算力**与 **稳定性** 技巧（如 split quadratic solve）。</w:t>
       </w:r>
     </w:p>
     <w:p>
@@ -1406,32 +726,22 @@
         <w:pStyle w:val="Heading2"/>
       </w:pPr>
       <w:r>
-        <w:t>评分</w:t>
+        <w:t>Presentation（呈现）</w:t>
       </w:r>
     </w:p>
     <w:p>
       <w:r>
-        <w:t>| 维度 | 分数 | 理由 |</w:t>
+        <w:t>| 分数 (1–3) | **3** |</w:t>
       </w:r>
     </w:p>
     <w:p>
       <w:r>
-        <w:t>|------|------|------|</w:t>
+        <w:t>|------------|-------|</w:t>
       </w:r>
     </w:p>
     <w:p>
       <w:r>
-        <w:t>| Presentation | **3** | 清楚。 |</w:t>
-      </w:r>
-    </w:p>
-    <w:p>
-      <w:r>
-        <w:t>| Informativeness | **2** | 思路新但 benchmark 窄。 |</w:t>
-      </w:r>
-    </w:p>
-    <w:p>
-      <w:r>
-        <w:t>| Soundness | **2** | 合理；基线对齐与算力对比不足。 |</w:t>
+        <w:t>| **理由** | 动机、Algorithm 1、Figure 1 清楚；related work 定位 MEow/Trust-PCL；局限写得诚实。 |</w:t>
       </w:r>
     </w:p>
     <w:p>
@@ -1439,22 +749,22 @@
         <w:pStyle w:val="Heading2"/>
       </w:pPr>
       <w:r>
-        <w:t>关键优点</w:t>
+        <w:t>Informativeness（信息量）</w:t>
       </w:r>
     </w:p>
     <w:p>
       <w:r>
-        <w:t xml:space="preserve">1. softmax 与 flow 统一，去掉独立 policy improvement。  </w:t>
+        <w:t>| 分数 (1–3) | **2** |</w:t>
       </w:r>
     </w:p>
     <w:p>
       <w:r>
-        <w:t xml:space="preserve">2. \(\alpha\) OLS 与 greed 有 Fig. 4 支撑。  </w:t>
+        <w:t>|------------|-------|</w:t>
       </w:r>
     </w:p>
     <w:p>
       <w:r>
-        <w:t>3. QMANSF 经 Fig. 3 论证。</w:t>
+        <w:t>| **理由** | **softmax-as-flow** 与 **\(\alpha\)-OLS/greed** 有消融价值，但 benchmark 窄、无 semi-gradient TD 收敛/偏差理论。 |</w:t>
       </w:r>
     </w:p>
     <w:p>
@@ -1462,17 +772,22 @@
         <w:pStyle w:val="Heading2"/>
       </w:pPr>
       <w:r>
-        <w:t>关键缺点</w:t>
+        <w:t>Soundness（可靠性）</w:t>
       </w:r>
     </w:p>
     <w:p>
       <w:r>
-        <w:t xml:space="preserve">1. 摘要表述强于实验（SAC/CrossQ 多任务更优）。  </w:t>
+        <w:t>| 分数 (1–3) | **2** |</w:t>
       </w:r>
     </w:p>
     <w:p>
       <w:r>
-        <w:t xml:space="preserve">2. 超参共用、缺 wall-time、探索任务失败。  </w:t>
+        <w:t>|------------|-------|</w:t>
+      </w:r>
+    </w:p>
+    <w:p>
+      <w:r>
+        <w:t>| **理由** | 方法与图 3–4 自洽；多任务强基线更优；**跨环境共用超参**、MEow 来源与 **仅随机 eval** 使公平性未完全厘清。 |</w:t>
       </w:r>
     </w:p>
     <w:p>
@@ -1480,32 +795,27 @@
         <w:pStyle w:val="Heading2"/>
       </w:pPr>
       <w:r>
-        <w:t>给作者的问题 *</w:t>
+        <w:t>Critical Strengths（关键优点）</w:t>
       </w:r>
     </w:p>
     <w:p>
       <w:r>
-        <w:t xml:space="preserve">1. 关键任务上同步数、同 wall-time 的 IQM 与显著性？  </w:t>
+        <w:t xml:space="preserve">1. **概念统一**：熵正则策略即生成模型，去掉独立 actor 对 softmax 的回归，保留 off-policy TD 栈。  </w:t>
       </w:r>
     </w:p>
     <w:p>
       <w:r>
-        <w:t xml:space="preserve">2. 消融：无 greed / SAC 式调熵？  </w:t>
+        <w:t xml:space="preserve">2. **训练机制有证据**：**\(\alpha\) OLS** 与 **greedification** 针对固定 \(\alpha\) 敏感与 \(\lambda=0\) 停滞；图 4 支持 autotune 与 \(\lambda\) 过大崩溃。  </w:t>
       </w:r>
     </w:p>
     <w:p>
       <w:r>
-        <w:t xml:space="preserve">3. 代码与超参能否精确复现 baseline？  </w:t>
+        <w:t xml:space="preserve">3. **QMANSF 选型**：图 3 多 flow 对比中 QMANSF 总体表现最好之一。  </w:t>
       </w:r>
     </w:p>
     <w:p>
       <w:r>
-        <w:t xml:space="preserve">4. 随机 eval 对排序影响？  </w:t>
-      </w:r>
-    </w:p>
-    <w:p>
-      <w:r>
-        <w:t>5. semi-gradient 偏差分析？</w:t>
+        <w:t>4. **局限透明**：承认算力、稳定性与任务范围限制。</w:t>
       </w:r>
     </w:p>
     <w:p>
@@ -1513,33 +823,75 @@
         <w:pStyle w:val="Heading2"/>
       </w:pPr>
       <w:r>
-        <w:t>建议总评</w:t>
+        <w:t>Critical Weaknesses（关键缺点）</w:t>
+      </w:r>
+    </w:p>
+    <w:p>
+      <w:r>
+        <w:t xml:space="preserve">1. **摘要「与主流 actor-critic 相当」** 与表格不符，多任务 **SAC/CrossQ 更优**。  </w:t>
+      </w:r>
+    </w:p>
+    <w:p>
+      <w:r>
+        <w:t xml:space="preserve">2. **基线公平性**：全环境同一超参表、MEow 从 Hopper 默认改熵、SAC \(\alpha\) 初始化差异等，难以只归因于 QNF 建模。  </w:t>
+      </w:r>
+    </w:p>
+    <w:p>
+      <w:r>
+        <w:t xml:space="preserve">3. **hopper-stand 等探索失败** 削弱「通用连续 Q-learning」表述。  </w:t>
+      </w:r>
+    </w:p>
+    <w:p>
+      <w:r>
+        <w:t xml:space="preserve">4. **缺 wall-time/同算力** 对比。  </w:t>
+      </w:r>
+    </w:p>
+    <w:p>
+      <w:r>
+        <w:t>5. **无** semi-gradient TD+flow 的理论或系统偏差测量。</w:t>
       </w:r>
     </w:p>
     <w:p>
       <w:pPr>
-        <w:pStyle w:val="ListBullet"/>
+        <w:pStyle w:val="Heading2"/>
       </w:pPr>
       <w:r>
-        <w:t xml:space="preserve">**Recommendation：** 边界接收  </w:t>
-      </w:r>
-    </w:p>
-    <w:p>
-      <w:pPr>
-        <w:pStyle w:val="ListBullet"/>
-      </w:pPr>
-      <w:r>
-        <w:t>**Confidence：** 3</w:t>
+        <w:t>Questions For Authors *（给作者的问题）</w:t>
       </w:r>
     </w:p>
     <w:p>
       <w:r>
-        <w:t>————————————————————</w:t>
+        <w:t xml:space="preserve">1. **cheetah-run / walker-run / hopper-stand**：同步数、**同 wall-time** 下相对 SAC/CrossQ 的 **最终 IQM、CI 与显著性**？  </w:t>
       </w:r>
     </w:p>
     <w:p>
       <w:r>
-        <w:t>*Document version: extended detail for local reading + OpenReview paste-in. Adjust AI Documentation to match your conference AI policy.*</w:t>
+        <w:t xml:space="preserve">2. 收益来自 **flow 参数化** 还是 **\(\alpha\)-OLS + greed**？请 ablate flow + SAC 熵调、无 greed 等。  </w:t>
+      </w:r>
+    </w:p>
+    <w:p>
+      <w:r>
+        <w:t xml:space="preserve">3. **代码与完整超参** 能否 **精确复现** 各 baseline（含 MEow、SAC \(\alpha\) init）？  </w:t>
+      </w:r>
+    </w:p>
+    <w:p>
+      <w:r>
+        <w:t xml:space="preserve">4. 高斯基线 **确定性 eval** 时排序是否变化？  </w:t>
+      </w:r>
+    </w:p>
+    <w:p>
+      <w:r>
+        <w:t>5. 能否在诊断任务上量化 **semi-gradient 相对 full-gradient** 的偏差？</w:t>
+      </w:r>
+    </w:p>
+    <w:p>
+      <w:r>
+        <w:t>————————————————————————</w:t>
+      </w:r>
+    </w:p>
+    <w:p>
+      <w:r>
+        <w:t>*End of review document. Select Presentation / Informativeness / Soundness scores (1–3) in OpenReview to match the tables above.*</w:t>
       </w:r>
     </w:p>
     <w:sectPr>

</xml_diff>

<commit_message>
Complete OpenReview fields: rating, confidence, supporting args
Co-authored-by: Han Wang <202300300096@mail.sdu.edu.cn>
</commit_message>
<xml_diff>
--- a/reviews/ICLR2027_42504_50972_reviews.docx
+++ b/reviews/ICLR2027_42504_50972_reviews.docx
@@ -12,12 +12,87 @@
     </w:p>
     <w:p>
       <w:r>
-        <w:t xml:space="preserve">Copy each **English** or **中文** block below into the corresponding OpenReview fields.  </w:t>
+        <w:t>Copy each **English** or **中文** block into the matching OpenReview field (one paper at a time).</w:t>
       </w:r>
     </w:p>
     <w:p>
       <w:r>
-        <w:t>**Scales:** Presentation / Informativeness / Soundness are **1–3** (select the number in the form; rationale is in the table for your notes).</w:t>
+        <w:t>**Field checklist (per paper)**</w:t>
+      </w:r>
+    </w:p>
+    <w:p>
+      <w:r>
+        <w:t>| OpenReview field | Section heading below |</w:t>
+      </w:r>
+    </w:p>
+    <w:p>
+      <w:r>
+        <w:t>|------------------|------------------------|</w:t>
+      </w:r>
+    </w:p>
+    <w:p>
+      <w:r>
+        <w:t>| AI Documentation For Reviewing | optional |</w:t>
+      </w:r>
+    </w:p>
+    <w:p>
+      <w:r>
+        <w:t>| Paper Summary * | required |</w:t>
+      </w:r>
+    </w:p>
+    <w:p>
+      <w:r>
+        <w:t>| Presentation | score **1–3** in form; rationale in table |</w:t>
+      </w:r>
+    </w:p>
+    <w:p>
+      <w:r>
+        <w:t>| Informativeness | score **1–3** |</w:t>
+      </w:r>
+    </w:p>
+    <w:p>
+      <w:r>
+        <w:t>| Soundness | score **1–3** |</w:t>
+      </w:r>
+    </w:p>
+    <w:p>
+      <w:r>
+        <w:t>| Critical Strengths | numbered list |</w:t>
+      </w:r>
+    </w:p>
+    <w:p>
+      <w:r>
+        <w:t>| Critical Weaknesses | numbered list |</w:t>
+      </w:r>
+    </w:p>
+    <w:p>
+      <w:r>
+        <w:t>| Questions For Authors * | required |</w:t>
+      </w:r>
+    </w:p>
+    <w:p>
+      <w:r>
+        <w:t>| Overall Recommendation / Rating * | **0–10 even scale** (if your form has it) |</w:t>
+      </w:r>
+    </w:p>
+    <w:p>
+      <w:r>
+        <w:t>| Confidence * | **1–5** (if your form has it) |</w:t>
+      </w:r>
+    </w:p>
+    <w:p>
+      <w:r>
+        <w:t>| Supporting arguments (free text) | if form has a general “Review” or recommendation box |</w:t>
+      </w:r>
+    </w:p>
+    <w:p>
+      <w:r>
+        <w:t>| Additional feedback (optional) | improvement suggestions, not scored |</w:t>
+      </w:r>
+    </w:p>
+    <w:p>
+      <w:r>
+        <w:t>**Split files:** `ICLR2027_42504_review_only.md`, `ICLR2027_50972_review_only.md`.</w:t>
       </w:r>
     </w:p>
     <w:p>
@@ -241,6 +316,125 @@
       </w:r>
     </w:p>
     <w:p>
+      <w:pPr>
+        <w:pStyle w:val="Heading2"/>
+      </w:pPr>
+      <w:r>
+        <w:t>Overall Recommendation *</w:t>
+      </w:r>
+    </w:p>
+    <w:p>
+      <w:r>
+        <w:t>| Select on form (0–10, even numbers) | **5** |</w:t>
+      </w:r>
+    </w:p>
+    <w:p>
+      <w:r>
+        <w:t>|-------------------------------------|-------|</w:t>
+      </w:r>
+    </w:p>
+    <w:p>
+      <w:r>
+        <w:t>| **Label** | Marginally below acceptance threshold |</w:t>
+      </w:r>
+    </w:p>
+    <w:p>
+      <w:r>
+        <w:t>| **One-line reason** | Solid SAC theory for a narrow audience, but population oracle, unverifiable curvature, and appendix-only experiments limit impact for ICLR’s broad program. |</w:t>
+      </w:r>
+    </w:p>
+    <w:p>
+      <w:r>
+        <w:t>**Two key reasons (accept vs reject):** (1) **Accept angle:** first population guarantees for squashed-Gaussian SAC with partial KL steps and a sharp Gibbs-vs-MD tracking comparison (Corollary 1, Fig. 2). (2) **Reject angle:** main claims do not connect to deep SAC training (no TD/sample complexity; \(R_{\hat Q}/2&lt;\tau\) not checkable); empirical section does not validate the \(N^{-1/5}\) rate.</w:t>
+      </w:r>
+    </w:p>
+    <w:p>
+      <w:r>
+        <w:t>*If your form uses Accept/Reject only:* lean **Borderline / Weak Reject** for the main conference; **Weak Accept** if the AC prioritizes RL theory.</w:t>
+      </w:r>
+    </w:p>
+    <w:p>
+      <w:pPr>
+        <w:pStyle w:val="Heading2"/>
+      </w:pPr>
+      <w:r>
+        <w:t>Confidence *</w:t>
+      </w:r>
+    </w:p>
+    <w:p>
+      <w:r>
+        <w:t>| Score (1–5) | **3** |</w:t>
+      </w:r>
+    </w:p>
+    <w:p>
+      <w:r>
+        <w:t>|-------------|-------|</w:t>
+      </w:r>
+    </w:p>
+    <w:p>
+      <w:r>
+        <w:t>| **Justification** | Comfortable with entropy-regularized RL, SAC, and policy mirror descent at a high level; I read the main text and theorem statements but did not verify every appendix proof in full detail. |</w:t>
+      </w:r>
+    </w:p>
+    <w:p>
+      <w:pPr>
+        <w:pStyle w:val="Heading2"/>
+      </w:pPr>
+      <w:r>
+        <w:t>Supporting Arguments For Recommendation *</w:t>
+      </w:r>
+    </w:p>
+    <w:p>
+      <w:r>
+        <w:t>The paper addresses a real mismatch between SAC implementations (squashed Gaussian, few reverse-KL steps, moving targets) and theory that often assumes policy-space updates or well-behaved direct policy gradients. The Gibbs versus MD target comparison is the most distinctive deliverable: the non-vanishing \(1/\tau\) term in Corollary 1 is an explicit warning that a classical softmax target can be hard to track when the actor only takes partial steps, whereas \(\lambda\) gives a knob in the MD formulation. Theorem 3’s \(N^{-1/5}\) rate with \(\lambda=\Theta(N^{-4/5})\) is a concrete, if slow, finite-time statement.</w:t>
+      </w:r>
+    </w:p>
+    <w:p>
+      <w:r>
+        <w:t>However, for ICLR as a whole, the work reads as **conditional theory**: the critic oracle abstracts away the hardest practical component, and the curvature assumption is doing substantial work without a path to verification for neural critics. The toy experiments are useful for intuition but do not compensate for the lack of deep RL evidence or rate validation. I would raise to **6** if the authors convincingly clarify novelty over “proximal targets move slowly” and provide a credible bridge to multi-step actors or linear TD critics in rebuttal.</w:t>
+      </w:r>
+    </w:p>
+    <w:p>
+      <w:pPr>
+        <w:pStyle w:val="Heading2"/>
+      </w:pPr>
+      <w:r>
+        <w:t>Additional Feedback To Improve The Paper (optional; not part of decision)</w:t>
+      </w:r>
+    </w:p>
+    <w:p>
+      <w:pPr>
+        <w:pStyle w:val="ListBullet"/>
+      </w:pPr>
+      <w:r>
+        <w:t xml:space="preserve">Add a short **“practitioner’s summary”** box: what should a SAC user change (if anything) about targets or \(\lambda\) given your theory?  </w:t>
+      </w:r>
+    </w:p>
+    <w:p>
+      <w:pPr>
+        <w:pStyle w:val="ListBullet"/>
+      </w:pPr>
+      <w:r>
+        <w:t xml:space="preserve">Discuss **target networks on Q** and whether slowing \(\hat Q\) mimics small-\(\lambda\) MD advantages (ties to Question 4).  </w:t>
+      </w:r>
+    </w:p>
+    <w:p>
+      <w:pPr>
+        <w:pStyle w:val="ListBullet"/>
+      </w:pPr>
+      <w:r>
+        <w:t xml:space="preserve">Report **numerical constants** (strong convexity \(\kappa\)) in Appendix K when the curvature condition holds vs fails—helps readers see when theory is vacuous.  </w:t>
+      </w:r>
+    </w:p>
+    <w:p>
+      <w:pPr>
+        <w:pStyle w:val="ListBullet"/>
+      </w:pPr>
+      <w:r>
+        <w:t>Fix any notation drift between \(\pi_n\) (MD chain) and actor \(\pi_{w_n}\) in Algorithm 1 captions for implementers.</w:t>
+      </w:r>
+    </w:p>
+    <w:p>
       <w:r>
         <w:t>————————————————————————</w:t>
       </w:r>
@@ -450,6 +644,125 @@
     <w:p>
       <w:r>
         <w:t>5. 能否在附录 K 加 **log–log** 图比较 empirical 斜率与 **\(N^{-1/5}\)**？</w:t>
+      </w:r>
+    </w:p>
+    <w:p>
+      <w:pPr>
+        <w:pStyle w:val="Heading2"/>
+      </w:pPr>
+      <w:r>
+        <w:t>Overall Recommendation *（总评 / Rating）</w:t>
+      </w:r>
+    </w:p>
+    <w:p>
+      <w:r>
+        <w:t>| 表单选择（0–10 偶数） | **5** |</w:t>
+      </w:r>
+    </w:p>
+    <w:p>
+      <w:r>
+        <w:t>|----------------------|-------|</w:t>
+      </w:r>
+    </w:p>
+    <w:p>
+      <w:r>
+        <w:t>| **含义** | 略低于接收线（Marginally below） |</w:t>
+      </w:r>
+    </w:p>
+    <w:p>
+      <w:r>
+        <w:t>| **一句话** | RL 理论受众有价值，但 oracle/曲率/仅附录实验使对 ICLR 广义项目影响有限。 |</w:t>
+      </w:r>
+    </w:p>
+    <w:p>
+      <w:r>
+        <w:t>**两条核心理由：**（1）**接收面：** squashed Gaussian + 部分 KL 的 population 分析，Gibbs vs MD tracking（推论 1、图 2）有明确增量。（2）**拒稿面：** 与深度 SAC（TD、采样、多步 actor）脱节；\(R_{\hat Q}/2&lt;\tau\) 不可检验；未验证 \(N^{-1/5}\) 率。</w:t>
+      </w:r>
+    </w:p>
+    <w:p>
+      <w:r>
+        <w:t>*若表单仅为 Accept/Reject：* 主会倾向 **边界/弱拒**；若 AC 偏理论可 **弱接收**。</w:t>
+      </w:r>
+    </w:p>
+    <w:p>
+      <w:pPr>
+        <w:pStyle w:val="Heading2"/>
+      </w:pPr>
+      <w:r>
+        <w:t>Confidence *（置信度）</w:t>
+      </w:r>
+    </w:p>
+    <w:p>
+      <w:r>
+        <w:t>| 分数 (1–5) | **3** |</w:t>
+      </w:r>
+    </w:p>
+    <w:p>
+      <w:r>
+        <w:t>|------------|-------|</w:t>
+      </w:r>
+    </w:p>
+    <w:p>
+      <w:r>
+        <w:t>| **理由** | 熟悉熵正则 RL/SAC/MD 主线；读过正文与定理，未逐行核对全部附录证明。 |</w:t>
+      </w:r>
+    </w:p>
+    <w:p>
+      <w:pPr>
+        <w:pStyle w:val="Heading2"/>
+      </w:pPr>
+      <w:r>
+        <w:t>Supporting Arguments For Recommendation *（支持总评的论述）</w:t>
+      </w:r>
+    </w:p>
+    <w:p>
+      <w:r>
+        <w:t>本文针对 SAC 实现（tanh 高斯、少量 reverse-KL 步、target 变化）与 policy-space 理论之间的空白，给出 population 层面的 tracking 与 best-iterate 率。Gibbs 目标中 **\(1/\tau\)** 不消失项对理解「actor 跟不上 softmax target」尤其有用；定理 3 的 \(\lambda\)–\(N\) 标度给出了可引用的 tuning 量级。</w:t>
+      </w:r>
+    </w:p>
+    <w:p>
+      <w:r>
+        <w:t>但对 ICLR 整体而言，结论 **条件性过强**：critic oracle 回避了 TD 学习难点，曲率假设缺乏深度网络下的检验路径，实验无法支撑主定理的率。若 rebuttal 能清晰界定相对「proximal target 慢动」的增量，并给出多步 actor 或线性 TD 的扩展 sketch，我会考虑提高到 **6**。</w:t>
+      </w:r>
+    </w:p>
+    <w:p>
+      <w:pPr>
+        <w:pStyle w:val="Heading2"/>
+      </w:pPr>
+      <w:r>
+        <w:t>Additional Feedback To Improve The Paper（可选；不计入打分）</w:t>
+      </w:r>
+    </w:p>
+    <w:p>
+      <w:pPr>
+        <w:pStyle w:val="ListBullet"/>
+      </w:pPr>
+      <w:r>
+        <w:t xml:space="preserve">增加 **实践者摘要**：SAC 用户是否应改 target 类型或 \(\lambda\)？  </w:t>
+      </w:r>
+    </w:p>
+    <w:p>
+      <w:pPr>
+        <w:pStyle w:val="ListBullet"/>
+      </w:pPr>
+      <w:r>
+        <w:t xml:space="preserve">讨论 **Q 的 target network** 与放慢 Gibbs 是否复现 MD 小 \(\lambda\) 优势。  </w:t>
+      </w:r>
+    </w:p>
+    <w:p>
+      <w:pPr>
+        <w:pStyle w:val="ListBullet"/>
+      </w:pPr>
+      <w:r>
+        <w:t xml:space="preserve">附录 K 报告满足/违反曲率时的 **\(\kappa\)** 数值，避免强凸常数退化却未说明。  </w:t>
+      </w:r>
+    </w:p>
+    <w:p>
+      <w:pPr>
+        <w:pStyle w:val="ListBullet"/>
+      </w:pPr>
+      <w:r>
+        <w:t>Algorithm 1 旁注区分 **\(\pi_n\)**（MD 链）与 **\(\pi_{w_n}\)**（actor）。</w:t>
       </w:r>
     </w:p>
     <w:p>
@@ -673,6 +986,125 @@
       </w:r>
     </w:p>
     <w:p>
+      <w:pPr>
+        <w:pStyle w:val="Heading2"/>
+      </w:pPr>
+      <w:r>
+        <w:t>Overall Recommendation *</w:t>
+      </w:r>
+    </w:p>
+    <w:p>
+      <w:r>
+        <w:t>| Select on form (0–10, even numbers) | **6** |</w:t>
+      </w:r>
+    </w:p>
+    <w:p>
+      <w:r>
+        <w:t>|-------------------------------------|-------|</w:t>
+      </w:r>
+    </w:p>
+    <w:p>
+      <w:r>
+        <w:t>| **Label** | Marginally above acceptance threshold |</w:t>
+      </w:r>
+    </w:p>
+    <w:p>
+      <w:r>
+        <w:t>| **One-line reason** | Elegant softmax-as-flow idea with useful \(\alpha\)/\(\lambda\) ablations, but headline “similar to actor-critic” is overstated and key tasks favor SAC/CrossQ. |</w:t>
+      </w:r>
+    </w:p>
+    <w:p>
+      <w:r>
+        <w:t>**Two key reasons:** (1) **Accept:** removes separate policy-improvement regression while keeping off-policy TD; QMANSF + Fig. 3–4 ablations show engineering care. (2) **Reject:** exploitation and exploration tasks expose limits; baseline tuning/fairness and missing wall-time weaken empirical claims.</w:t>
+      </w:r>
+    </w:p>
+    <w:p>
+      <w:r>
+        <w:t>*If your form uses Accept/Reject only:* **Borderline Accept**.</w:t>
+      </w:r>
+    </w:p>
+    <w:p>
+      <w:pPr>
+        <w:pStyle w:val="Heading2"/>
+      </w:pPr>
+      <w:r>
+        <w:t>Confidence *</w:t>
+      </w:r>
+    </w:p>
+    <w:p>
+      <w:r>
+        <w:t>| Score (1–5) | **3** |</w:t>
+      </w:r>
+    </w:p>
+    <w:p>
+      <w:r>
+        <w:t>|-------------|-------|</w:t>
+      </w:r>
+    </w:p>
+    <w:p>
+      <w:r>
+        <w:t>| **Justification** | Familiar with SAC/CrossQ, normalizing flows, and DMC benchmarking; I read the full paper but am not an expert on Trust-PCL / MEow internals. |</w:t>
+      </w:r>
+    </w:p>
+    <w:p>
+      <w:pPr>
+        <w:pStyle w:val="Heading2"/>
+      </w:pPr>
+      <w:r>
+        <w:t>Supporting Arguments For Recommendation *</w:t>
+      </w:r>
+    </w:p>
+    <w:p>
+      <w:r>
+        <w:t>QNF is a coherent answer to “how do we represent the softmax policy in continuous Q-learning without a separate actor head?” Semi-gradient TD plus OLS \(\alpha\) and greedification are plausible responses to known pain points (fixed temperature, premature sharpening). The paper is well written and appropriately discloses compute and stability issues.</w:t>
+      </w:r>
+    </w:p>
+    <w:p>
+      <w:r>
+        <w:t>The gap to a clear accept is empirical: several locomotion tasks still favor simpler Gaussian actor–critic methods, and hopper-stand suggests the training recipe does not yet replace CrossQ-style entropy adaptation in weak-signal regimes. Shared hyperparameters across eight environments and partially ad hoc MEow tuning make it hard to attribute gaps to modeling alone. I would move to **8** with matched wall-time, per-task tuned strong baselines, and a ablation isolating flow parameterization from OLS+greed.</w:t>
+      </w:r>
+    </w:p>
+    <w:p>
+      <w:pPr>
+        <w:pStyle w:val="Heading2"/>
+      </w:pPr>
+      <w:r>
+        <w:t>Additional Feedback To Improve The Paper (optional; not part of decision)</w:t>
+      </w:r>
+    </w:p>
+    <w:p>
+      <w:pPr>
+        <w:pStyle w:val="ListBullet"/>
+      </w:pPr>
+      <w:r>
+        <w:t xml:space="preserve">Tone down abstract/conclusion claims to “competitive on several DMC tasks” rather than parity with “widely used actor-critic.”  </w:t>
+      </w:r>
+    </w:p>
+    <w:p>
+      <w:pPr>
+        <w:pStyle w:val="ListBullet"/>
+      </w:pPr>
+      <w:r>
+        <w:t xml:space="preserve">Add a **compute table** (forward+backward ms/step, samples to threshold return).  </w:t>
+      </w:r>
+    </w:p>
+    <w:p>
+      <w:pPr>
+        <w:pStyle w:val="ListBullet"/>
+      </w:pPr>
+      <w:r>
+        <w:t xml:space="preserve">Include **deterministic-eval** SAC/CrossQ curves alongside stochastic flow eval.  </w:t>
+      </w:r>
+    </w:p>
+    <w:p>
+      <w:pPr>
+        <w:pStyle w:val="ListBullet"/>
+      </w:pPr>
+      <w:r>
+        <w:t>Clarify **reproducibility**: exact MEow and SAC configs in supplement tables.</w:t>
+      </w:r>
+    </w:p>
+    <w:p>
       <w:r>
         <w:t>————————————————————————</w:t>
       </w:r>
@@ -885,13 +1317,132 @@
       </w:r>
     </w:p>
     <w:p>
+      <w:pPr>
+        <w:pStyle w:val="Heading2"/>
+      </w:pPr>
+      <w:r>
+        <w:t>Overall Recommendation *（总评 / Rating）</w:t>
+      </w:r>
+    </w:p>
+    <w:p>
+      <w:r>
+        <w:t>| 表单选择（0–10 偶数） | **6** |</w:t>
+      </w:r>
+    </w:p>
+    <w:p>
+      <w:r>
+        <w:t>|----------------------|-------|</w:t>
+      </w:r>
+    </w:p>
+    <w:p>
+      <w:r>
+        <w:t>| **含义** | 略高于接收线（Marginally above） |</w:t>
+      </w:r>
+    </w:p>
+    <w:p>
+      <w:r>
+        <w:t>| **一句话** | softmax-as-flow 思路清晰、消融到位，但摘要「与 actor-critic 相当」偏强，关键任务 SAC/CrossQ 更优。 |</w:t>
+      </w:r>
+    </w:p>
+    <w:p>
+      <w:r>
+        <w:t>**两条理由：**（1）**接收：** 去掉独立 policy improvement，保留 off-policy TD；QMANSF 与图 3–4 体现工程完整性。（2）**拒稿：** 利用型/探索型任务暴露局限；基线公平性与 wall-time 不足。</w:t>
+      </w:r>
+    </w:p>
+    <w:p>
+      <w:r>
+        <w:t>*若表单仅为 Accept/Reject：* **边界接收**。</w:t>
+      </w:r>
+    </w:p>
+    <w:p>
+      <w:pPr>
+        <w:pStyle w:val="Heading2"/>
+      </w:pPr>
+      <w:r>
+        <w:t>Confidence *（置信度）</w:t>
+      </w:r>
+    </w:p>
+    <w:p>
+      <w:r>
+        <w:t>| 分数 (1–5) | **3** |</w:t>
+      </w:r>
+    </w:p>
+    <w:p>
+      <w:r>
+        <w:t>|------------|-------|</w:t>
+      </w:r>
+    </w:p>
+    <w:p>
+      <w:r>
+        <w:t>| **理由** | 熟悉 SAC/CrossQ、flow 与 DMC 评测；非 Trust-PCL/MEow 实现细节专家。 |</w:t>
+      </w:r>
+    </w:p>
+    <w:p>
+      <w:pPr>
+        <w:pStyle w:val="Heading2"/>
+      </w:pPr>
+      <w:r>
+        <w:t>Supporting Arguments For Recommendation *（支持总评的论述）</w:t>
+      </w:r>
+    </w:p>
+    <w:p>
+      <w:r>
+        <w:t>QNF 直接参数化熵正则策略密度，概念上统一了 Q-learning 与 maximum-entropy 控制中的 softmax。 \(\alpha\) 的 OLS 与 greedification 针对实际训练中的敏感点，图 4 提供了可读证据。局限部分对算力与稳定性诚实。</w:t>
+      </w:r>
+    </w:p>
+    <w:p>
+      <w:r>
+        <w:t>距明确接收差在实证：cheetah-run、walker-run 等仍落后强基线；hopper-stand 说明在弱奖励下不如 CrossQ 的熵适应。跨环境共用超参与 MEow 调参来源使对比难以定论。若补充同 wall-time、分环境调强的 SAC/CrossQ 与「无 greed / 无 OLS」消融，可考虑升至 **8**。</w:t>
+      </w:r>
+    </w:p>
+    <w:p>
+      <w:pPr>
+        <w:pStyle w:val="Heading2"/>
+      </w:pPr>
+      <w:r>
+        <w:t>Additional Feedback To Improve The Paper（可选；不计入打分）</w:t>
+      </w:r>
+    </w:p>
+    <w:p>
+      <w:pPr>
+        <w:pStyle w:val="ListBullet"/>
+      </w:pPr>
+      <w:r>
+        <w:t xml:space="preserve">摘要/结论改为「在若干 DMC 任务上具有竞争力」。  </w:t>
+      </w:r>
+    </w:p>
+    <w:p>
+      <w:pPr>
+        <w:pStyle w:val="ListBullet"/>
+      </w:pPr>
+      <w:r>
+        <w:t xml:space="preserve">增加 **算力/每步耗时** 表。  </w:t>
+      </w:r>
+    </w:p>
+    <w:p>
+      <w:pPr>
+        <w:pStyle w:val="ListBullet"/>
+      </w:pPr>
+      <w:r>
+        <w:t xml:space="preserve">补充高斯基线 **确定性 eval** 曲线。  </w:t>
+      </w:r>
+    </w:p>
+    <w:p>
+      <w:pPr>
+        <w:pStyle w:val="ListBullet"/>
+      </w:pPr>
+      <w:r>
+        <w:t>补充 MEow、SAC 的 **完整可复现配置表**。</w:t>
+      </w:r>
+    </w:p>
+    <w:p>
       <w:r>
         <w:t>————————————————————————</w:t>
       </w:r>
     </w:p>
     <w:p>
       <w:r>
-        <w:t>*End of review document. Select Presentation / Informativeness / Soundness scores (1–3) in OpenReview to match the tables above.*</w:t>
+        <w:t>*End of review document. Match all dropdown scores to the tables above before submitting.*</w:t>
       </w:r>
     </w:p>
     <w:sectPr>

</xml_diff>